<commit_message>
Panel: normas al 28/10/2026
</commit_message>
<xml_diff>
--- a/docs/resumenes/Normas_ElPeruano_ultimo.docx
+++ b/docs/resumenes/Normas_ElPeruano_ultimo.docx
@@ -31,7 +31,7 @@
           <w:color w:val="5B6880"/>
           <w:sz w:val="21"/>
         </w:rPr>
-        <w:t>Diario Oficial El Peruano · Martes 27 de octubre de 2026</w:t>
+        <w:t>Diario Oficial El Peruano · Miércoles 28 de octubre de 2026</w:t>
       </w:r>
     </w:p>
     <w:p>
@@ -105,7 +105,7 @@
                 <w:i w:val="0"/>
                 <w:sz w:val="19"/>
               </w:rPr>
-              <w:t>27/10/2026</w:t>
+              <w:t>28/10/2026</w:t>
             </w:r>
           </w:p>
         </w:tc>
@@ -145,7 +145,7 @@
                 <w:i w:val="0"/>
                 <w:sz w:val="19"/>
               </w:rPr>
-              <w:t>27/10/2026 11:13</w:t>
+              <w:t>28/10/2026 11:32</w:t>
             </w:r>
           </w:p>
         </w:tc>
@@ -187,7 +187,7 @@
                 <w:i w:val="0"/>
                 <w:sz w:val="19"/>
               </w:rPr>
-              <w:t>31</w:t>
+              <w:t>43</w:t>
             </w:r>
           </w:p>
         </w:tc>
@@ -228,7 +228,7 @@
                 <w:color w:val="0A2F5C"/>
                 <w:sz w:val="19"/>
               </w:rPr>
-              <w:t>1</w:t>
+              <w:t>2</w:t>
             </w:r>
           </w:p>
         </w:tc>
@@ -265,94 +265,8 @@
           <w:i w:val="0"/>
           <w:sz w:val="20"/>
         </w:rPr>
-        <w:t>De las 31 normas publicadas en el periodo, 1 resulta de interés institucional: 1 sobre la ATU y el transporte urbano. El Cuadro 1 presenta la relación completa y la sección 2, el detalle de cada norma.</w:t>
+        <w:t>De las 43 normas publicadas en el periodo, 2 resultan de interés institucional: 2 de normatividad presupuestal. No se identificaron normas que involucren a la ATU. El Cuadro 1 presenta la relación completa y la sección 2, el detalle de cada norma.</w:t>
       </w:r>
-    </w:p>
-    <w:tbl>
-      <w:tblPr>
-        <w:tblW w:type="auto" w:w="0"/>
-        <w:tblLook w:firstColumn="1" w:firstRow="1" w:lastColumn="0" w:lastRow="0" w:noHBand="0" w:noVBand="1" w:val="04A0"/>
-        <w:tblBorders>
-          <w:top w:val="single" w:sz="4" w:space="0" w:color="F4C7C3"/>
-          <w:left w:val="single" w:sz="4" w:space="0" w:color="F4C7C3"/>
-          <w:bottom w:val="single" w:sz="4" w:space="0" w:color="F4C7C3"/>
-          <w:right w:val="single" w:sz="4" w:space="0" w:color="F4C7C3"/>
-        </w:tblBorders>
-        <w:tblLayout w:type="fixed"/>
-        <w:tblCellMar>
-          <w:top w:w="50" w:type="dxa"/>
-          <w:bottom w:w="50" w:type="dxa"/>
-          <w:left w:w="100" w:type="dxa"/>
-          <w:right w:w="100" w:type="dxa"/>
-        </w:tblCellMar>
-      </w:tblPr>
-      <w:tblGrid>
-        <w:gridCol w:w="9412"/>
-      </w:tblGrid>
-      <w:tr>
-        <w:tc>
-          <w:tcPr>
-            <w:tcW w:type="dxa" w:w="9411"/>
-            <w:shd w:val="clear" w:color="auto" w:fill="FDF3F2"/>
-            <w:tcBorders>
-              <w:left w:val="single" w:sz="24" w:space="0" w:color="B42318"/>
-            </w:tcBorders>
-          </w:tcPr>
-          <w:p>
-            <w:pPr>
-              <w:spacing w:before="20" w:after="20" w:line="264" w:lineRule="auto"/>
-            </w:pPr>
-            <w:r>
-              <w:rPr>
-                <w:rFonts w:ascii="Arial" w:hAnsi="Arial" w:eastAsia="Arial"/>
-                <w:b/>
-                <w:i w:val="0"/>
-                <w:color w:val="B42318"/>
-                <w:sz w:val="18"/>
-              </w:rPr>
-              <w:t>ATENCIÓN: 1 norma involucra directamente a la ATU</w:t>
-            </w:r>
-          </w:p>
-          <w:p>
-            <w:pPr>
-              <w:spacing w:before="0" w:after="20" w:line="264" w:lineRule="auto"/>
-            </w:pPr>
-            <w:r>
-              <w:rPr>
-                <w:rFonts w:ascii="Arial" w:hAnsi="Arial" w:eastAsia="Arial"/>
-                <w:b w:val="0"/>
-                <w:i w:val="0"/>
-                <w:color w:val="B42318"/>
-                <w:sz w:val="18"/>
-              </w:rPr>
-              <w:t xml:space="preserve">▪ </w:t>
-            </w:r>
-            <w:r>
-              <w:rPr>
-                <w:rFonts w:ascii="Arial" w:hAnsi="Arial" w:eastAsia="Arial"/>
-                <w:b/>
-                <w:i w:val="0"/>
-                <w:sz w:val="18"/>
-              </w:rPr>
-              <w:t>RESOLUCIÓN  N° 249-2026-ATU/PE</w:t>
-            </w:r>
-            <w:r>
-              <w:rPr>
-                <w:rFonts w:ascii="Arial" w:hAnsi="Arial" w:eastAsia="Arial"/>
-                <w:b w:val="0"/>
-                <w:i w:val="0"/>
-                <w:sz w:val="18"/>
-              </w:rPr>
-              <w:t xml:space="preserve"> (Autoridad de Transporte Urbano para Lima y Callao): Autorizan transferencia financiera a favor de las municipalidades distritales de la provincia de Lima con las que se celebraron convenios para la fiscalización del servicio público de transporte terrestre de personas</w:t>
-            </w:r>
-          </w:p>
-        </w:tc>
-      </w:tr>
-    </w:tbl>
-    <w:p>
-      <w:pPr>
-        <w:spacing w:before="0" w:after="80" w:line="276" w:lineRule="auto"/>
-      </w:pPr>
     </w:p>
     <w:p>
       <w:pPr>
@@ -500,7 +414,7 @@
             <w:gridSpan w:val="4"/>
             <w:shd w:val="clear" w:color="auto" w:fill="F2F5FA"/>
             <w:tcBorders>
-              <w:left w:val="single" w:sz="30" w:space="0" w:color="2A78D6"/>
+              <w:left w:val="single" w:sz="30" w:space="0" w:color="EB6834"/>
             </w:tcBorders>
           </w:tcPr>
           <w:p>
@@ -515,7 +429,7 @@
                 <w:color w:val="0A2F5C"/>
                 <w:sz w:val="17"/>
               </w:rPr>
-              <w:t>ATU Y TRANSPORTE URBANO  (1)</w:t>
+              <w:t>NORMATIVIDAD PRESUPUESTAL  (2)</w:t>
             </w:r>
           </w:p>
         </w:tc>
@@ -562,7 +476,7 @@
                   <w:sz w:val="17"/>
                   <w:u w:val="single"/>
                 </w:rPr>
-                <w:t xml:space="preserve">RESOLUCIÓN  N° 249-2026-ATU/PE</w:t>
+                <w:t xml:space="preserve">RESOLUCIÓN MINISTERIAL N° 394-2026-MINCETUR</w:t>
               </w:r>
             </w:hyperlink>
           </w:p>
@@ -578,7 +492,7 @@
                 <w:color w:val="5B6880"/>
                 <w:sz w:val="15"/>
               </w:rPr>
-              <w:t>AUTORIDAD DE TRANSPORTE URBANO PARA LIMA Y CALLAO</w:t>
+              <w:t>COMERCIO EXTERIOR Y TURISMO</w:t>
             </w:r>
           </w:p>
         </w:tc>
@@ -597,7 +511,7 @@
                 <w:i w:val="0"/>
                 <w:sz w:val="17"/>
               </w:rPr>
-              <w:t>Autorizan transferencia financiera a favor de las municipalidades distritales de la provincia de Lima con las que se celebraron convenios para la fiscalización del servicio público de transporte terrestre de personas</w:t>
+              <w:t>Aprueban transferencia financiera a favor de la Autoridad Nacional de Infraestructura para financiar proyecto de inversión en el mejoramiento de los servicios turísticos públicos en recursos turísticos del Parque Arqueológico Choquequirao del departamento de Cusco</w:t>
             </w:r>
           </w:p>
         </w:tc>
@@ -618,6 +532,124 @@
                 <w:sz w:val="17"/>
               </w:rPr>
               <w:t>27/10/2026</w:t>
+            </w:r>
+          </w:p>
+          <w:p>
+            <w:pPr>
+              <w:spacing w:before="0" w:after="0" w:line="240" w:lineRule="auto"/>
+              <w:jc w:val="center"/>
+            </w:pPr>
+            <w:r>
+              <w:rPr>
+                <w:rFonts w:ascii="Arial" w:hAnsi="Arial" w:eastAsia="Arial"/>
+                <w:b w:val="0"/>
+                <w:i w:val="0"/>
+                <w:color w:val="B42318"/>
+                <w:sz w:val="14"/>
+              </w:rPr>
+              <w:t>Edición extraordinaria</w:t>
+            </w:r>
+          </w:p>
+        </w:tc>
+      </w:tr>
+      <w:tr>
+        <w:trPr>
+          <w:cantSplit/>
+        </w:trPr>
+        <w:tc>
+          <w:tcPr>
+            <w:tcW w:type="dxa" w:w="567"/>
+          </w:tcPr>
+          <w:p>
+            <w:pPr>
+              <w:spacing w:before="20" w:after="20" w:line="264" w:lineRule="auto"/>
+              <w:jc w:val="center"/>
+            </w:pPr>
+            <w:r>
+              <w:rPr>
+                <w:rFonts w:ascii="Arial" w:hAnsi="Arial" w:eastAsia="Arial"/>
+                <w:b/>
+                <w:i w:val="0"/>
+                <w:color w:val="0A2F5C"/>
+                <w:sz w:val="18"/>
+              </w:rPr>
+              <w:t>2</w:t>
+            </w:r>
+          </w:p>
+        </w:tc>
+        <w:tc>
+          <w:tcPr>
+            <w:tcW w:type="dxa" w:w="2835"/>
+          </w:tcPr>
+          <w:p>
+            <w:pPr>
+              <w:spacing w:before="20" w:after="20" w:line="264" w:lineRule="auto"/>
+            </w:pPr>
+            <w:hyperlink r:id="rId12">
+              <w:r>
+                <w:rPr>
+                  <w:rFonts w:ascii="Arial" w:hAnsi="Arial" w:eastAsia="Arial" w:cs="Arial"/>
+                  <w:b/>
+                  <w:color w:val="0B5CAD"/>
+                  <w:sz w:val="17"/>
+                  <w:u w:val="single"/>
+                </w:rPr>
+                <w:t xml:space="preserve">RESOLUCIÓN MINISTERIAL  N° 401-2026-JUS</w:t>
+              </w:r>
+            </w:hyperlink>
+          </w:p>
+          <w:p>
+            <w:pPr>
+              <w:spacing w:before="0" w:after="20" w:line="252" w:lineRule="auto"/>
+            </w:pPr>
+            <w:r>
+              <w:rPr>
+                <w:rFonts w:ascii="Arial" w:hAnsi="Arial" w:eastAsia="Arial"/>
+                <w:b w:val="0"/>
+                <w:i w:val="0"/>
+                <w:color w:val="5B6880"/>
+                <w:sz w:val="15"/>
+              </w:rPr>
+              <w:t>JUSTICIA Y DERECHOS HUMANOS</w:t>
+            </w:r>
+          </w:p>
+        </w:tc>
+        <w:tc>
+          <w:tcPr>
+            <w:tcW w:type="dxa" w:w="4762"/>
+          </w:tcPr>
+          <w:p>
+            <w:pPr>
+              <w:spacing w:before="20" w:after="20" w:line="264" w:lineRule="auto"/>
+            </w:pPr>
+            <w:r>
+              <w:rPr>
+                <w:rFonts w:ascii="Arial" w:hAnsi="Arial" w:eastAsia="Arial"/>
+                <w:b w:val="0"/>
+                <w:i w:val="0"/>
+                <w:sz w:val="17"/>
+              </w:rPr>
+              <w:t>Autorizan Transferencia Financiera a favor de la Contraloría General de la República</w:t>
+            </w:r>
+          </w:p>
+        </w:tc>
+        <w:tc>
+          <w:tcPr>
+            <w:tcW w:type="dxa" w:w="1247"/>
+          </w:tcPr>
+          <w:p>
+            <w:pPr>
+              <w:spacing w:before="20" w:after="20" w:line="264" w:lineRule="auto"/>
+              <w:jc w:val="center"/>
+            </w:pPr>
+            <w:r>
+              <w:rPr>
+                <w:rFonts w:ascii="Arial" w:hAnsi="Arial" w:eastAsia="Arial"/>
+                <w:b w:val="0"/>
+                <w:i w:val="0"/>
+                <w:sz w:val="17"/>
+              </w:rPr>
+              <w:t>28/10/2026</w:t>
             </w:r>
           </w:p>
         </w:tc>
@@ -655,7 +687,7 @@
           <w:color w:val="0B5CAD"/>
           <w:sz w:val="21"/>
         </w:rPr>
-        <w:t>2.1  ATU y transporte urbano</w:t>
+        <w:t>2.1  Normatividad presupuestal</w:t>
       </w:r>
     </w:p>
     <w:tbl>
@@ -692,7 +724,7 @@
             <w:gridSpan w:val="2"/>
             <w:shd w:val="clear" w:color="auto" w:fill="E8F0FA"/>
             <w:tcBorders>
-              <w:left w:val="single" w:sz="30" w:space="0" w:color="2A78D6"/>
+              <w:left w:val="single" w:sz="30" w:space="0" w:color="EB6834"/>
             </w:tcBorders>
           </w:tcPr>
           <w:p>
@@ -707,7 +739,7 @@
                 <w:color w:val="0A2F5C"/>
                 <w:sz w:val="19"/>
               </w:rPr>
-              <w:t>1.  RESOLUCIÓN  N° 249-2026-ATU/PE</w:t>
+              <w:t>1.  RESOLUCIÓN MINISTERIAL N° 394-2026-MINCETUR</w:t>
             </w:r>
           </w:p>
         </w:tc>
@@ -752,7 +784,7 @@
                 <w:i w:val="0"/>
                 <w:sz w:val="18"/>
               </w:rPr>
-              <w:t>AUTORIDAD DE TRANSPORTE URBANO PARA LIMA Y CALLAO</w:t>
+              <w:t>COMERCIO EXTERIOR Y TURISMO</w:t>
             </w:r>
           </w:p>
         </w:tc>
@@ -797,7 +829,7 @@
                 <w:i w:val="0"/>
                 <w:sz w:val="18"/>
               </w:rPr>
-              <w:t>27/10/2026 · Edición ordinaria</w:t>
+              <w:t>27/10/2026 · Edición extraordinaria</w:t>
             </w:r>
           </w:p>
         </w:tc>
@@ -842,7 +874,7 @@
                 <w:i w:val="0"/>
                 <w:sz w:val="18"/>
               </w:rPr>
-              <w:t>ATU y transporte urbano · Normatividad presupuestal</w:t>
+              <w:t>Normatividad presupuestal · Inversiones</w:t>
             </w:r>
           </w:p>
         </w:tc>
@@ -887,7 +919,97 @@
                 <w:i w:val="0"/>
                 <w:sz w:val="18"/>
               </w:rPr>
-              <w:t>Autorizan transferencia financiera a favor de las municipalidades distritales de la provincia de Lima con las que se celebraron convenios para la fiscalización del servicio público de transporte terrestre de personas</w:t>
+              <w:t>Aprueban transferencia financiera a favor de la Autoridad Nacional de Infraestructura para financiar proyecto de inversión en el mejoramiento de los servicios turísticos públicos en recursos turísticos del Parque Arqueológico Choquequirao del departamento de Cusco</w:t>
+            </w:r>
+          </w:p>
+        </w:tc>
+      </w:tr>
+      <w:tr>
+        <w:trPr>
+          <w:cantSplit/>
+        </w:trPr>
+        <w:tc>
+          <w:tcPr>
+            <w:tcW w:type="dxa" w:w="2041"/>
+            <w:shd w:val="clear" w:color="auto" w:fill="F2F5FA"/>
+          </w:tcPr>
+          <w:p>
+            <w:pPr>
+              <w:spacing w:before="20" w:after="20" w:line="264" w:lineRule="auto"/>
+            </w:pPr>
+            <w:r>
+              <w:rPr>
+                <w:rFonts w:ascii="Arial" w:hAnsi="Arial" w:eastAsia="Arial"/>
+                <w:b/>
+                <w:i w:val="0"/>
+                <w:color w:val="0A2F5C"/>
+                <w:sz w:val="17"/>
+              </w:rPr>
+              <w:t>Disposición principal</w:t>
+            </w:r>
+          </w:p>
+        </w:tc>
+        <w:tc>
+          <w:tcPr>
+            <w:tcW w:type="dxa" w:w="7370"/>
+          </w:tcPr>
+          <w:p>
+            <w:pPr>
+              <w:spacing w:before="20" w:after="20" w:line="264" w:lineRule="auto"/>
+            </w:pPr>
+            <w:r>
+              <w:rPr>
+                <w:rFonts w:ascii="Arial" w:hAnsi="Arial" w:eastAsia="Arial"/>
+                <w:b w:val="0"/>
+                <w:i w:val="0"/>
+                <w:sz w:val="18"/>
+              </w:rPr>
+              <w:t>Artículo 1.- Transferencia financiera a favor de la Unidad Ejecutora 001-1750: AUTORIDAD NACIONAL DE INFRAESTRUCTURA - ANIN del Pliego 029: AUTORIDAD NACIONAL DE INFRAESTRUCTURA Aprobar una transferencia financiera del Pliego 035: Ministerio de Comercio Exterior y Turismo, hasta por la suma de S/ 9 500 000,00 (NUEVE MILLONES QUINIENTOS MIL CON 00/100 SOLES); en la Fuente de Financiamiento 1. Recursos Ordinarios, a favor de la Unidad Ejecutora: 001-1750: AUTORIDAD NACIONAL DE INFRAESTRUCTURA - ANIN del Pliego 029: AUTORIDAD NACIONAL DE INFRAESTRUCTURA, para el financiamiento de la ACTIVIDAD 5001253 “MEJORAMIENTO DE LOS SERVICIOS TURÍSTICOS PÚBLICOS EN RECURSOS TURÍSTICOS DEL PARQUE…</w:t>
+            </w:r>
+          </w:p>
+        </w:tc>
+      </w:tr>
+      <w:tr>
+        <w:trPr>
+          <w:cantSplit/>
+        </w:trPr>
+        <w:tc>
+          <w:tcPr>
+            <w:tcW w:type="dxa" w:w="2041"/>
+            <w:shd w:val="clear" w:color="auto" w:fill="F2F5FA"/>
+          </w:tcPr>
+          <w:p>
+            <w:pPr>
+              <w:spacing w:before="20" w:after="20" w:line="264" w:lineRule="auto"/>
+            </w:pPr>
+            <w:r>
+              <w:rPr>
+                <w:rFonts w:ascii="Arial" w:hAnsi="Arial" w:eastAsia="Arial"/>
+                <w:b/>
+                <w:i w:val="0"/>
+                <w:color w:val="0A2F5C"/>
+                <w:sz w:val="17"/>
+              </w:rPr>
+              <w:t>Montos citados</w:t>
+            </w:r>
+          </w:p>
+        </w:tc>
+        <w:tc>
+          <w:tcPr>
+            <w:tcW w:type="dxa" w:w="7370"/>
+          </w:tcPr>
+          <w:p>
+            <w:pPr>
+              <w:spacing w:before="20" w:after="20" w:line="264" w:lineRule="auto"/>
+            </w:pPr>
+            <w:r>
+              <w:rPr>
+                <w:rFonts w:ascii="Arial" w:hAnsi="Arial" w:eastAsia="Arial"/>
+                <w:b w:val="0"/>
+                <w:i w:val="0"/>
+                <w:sz w:val="18"/>
+              </w:rPr>
+              <w:t>S/ 44 375 850,00 · S/ 9 500 000,00</w:t>
             </w:r>
           </w:p>
         </w:tc>
@@ -946,7 +1068,7 @@
               </w:rPr>
               <w:t xml:space="preserve">   ·   </w:t>
             </w:r>
-            <w:hyperlink r:id="rId12">
+            <w:hyperlink r:id="rId13">
               <w:r>
                 <w:rPr>
                   <w:rFonts w:ascii="Arial" w:hAnsi="Arial" w:eastAsia="Arial" w:cs="Arial"/>
@@ -967,7 +1089,426 @@
               </w:rPr>
               <w:t xml:space="preserve">   ·   </w:t>
             </w:r>
-            <w:hyperlink r:id="rId13">
+            <w:hyperlink r:id="rId14">
+              <w:r>
+                <w:rPr>
+                  <w:rFonts w:ascii="Arial" w:hAnsi="Arial" w:eastAsia="Arial" w:cs="Arial"/>
+                  <w:color w:val="0B5CAD"/>
+                  <w:sz w:val="17"/>
+                  <w:u w:val="single"/>
+                </w:rPr>
+                <w:t xml:space="preserve">PDF</w:t>
+              </w:r>
+            </w:hyperlink>
+          </w:p>
+        </w:tc>
+      </w:tr>
+    </w:tbl>
+    <w:p>
+      <w:pPr>
+        <w:spacing w:before="0" w:after="120" w:line="276" w:lineRule="auto"/>
+      </w:pPr>
+    </w:p>
+    <w:tbl>
+      <w:tblPr>
+        <w:tblW w:type="auto" w:w="0"/>
+        <w:tblLook w:firstColumn="1" w:firstRow="1" w:lastColumn="0" w:lastRow="0" w:noHBand="0" w:noVBand="1" w:val="04A0"/>
+        <w:tblBorders>
+          <w:top w:val="single" w:sz="4" w:space="0" w:color="C9D2DF"/>
+          <w:left w:val="single" w:sz="4" w:space="0" w:color="C9D2DF"/>
+          <w:bottom w:val="single" w:sz="4" w:space="0" w:color="C9D2DF"/>
+          <w:right w:val="single" w:sz="4" w:space="0" w:color="C9D2DF"/>
+          <w:insideH w:val="single" w:sz="4" w:space="0" w:color="C9D2DF"/>
+          <w:insideV w:val="single" w:sz="4" w:space="0" w:color="C9D2DF"/>
+        </w:tblBorders>
+        <w:tblLayout w:type="fixed"/>
+        <w:tblCellMar>
+          <w:top w:w="50" w:type="dxa"/>
+          <w:bottom w:w="50" w:type="dxa"/>
+          <w:left w:w="100" w:type="dxa"/>
+          <w:right w:w="100" w:type="dxa"/>
+        </w:tblCellMar>
+      </w:tblPr>
+      <w:tblGrid>
+        <w:gridCol w:w="4706"/>
+        <w:gridCol w:w="4706"/>
+      </w:tblGrid>
+      <w:tr>
+        <w:trPr>
+          <w:cantSplit/>
+        </w:trPr>
+        <w:tc>
+          <w:tcPr>
+            <w:tcW w:type="dxa" w:w="7370"/>
+            <w:gridSpan w:val="2"/>
+            <w:shd w:val="clear" w:color="auto" w:fill="E8F0FA"/>
+            <w:tcBorders>
+              <w:left w:val="single" w:sz="30" w:space="0" w:color="EB6834"/>
+            </w:tcBorders>
+          </w:tcPr>
+          <w:p>
+            <w:pPr>
+              <w:spacing w:before="20" w:after="20" w:line="264" w:lineRule="auto"/>
+            </w:pPr>
+            <w:r>
+              <w:rPr>
+                <w:rFonts w:ascii="Arial" w:hAnsi="Arial" w:eastAsia="Arial"/>
+                <w:b/>
+                <w:i w:val="0"/>
+                <w:color w:val="0A2F5C"/>
+                <w:sz w:val="19"/>
+              </w:rPr>
+              <w:t>2.  RESOLUCIÓN MINISTERIAL  N° 401-2026-JUS</w:t>
+            </w:r>
+          </w:p>
+        </w:tc>
+      </w:tr>
+      <w:tr>
+        <w:trPr>
+          <w:cantSplit/>
+        </w:trPr>
+        <w:tc>
+          <w:tcPr>
+            <w:tcW w:type="dxa" w:w="2041"/>
+            <w:shd w:val="clear" w:color="auto" w:fill="F2F5FA"/>
+          </w:tcPr>
+          <w:p>
+            <w:pPr>
+              <w:spacing w:before="20" w:after="20" w:line="264" w:lineRule="auto"/>
+            </w:pPr>
+            <w:r>
+              <w:rPr>
+                <w:rFonts w:ascii="Arial" w:hAnsi="Arial" w:eastAsia="Arial"/>
+                <w:b/>
+                <w:i w:val="0"/>
+                <w:color w:val="0A2F5C"/>
+                <w:sz w:val="17"/>
+              </w:rPr>
+              <w:t>Entidad emisora</w:t>
+            </w:r>
+          </w:p>
+        </w:tc>
+        <w:tc>
+          <w:tcPr>
+            <w:tcW w:type="dxa" w:w="7370"/>
+          </w:tcPr>
+          <w:p>
+            <w:pPr>
+              <w:spacing w:before="20" w:after="20" w:line="264" w:lineRule="auto"/>
+            </w:pPr>
+            <w:r>
+              <w:rPr>
+                <w:rFonts w:ascii="Arial" w:hAnsi="Arial" w:eastAsia="Arial"/>
+                <w:b w:val="0"/>
+                <w:i w:val="0"/>
+                <w:sz w:val="18"/>
+              </w:rPr>
+              <w:t>JUSTICIA Y DERECHOS HUMANOS</w:t>
+            </w:r>
+          </w:p>
+        </w:tc>
+      </w:tr>
+      <w:tr>
+        <w:trPr>
+          <w:cantSplit/>
+        </w:trPr>
+        <w:tc>
+          <w:tcPr>
+            <w:tcW w:type="dxa" w:w="2041"/>
+            <w:shd w:val="clear" w:color="auto" w:fill="F2F5FA"/>
+          </w:tcPr>
+          <w:p>
+            <w:pPr>
+              <w:spacing w:before="20" w:after="20" w:line="264" w:lineRule="auto"/>
+            </w:pPr>
+            <w:r>
+              <w:rPr>
+                <w:rFonts w:ascii="Arial" w:hAnsi="Arial" w:eastAsia="Arial"/>
+                <w:b/>
+                <w:i w:val="0"/>
+                <w:color w:val="0A2F5C"/>
+                <w:sz w:val="17"/>
+              </w:rPr>
+              <w:t>Publicación</w:t>
+            </w:r>
+          </w:p>
+        </w:tc>
+        <w:tc>
+          <w:tcPr>
+            <w:tcW w:type="dxa" w:w="7370"/>
+          </w:tcPr>
+          <w:p>
+            <w:pPr>
+              <w:spacing w:before="20" w:after="20" w:line="264" w:lineRule="auto"/>
+            </w:pPr>
+            <w:r>
+              <w:rPr>
+                <w:rFonts w:ascii="Arial" w:hAnsi="Arial" w:eastAsia="Arial"/>
+                <w:b w:val="0"/>
+                <w:i w:val="0"/>
+                <w:sz w:val="18"/>
+              </w:rPr>
+              <w:t>28/10/2026 · Edición ordinaria</w:t>
+            </w:r>
+          </w:p>
+        </w:tc>
+      </w:tr>
+      <w:tr>
+        <w:trPr>
+          <w:cantSplit/>
+        </w:trPr>
+        <w:tc>
+          <w:tcPr>
+            <w:tcW w:type="dxa" w:w="2041"/>
+            <w:shd w:val="clear" w:color="auto" w:fill="F2F5FA"/>
+          </w:tcPr>
+          <w:p>
+            <w:pPr>
+              <w:spacing w:before="20" w:after="20" w:line="264" w:lineRule="auto"/>
+            </w:pPr>
+            <w:r>
+              <w:rPr>
+                <w:rFonts w:ascii="Arial" w:hAnsi="Arial" w:eastAsia="Arial"/>
+                <w:b/>
+                <w:i w:val="0"/>
+                <w:color w:val="0A2F5C"/>
+                <w:sz w:val="17"/>
+              </w:rPr>
+              <w:t>Temas</w:t>
+            </w:r>
+          </w:p>
+        </w:tc>
+        <w:tc>
+          <w:tcPr>
+            <w:tcW w:type="dxa" w:w="7370"/>
+          </w:tcPr>
+          <w:p>
+            <w:pPr>
+              <w:spacing w:before="20" w:after="20" w:line="264" w:lineRule="auto"/>
+            </w:pPr>
+            <w:r>
+              <w:rPr>
+                <w:rFonts w:ascii="Arial" w:hAnsi="Arial" w:eastAsia="Arial"/>
+                <w:b w:val="0"/>
+                <w:i w:val="0"/>
+                <w:sz w:val="18"/>
+              </w:rPr>
+              <w:t>Normatividad presupuestal</w:t>
+            </w:r>
+          </w:p>
+        </w:tc>
+      </w:tr>
+      <w:tr>
+        <w:trPr>
+          <w:cantSplit/>
+        </w:trPr>
+        <w:tc>
+          <w:tcPr>
+            <w:tcW w:type="dxa" w:w="2041"/>
+            <w:shd w:val="clear" w:color="auto" w:fill="F2F5FA"/>
+          </w:tcPr>
+          <w:p>
+            <w:pPr>
+              <w:spacing w:before="20" w:after="20" w:line="264" w:lineRule="auto"/>
+            </w:pPr>
+            <w:r>
+              <w:rPr>
+                <w:rFonts w:ascii="Arial" w:hAnsi="Arial" w:eastAsia="Arial"/>
+                <w:b/>
+                <w:i w:val="0"/>
+                <w:color w:val="0A2F5C"/>
+                <w:sz w:val="17"/>
+              </w:rPr>
+              <w:t>Sumilla</w:t>
+            </w:r>
+          </w:p>
+        </w:tc>
+        <w:tc>
+          <w:tcPr>
+            <w:tcW w:type="dxa" w:w="7370"/>
+          </w:tcPr>
+          <w:p>
+            <w:pPr>
+              <w:spacing w:before="20" w:after="20" w:line="264" w:lineRule="auto"/>
+            </w:pPr>
+            <w:r>
+              <w:rPr>
+                <w:rFonts w:ascii="Arial" w:hAnsi="Arial" w:eastAsia="Arial"/>
+                <w:b w:val="0"/>
+                <w:i w:val="0"/>
+                <w:sz w:val="18"/>
+              </w:rPr>
+              <w:t>Autorizan Transferencia Financiera a favor de la Contraloría General de la República</w:t>
+            </w:r>
+          </w:p>
+        </w:tc>
+      </w:tr>
+      <w:tr>
+        <w:trPr>
+          <w:cantSplit/>
+        </w:trPr>
+        <w:tc>
+          <w:tcPr>
+            <w:tcW w:type="dxa" w:w="2041"/>
+            <w:shd w:val="clear" w:color="auto" w:fill="F2F5FA"/>
+          </w:tcPr>
+          <w:p>
+            <w:pPr>
+              <w:spacing w:before="20" w:after="20" w:line="264" w:lineRule="auto"/>
+            </w:pPr>
+            <w:r>
+              <w:rPr>
+                <w:rFonts w:ascii="Arial" w:hAnsi="Arial" w:eastAsia="Arial"/>
+                <w:b/>
+                <w:i w:val="0"/>
+                <w:color w:val="0A2F5C"/>
+                <w:sz w:val="17"/>
+              </w:rPr>
+              <w:t>Disposición principal</w:t>
+            </w:r>
+          </w:p>
+        </w:tc>
+        <w:tc>
+          <w:tcPr>
+            <w:tcW w:type="dxa" w:w="7370"/>
+          </w:tcPr>
+          <w:p>
+            <w:pPr>
+              <w:spacing w:before="20" w:after="20" w:line="264" w:lineRule="auto"/>
+            </w:pPr>
+            <w:r>
+              <w:rPr>
+                <w:rFonts w:ascii="Arial" w:hAnsi="Arial" w:eastAsia="Arial"/>
+                <w:b w:val="0"/>
+                <w:i w:val="0"/>
+                <w:sz w:val="18"/>
+              </w:rPr>
+              <w:t>Artículo 1.- Transferencia Financiera a favor de la Contraloría General de la República: Autorizar la Transferencia Financiera del Pliego 006: Ministerio de Justicia y Derechos Humanos hasta por la suma de S/ 50 750,00 (Cincuenta Mil Setecientos Cincuenta y 00/100 Soles) a favor del Pliego 019: Contraloría General, Unidad Ejecutora 001-196: Contraloría General, correspondiente a la totalidad de la retribución económica para los periodos 2024 y 2025, destinada a la contratación y pago a la sociedad de auditoría que, previo concurso público de méritos, sea designada para realizar la Auditoría Financiera Gubernamental correspondiente a dichos periodos. Artículo 2.- Financiamiento: La…</w:t>
+            </w:r>
+          </w:p>
+        </w:tc>
+      </w:tr>
+      <w:tr>
+        <w:trPr>
+          <w:cantSplit/>
+        </w:trPr>
+        <w:tc>
+          <w:tcPr>
+            <w:tcW w:type="dxa" w:w="2041"/>
+            <w:shd w:val="clear" w:color="auto" w:fill="F2F5FA"/>
+          </w:tcPr>
+          <w:p>
+            <w:pPr>
+              <w:spacing w:before="20" w:after="20" w:line="264" w:lineRule="auto"/>
+            </w:pPr>
+            <w:r>
+              <w:rPr>
+                <w:rFonts w:ascii="Arial" w:hAnsi="Arial" w:eastAsia="Arial"/>
+                <w:b/>
+                <w:i w:val="0"/>
+                <w:color w:val="0A2F5C"/>
+                <w:sz w:val="17"/>
+              </w:rPr>
+              <w:t>Montos citados</w:t>
+            </w:r>
+          </w:p>
+        </w:tc>
+        <w:tc>
+          <w:tcPr>
+            <w:tcW w:type="dxa" w:w="7370"/>
+          </w:tcPr>
+          <w:p>
+            <w:pPr>
+              <w:spacing w:before="20" w:after="20" w:line="264" w:lineRule="auto"/>
+            </w:pPr>
+            <w:r>
+              <w:rPr>
+                <w:rFonts w:ascii="Arial" w:hAnsi="Arial" w:eastAsia="Arial"/>
+                <w:b w:val="0"/>
+                <w:i w:val="0"/>
+                <w:sz w:val="18"/>
+              </w:rPr>
+              <w:t>S/ 713 326 414,00 · S/ 53 330,00 · S/ 50 750,00 · S/ 2 580,00</w:t>
+            </w:r>
+          </w:p>
+        </w:tc>
+      </w:tr>
+      <w:tr>
+        <w:trPr>
+          <w:cantSplit/>
+        </w:trPr>
+        <w:tc>
+          <w:tcPr>
+            <w:tcW w:type="dxa" w:w="2041"/>
+            <w:shd w:val="clear" w:color="auto" w:fill="F2F5FA"/>
+          </w:tcPr>
+          <w:p>
+            <w:pPr>
+              <w:spacing w:before="20" w:after="20" w:line="264" w:lineRule="auto"/>
+            </w:pPr>
+            <w:r>
+              <w:rPr>
+                <w:rFonts w:ascii="Arial" w:hAnsi="Arial" w:eastAsia="Arial"/>
+                <w:b/>
+                <w:i w:val="0"/>
+                <w:color w:val="0A2F5C"/>
+                <w:sz w:val="17"/>
+              </w:rPr>
+              <w:t>Enlaces</w:t>
+            </w:r>
+          </w:p>
+        </w:tc>
+        <w:tc>
+          <w:tcPr>
+            <w:tcW w:type="dxa" w:w="7370"/>
+          </w:tcPr>
+          <w:p>
+            <w:pPr>
+              <w:spacing w:before="20" w:after="20" w:line="264" w:lineRule="auto"/>
+            </w:pPr>
+            <w:hyperlink r:id="rId12">
+              <w:r>
+                <w:rPr>
+                  <w:rFonts w:ascii="Arial" w:hAnsi="Arial" w:eastAsia="Arial" w:cs="Arial"/>
+                  <w:color w:val="0B5CAD"/>
+                  <w:sz w:val="17"/>
+                  <w:u w:val="single"/>
+                </w:rPr>
+                <w:t xml:space="preserve">Texto completo</w:t>
+              </w:r>
+            </w:hyperlink>
+            <w:r>
+              <w:rPr>
+                <w:rFonts w:ascii="Arial" w:hAnsi="Arial" w:eastAsia="Arial"/>
+                <w:b w:val="0"/>
+                <w:i w:val="0"/>
+                <w:color w:val="5B6880"/>
+                <w:sz w:val="17"/>
+              </w:rPr>
+              <w:t xml:space="preserve">   ·   </w:t>
+            </w:r>
+            <w:hyperlink r:id="rId15">
+              <w:r>
+                <w:rPr>
+                  <w:rFonts w:ascii="Arial" w:hAnsi="Arial" w:eastAsia="Arial" w:cs="Arial"/>
+                  <w:color w:val="0B5CAD"/>
+                  <w:sz w:val="17"/>
+                  <w:u w:val="single"/>
+                </w:rPr>
+                <w:t xml:space="preserve">El Peruano</w:t>
+              </w:r>
+            </w:hyperlink>
+            <w:r>
+              <w:rPr>
+                <w:rFonts w:ascii="Arial" w:hAnsi="Arial" w:eastAsia="Arial"/>
+                <w:b w:val="0"/>
+                <w:i w:val="0"/>
+                <w:color w:val="5B6880"/>
+                <w:sz w:val="17"/>
+              </w:rPr>
+              <w:t xml:space="preserve">   ·   </w:t>
+            </w:r>
+            <w:hyperlink r:id="rId16">
               <w:r>
                 <w:rPr>
                   <w:rFonts w:ascii="Arial" w:hAnsi="Arial" w:eastAsia="Arial" w:cs="Arial"/>
@@ -1015,7 +1556,7 @@
         </w:rPr>
         <w:t xml:space="preserve">se revisan todas las normas publicadas en el Diario Oficial El Peruano en el periodo. Una norma se selecciona cuando su entidad, título o sumilla contiene alguno de los términos definidos para cada tema, o cuando su texto completo menciona a la ATU. Los criterios pueden consultarse y editarse en el panel: </w:t>
       </w:r>
-      <w:hyperlink r:id="rId14">
+      <w:hyperlink r:id="rId17">
         <w:r>
           <w:rPr>
             <w:rFonts w:ascii="Arial" w:hAnsi="Arial" w:eastAsia="Arial" w:cs="Arial"/>

</xml_diff>

<commit_message>
Panel: normas al 29/10/2026
</commit_message>
<xml_diff>
--- a/docs/resumenes/Normas_ElPeruano_ultimo.docx
+++ b/docs/resumenes/Normas_ElPeruano_ultimo.docx
@@ -31,7 +31,7 @@
           <w:color w:val="5B6880"/>
           <w:sz w:val="21"/>
         </w:rPr>
-        <w:t>Diario Oficial El Peruano · Miércoles 28 de octubre de 2026</w:t>
+        <w:t>Diario Oficial El Peruano · Jueves 29 de octubre de 2026</w:t>
       </w:r>
     </w:p>
     <w:p>
@@ -105,7 +105,7 @@
                 <w:i w:val="0"/>
                 <w:sz w:val="19"/>
               </w:rPr>
-              <w:t>28/10/2026</w:t>
+              <w:t>29/10/2026</w:t>
             </w:r>
           </w:p>
         </w:tc>
@@ -145,7 +145,7 @@
                 <w:i w:val="0"/>
                 <w:sz w:val="19"/>
               </w:rPr>
-              <w:t>28/10/2026 13:27</w:t>
+              <w:t>29/10/2026 09:41</w:t>
             </w:r>
           </w:p>
         </w:tc>
@@ -187,7 +187,7 @@
                 <w:i w:val="0"/>
                 <w:sz w:val="19"/>
               </w:rPr>
-              <w:t>43</w:t>
+              <w:t>77</w:t>
             </w:r>
           </w:p>
         </w:tc>
@@ -265,7 +265,7 @@
           <w:i w:val="0"/>
           <w:sz w:val="20"/>
         </w:rPr>
-        <w:t>De las 43 normas publicadas en el periodo, 2 resultan de interés institucional: 2 de normatividad presupuestal. No se identificaron normas que involucren a la ATU. El Cuadro 1 presenta la relación completa y la sección 2, el detalle de cada norma.</w:t>
+        <w:t>De las 77 normas publicadas en el periodo, 2 resultan de interés institucional: 1 de normatividad presupuestal y 1 de inversiones. No se identificaron normas que involucren a la ATU. El Cuadro 1 presenta la relación completa y la sección 2, el detalle de cada norma.</w:t>
       </w:r>
     </w:p>
     <w:p>
@@ -429,7 +429,7 @@
                 <w:color w:val="0A2F5C"/>
                 <w:sz w:val="17"/>
               </w:rPr>
-              <w:t>NORMATIVIDAD PRESUPUESTAL  (2)</w:t>
+              <w:t>NORMATIVIDAD PRESUPUESTAL  (1)</w:t>
             </w:r>
           </w:p>
         </w:tc>
@@ -476,7 +476,7 @@
                   <w:sz w:val="17"/>
                   <w:u w:val="single"/>
                 </w:rPr>
-                <w:t xml:space="preserve">RESOLUCIÓN MINISTERIAL N° 394-2026-MINCETUR</w:t>
+                <w:t xml:space="preserve">ACUERDO  N° 2889-2026/GRP-CR</w:t>
               </w:r>
             </w:hyperlink>
           </w:p>
@@ -492,7 +492,7 @@
                 <w:color w:val="5B6880"/>
                 <w:sz w:val="15"/>
               </w:rPr>
-              <w:t>COMERCIO EXTERIOR Y TURISMO</w:t>
+              <w:t>GOBIERNO REGIONAL DE PIURA</w:t>
             </w:r>
           </w:p>
         </w:tc>
@@ -511,7 +511,7 @@
                 <w:i w:val="0"/>
                 <w:sz w:val="17"/>
               </w:rPr>
-              <w:t>Aprueban transferencia financiera a favor de la Autoridad Nacional de Infraestructura para financiar proyecto de inversión en el mejoramiento de los servicios turísticos públicos en recursos turísticos del Parque Arqueológico Choquequirao del departamento de Cusco</w:t>
+              <w:t>Aprueban modificación del Presupuesto Institucional para el Año Fiscal 2026 del Gobierno Regional de Piura</w:t>
             </w:r>
           </w:p>
         </w:tc>
@@ -531,23 +531,37 @@
                 <w:i w:val="0"/>
                 <w:sz w:val="17"/>
               </w:rPr>
-              <w:t>27/10/2026</w:t>
+              <w:t>29/10/2026</w:t>
             </w:r>
           </w:p>
+        </w:tc>
+      </w:tr>
+      <w:tr>
+        <w:trPr>
+          <w:cantSplit/>
+        </w:trPr>
+        <w:tc>
+          <w:tcPr>
+            <w:tcW w:type="dxa" w:w="1247"/>
+            <w:gridSpan w:val="4"/>
+            <w:shd w:val="clear" w:color="auto" w:fill="F2F5FA"/>
+            <w:tcBorders>
+              <w:left w:val="single" w:sz="30" w:space="0" w:color="1BAF7A"/>
+            </w:tcBorders>
+          </w:tcPr>
           <w:p>
             <w:pPr>
-              <w:spacing w:before="0" w:after="0" w:line="240" w:lineRule="auto"/>
-              <w:jc w:val="center"/>
+              <w:spacing w:before="20" w:after="20" w:line="264" w:lineRule="auto"/>
             </w:pPr>
             <w:r>
               <w:rPr>
                 <w:rFonts w:ascii="Arial" w:hAnsi="Arial" w:eastAsia="Arial"/>
-                <w:b w:val="0"/>
+                <w:b/>
                 <w:i w:val="0"/>
-                <w:color w:val="B42318"/>
-                <w:sz w:val="14"/>
+                <w:color w:val="0A2F5C"/>
+                <w:sz w:val="17"/>
               </w:rPr>
-              <w:t>Edición extraordinaria</w:t>
+              <w:t>INVERSIONES  (1)</w:t>
             </w:r>
           </w:p>
         </w:tc>
@@ -594,7 +608,7 @@
                   <w:sz w:val="17"/>
                   <w:u w:val="single"/>
                 </w:rPr>
-                <w:t xml:space="preserve">RESOLUCIÓN MINISTERIAL  N° 401-2026-JUS</w:t>
+                <w:t xml:space="preserve">RESOLUCIÓN MINISTERIAL  N° D000350-2026-MINAM</w:t>
               </w:r>
             </w:hyperlink>
           </w:p>
@@ -610,7 +624,7 @@
                 <w:color w:val="5B6880"/>
                 <w:sz w:val="15"/>
               </w:rPr>
-              <w:t>JUSTICIA Y DERECHOS HUMANOS</w:t>
+              <w:t>AMBIENTE</w:t>
             </w:r>
           </w:p>
         </w:tc>
@@ -629,7 +643,7 @@
                 <w:i w:val="0"/>
                 <w:sz w:val="17"/>
               </w:rPr>
-              <w:t>Autorizan Transferencia Financiera a favor de la Contraloría General de la República</w:t>
+              <w:t>Aprueban Lineamientos para la elaboración y modificación de la clasificación anticipada de proyectos de inversión con características comunes o similares en el marco del Sistema Nacional de Evaluación del Impacto Ambiental</w:t>
             </w:r>
           </w:p>
         </w:tc>
@@ -649,7 +663,7 @@
                 <w:i w:val="0"/>
                 <w:sz w:val="17"/>
               </w:rPr>
-              <w:t>28/10/2026</w:t>
+              <w:t>29/10/2026</w:t>
             </w:r>
           </w:p>
         </w:tc>
@@ -739,7 +753,7 @@
                 <w:color w:val="0A2F5C"/>
                 <w:sz w:val="19"/>
               </w:rPr>
-              <w:t>1.  RESOLUCIÓN MINISTERIAL N° 394-2026-MINCETUR</w:t>
+              <w:t>1.  ACUERDO  N° 2889-2026/GRP-CR</w:t>
             </w:r>
           </w:p>
         </w:tc>
@@ -784,7 +798,7 @@
                 <w:i w:val="0"/>
                 <w:sz w:val="18"/>
               </w:rPr>
-              <w:t>COMERCIO EXTERIOR Y TURISMO</w:t>
+              <w:t>GOBIERNO REGIONAL DE PIURA</w:t>
             </w:r>
           </w:p>
         </w:tc>
@@ -829,7 +843,7 @@
                 <w:i w:val="0"/>
                 <w:sz w:val="18"/>
               </w:rPr>
-              <w:t>27/10/2026 · Edición extraordinaria</w:t>
+              <w:t>29/10/2026 · Edición ordinaria</w:t>
             </w:r>
           </w:p>
         </w:tc>
@@ -874,7 +888,7 @@
                 <w:i w:val="0"/>
                 <w:sz w:val="18"/>
               </w:rPr>
-              <w:t>Normatividad presupuestal · Inversiones</w:t>
+              <w:t>Normatividad presupuestal</w:t>
             </w:r>
           </w:p>
         </w:tc>
@@ -919,7 +933,7 @@
                 <w:i w:val="0"/>
                 <w:sz w:val="18"/>
               </w:rPr>
-              <w:t>Aprueban transferencia financiera a favor de la Autoridad Nacional de Infraestructura para financiar proyecto de inversión en el mejoramiento de los servicios turísticos públicos en recursos turísticos del Parque Arqueológico Choquequirao del departamento de Cusco</w:t>
+              <w:t>Aprueban modificación del Presupuesto Institucional para el Año Fiscal 2026 del Gobierno Regional de Piura</w:t>
             </w:r>
           </w:p>
         </w:tc>
@@ -964,7 +978,7 @@
                 <w:i w:val="0"/>
                 <w:sz w:val="18"/>
               </w:rPr>
-              <w:t>Artículo 1.- Transferencia financiera a favor de la Unidad Ejecutora 001-1750: AUTORIDAD NACIONAL DE INFRAESTRUCTURA - ANIN del Pliego 029: AUTORIDAD NACIONAL DE INFRAESTRUCTURA Aprobar una transferencia financiera del Pliego 035: Ministerio de Comercio Exterior y Turismo, hasta por la suma de S/ 9 500 000,00 (NUEVE MILLONES QUINIENTOS MIL CON 00/100 SOLES); en la Fuente de Financiamiento 1. Recursos Ordinarios, a favor de la Unidad Ejecutora: 001-1750: AUTORIDAD NACIONAL DE INFRAESTRUCTURA - ANIN del Pliego 029: AUTORIDAD NACIONAL DE INFRAESTRUCTURA, para el financiamiento de la ACTIVIDAD 5001253 “MEJORAMIENTO DE LOS SERVICIOS TURÍSTICOS PÚBLICOS EN RECURSOS TURÍSTICOS DEL PARQUE…</w:t>
+              <w:t>Artículo Primero.- APROBAR la modificación del Presupuesto Institucional del Año Fiscal 2026 del Pliego 457: Gobierno Regional del Departamento de Piura, en la fuente de financiamiento Recursos Determinados, hasta por los montos que se detallan a continuación, como consecuencia de la variación de los índices de distribución correspondientes: Rubro Incremento (S/) Reducción (S/) 15 Fondo de Compensación Regional - FONCOR 88,658,616.00 - 18 Canon y Sobrecanon, Regalías, Renta de Aduanas y Participaciones - 59,372,530.00 Variación neta 29,286,086.00 - Artículo Segundo.- ENCARGAR a Gerencia General Regional, a través de la Gerencia Regional de Planeamiento, Presupuesto, Modernización y…</w:t>
             </w:r>
           </w:p>
         </w:tc>
@@ -1009,7 +1023,7 @@
                 <w:i w:val="0"/>
                 <w:sz w:val="18"/>
               </w:rPr>
-              <w:t>S/ 44 375 850,00 · S/ 9 500 000,00</w:t>
+              <w:t>S/ 936,091,142.00 · S/ 88,658,616.00 · S/ 79,000,285.00 · S/ 59,372,530.00</w:t>
             </w:r>
           </w:p>
         </w:tc>
@@ -1109,6 +1123,22 @@
         <w:spacing w:before="0" w:after="120" w:line="276" w:lineRule="auto"/>
       </w:pPr>
     </w:p>
+    <w:p>
+      <w:pPr>
+        <w:keepNext/>
+        <w:spacing w:before="160" w:after="80" w:line="276" w:lineRule="auto"/>
+      </w:pPr>
+      <w:r>
+        <w:rPr>
+          <w:rFonts w:ascii="Arial" w:hAnsi="Arial" w:eastAsia="Arial"/>
+          <w:b/>
+          <w:i w:val="0"/>
+          <w:color w:val="0B5CAD"/>
+          <w:sz w:val="21"/>
+        </w:rPr>
+        <w:t>2.2  Inversiones</w:t>
+      </w:r>
+    </w:p>
     <w:tbl>
       <w:tblPr>
         <w:tblW w:type="auto" w:w="0"/>
@@ -1143,7 +1173,7 @@
             <w:gridSpan w:val="2"/>
             <w:shd w:val="clear" w:color="auto" w:fill="E8F0FA"/>
             <w:tcBorders>
-              <w:left w:val="single" w:sz="30" w:space="0" w:color="EB6834"/>
+              <w:left w:val="single" w:sz="30" w:space="0" w:color="1BAF7A"/>
             </w:tcBorders>
           </w:tcPr>
           <w:p>
@@ -1158,7 +1188,7 @@
                 <w:color w:val="0A2F5C"/>
                 <w:sz w:val="19"/>
               </w:rPr>
-              <w:t>2.  RESOLUCIÓN MINISTERIAL  N° 401-2026-JUS</w:t>
+              <w:t>2.  RESOLUCIÓN MINISTERIAL  N° D000350-2026-MINAM</w:t>
             </w:r>
           </w:p>
         </w:tc>
@@ -1203,7 +1233,7 @@
                 <w:i w:val="0"/>
                 <w:sz w:val="18"/>
               </w:rPr>
-              <w:t>JUSTICIA Y DERECHOS HUMANOS</w:t>
+              <w:t>AMBIENTE</w:t>
             </w:r>
           </w:p>
         </w:tc>
@@ -1248,7 +1278,7 @@
                 <w:i w:val="0"/>
                 <w:sz w:val="18"/>
               </w:rPr>
-              <w:t>28/10/2026 · Edición ordinaria</w:t>
+              <w:t>29/10/2026 · Edición ordinaria</w:t>
             </w:r>
           </w:p>
         </w:tc>
@@ -1293,7 +1323,7 @@
                 <w:i w:val="0"/>
                 <w:sz w:val="18"/>
               </w:rPr>
-              <w:t>Normatividad presupuestal</w:t>
+              <w:t>Inversiones</w:t>
             </w:r>
           </w:p>
         </w:tc>
@@ -1338,7 +1368,7 @@
                 <w:i w:val="0"/>
                 <w:sz w:val="18"/>
               </w:rPr>
-              <w:t>Autorizan Transferencia Financiera a favor de la Contraloría General de la República</w:t>
+              <w:t>Aprueban Lineamientos para la elaboración y modificación de la clasificación anticipada de proyectos de inversión con características comunes o similares en el marco del Sistema Nacional de Evaluación del Impacto Ambiental</w:t>
             </w:r>
           </w:p>
         </w:tc>
@@ -1383,52 +1413,7 @@
                 <w:i w:val="0"/>
                 <w:sz w:val="18"/>
               </w:rPr>
-              <w:t>Artículo 1.- Transferencia Financiera a favor de la Contraloría General de la República: Autorizar la Transferencia Financiera del Pliego 006: Ministerio de Justicia y Derechos Humanos hasta por la suma de S/ 50 750,00 (Cincuenta Mil Setecientos Cincuenta y 00/100 Soles) a favor del Pliego 019: Contraloría General, Unidad Ejecutora 001-196: Contraloría General, correspondiente a la totalidad de la retribución económica para los periodos 2024 y 2025, destinada a la contratación y pago a la sociedad de auditoría que, previo concurso público de méritos, sea designada para realizar la Auditoría Financiera Gubernamental correspondiente a dichos periodos. Artículo 2.- Financiamiento: La…</w:t>
-            </w:r>
-          </w:p>
-        </w:tc>
-      </w:tr>
-      <w:tr>
-        <w:trPr>
-          <w:cantSplit/>
-        </w:trPr>
-        <w:tc>
-          <w:tcPr>
-            <w:tcW w:type="dxa" w:w="2041"/>
-            <w:shd w:val="clear" w:color="auto" w:fill="F2F5FA"/>
-          </w:tcPr>
-          <w:p>
-            <w:pPr>
-              <w:spacing w:before="20" w:after="20" w:line="264" w:lineRule="auto"/>
-            </w:pPr>
-            <w:r>
-              <w:rPr>
-                <w:rFonts w:ascii="Arial" w:hAnsi="Arial" w:eastAsia="Arial"/>
-                <w:b/>
-                <w:i w:val="0"/>
-                <w:color w:val="0A2F5C"/>
-                <w:sz w:val="17"/>
-              </w:rPr>
-              <w:t>Montos citados</w:t>
-            </w:r>
-          </w:p>
-        </w:tc>
-        <w:tc>
-          <w:tcPr>
-            <w:tcW w:type="dxa" w:w="7370"/>
-          </w:tcPr>
-          <w:p>
-            <w:pPr>
-              <w:spacing w:before="20" w:after="20" w:line="264" w:lineRule="auto"/>
-            </w:pPr>
-            <w:r>
-              <w:rPr>
-                <w:rFonts w:ascii="Arial" w:hAnsi="Arial" w:eastAsia="Arial"/>
-                <w:b w:val="0"/>
-                <w:i w:val="0"/>
-                <w:sz w:val="18"/>
-              </w:rPr>
-              <w:t>S/ 713 326 414,00 · S/ 53 330,00 · S/ 50 750,00 · S/ 2 580,00</w:t>
+              <w:t>Artículo 1.- Aprobar el Lineamiento N° 004-2026- MINAM-DM denominado “Lineamientos para la elaboración y modificación de la clasificación anticipada de proyectos de inversión con características comunes o similares en el marco del Sistema Nacional de Evaluación del Impacto Ambiental”, que forman parte integrante de la presente Resolución Ministerial. Artículo 2.- Dejar sin efecto la Resolución Ministerial N° 207-2016-MINAM, que aprueba las Disposiciones para la clasificación anticipada de proyectos de inversión en el marco del Sistema Nacional de Evaluación de Impacto Ambiental (SEIA). Artículo 3.- Disponer la publicación de la presente Resolución Ministerial y los Lineamientos en la sede…</w:t>
             </w:r>
           </w:p>
         </w:tc>

</xml_diff>

<commit_message>
Panel: normas al 30/10/2026
</commit_message>
<xml_diff>
--- a/docs/resumenes/Normas_ElPeruano_ultimo.docx
+++ b/docs/resumenes/Normas_ElPeruano_ultimo.docx
@@ -31,7 +31,7 @@
           <w:color w:val="5B6880"/>
           <w:sz w:val="21"/>
         </w:rPr>
-        <w:t>Diario Oficial El Peruano · Jueves 29 de octubre de 2026</w:t>
+        <w:t>Diario Oficial El Peruano · Viernes 30 de octubre de 2026</w:t>
       </w:r>
     </w:p>
     <w:p>
@@ -105,7 +105,7 @@
                 <w:i w:val="0"/>
                 <w:sz w:val="19"/>
               </w:rPr>
-              <w:t>29/10/2026</w:t>
+              <w:t>30/10/2026</w:t>
             </w:r>
           </w:p>
         </w:tc>
@@ -145,7 +145,7 @@
                 <w:i w:val="0"/>
                 <w:sz w:val="19"/>
               </w:rPr>
-              <w:t>29/10/2026 09:41</w:t>
+              <w:t>30/10/2026 10:46</w:t>
             </w:r>
           </w:p>
         </w:tc>
@@ -187,7 +187,7 @@
                 <w:i w:val="0"/>
                 <w:sz w:val="19"/>
               </w:rPr>
-              <w:t>77</w:t>
+              <w:t>112</w:t>
             </w:r>
           </w:p>
         </w:tc>
@@ -228,7 +228,7 @@
                 <w:color w:val="0A2F5C"/>
                 <w:sz w:val="19"/>
               </w:rPr>
-              <w:t>2</w:t>
+              <w:t>7</w:t>
             </w:r>
           </w:p>
         </w:tc>
@@ -265,7 +265,7 @@
           <w:i w:val="0"/>
           <w:sz w:val="20"/>
         </w:rPr>
-        <w:t>De las 77 normas publicadas en el periodo, 2 resultan de interés institucional: 1 de normatividad presupuestal y 1 de inversiones. No se identificaron normas que involucren a la ATU. El Cuadro 1 presenta la relación completa y la sección 2, el detalle de cada norma.</w:t>
+        <w:t>De las 112 normas publicadas en el periodo, 7 resultan de interés institucional: 7 de normatividad presupuestal. No se identificaron normas que involucren a la ATU. El Cuadro 1 presenta la relación completa y la sección 2, el detalle de cada norma.</w:t>
       </w:r>
     </w:p>
     <w:p>
@@ -429,7 +429,7 @@
                 <w:color w:val="0A2F5C"/>
                 <w:sz w:val="17"/>
               </w:rPr>
-              <w:t>NORMATIVIDAD PRESUPUESTAL  (1)</w:t>
+              <w:t>NORMATIVIDAD PRESUPUESTAL  (7)</w:t>
             </w:r>
           </w:p>
         </w:tc>
@@ -476,7 +476,7 @@
                   <w:sz w:val="17"/>
                   <w:u w:val="single"/>
                 </w:rPr>
-                <w:t xml:space="preserve">ACUERDO  N° 2889-2026/GRP-CR</w:t>
+                <w:t xml:space="preserve">DECRETO SUPREMO  N° 227-2026-EF</w:t>
               </w:r>
             </w:hyperlink>
           </w:p>
@@ -492,7 +492,7 @@
                 <w:color w:val="5B6880"/>
                 <w:sz w:val="15"/>
               </w:rPr>
-              <w:t>GOBIERNO REGIONAL DE PIURA</w:t>
+              <w:t>ECONOMÍA Y FINANZAS</w:t>
             </w:r>
           </w:p>
         </w:tc>
@@ -511,7 +511,7 @@
                 <w:i w:val="0"/>
                 <w:sz w:val="17"/>
               </w:rPr>
-              <w:t>Aprueban modificación del Presupuesto Institucional para el Año Fiscal 2026 del Gobierno Regional de Piura</w:t>
+              <w:t>Decreto Supremo que autoriza Crédito Suplementario en el Presupuesto del Sector Público para el Año Fiscal 2026 a favor del Ministerio de Defensa</w:t>
             </w:r>
           </w:p>
         </w:tc>
@@ -531,37 +531,7 @@
                 <w:i w:val="0"/>
                 <w:sz w:val="17"/>
               </w:rPr>
-              <w:t>29/10/2026</w:t>
-            </w:r>
-          </w:p>
-        </w:tc>
-      </w:tr>
-      <w:tr>
-        <w:trPr>
-          <w:cantSplit/>
-        </w:trPr>
-        <w:tc>
-          <w:tcPr>
-            <w:tcW w:type="dxa" w:w="1247"/>
-            <w:gridSpan w:val="4"/>
-            <w:shd w:val="clear" w:color="auto" w:fill="F2F5FA"/>
-            <w:tcBorders>
-              <w:left w:val="single" w:sz="30" w:space="0" w:color="1BAF7A"/>
-            </w:tcBorders>
-          </w:tcPr>
-          <w:p>
-            <w:pPr>
-              <w:spacing w:before="20" w:after="20" w:line="264" w:lineRule="auto"/>
-            </w:pPr>
-            <w:r>
-              <w:rPr>
-                <w:rFonts w:ascii="Arial" w:hAnsi="Arial" w:eastAsia="Arial"/>
-                <w:b/>
-                <w:i w:val="0"/>
-                <w:color w:val="0A2F5C"/>
-                <w:sz w:val="17"/>
-              </w:rPr>
-              <w:t>INVERSIONES  (1)</w:t>
+              <w:t>30/10/2026</w:t>
             </w:r>
           </w:p>
         </w:tc>
@@ -608,7 +578,7 @@
                   <w:sz w:val="17"/>
                   <w:u w:val="single"/>
                 </w:rPr>
-                <w:t xml:space="preserve">RESOLUCIÓN MINISTERIAL  N° D000350-2026-MINAM</w:t>
+                <w:t xml:space="preserve">DECRETO SUPREMO  N° 228-2026-EF</w:t>
               </w:r>
             </w:hyperlink>
           </w:p>
@@ -624,7 +594,7 @@
                 <w:color w:val="5B6880"/>
                 <w:sz w:val="15"/>
               </w:rPr>
-              <w:t>AMBIENTE</w:t>
+              <w:t>ECONOMÍA Y FINANZAS</w:t>
             </w:r>
           </w:p>
         </w:tc>
@@ -643,7 +613,7 @@
                 <w:i w:val="0"/>
                 <w:sz w:val="17"/>
               </w:rPr>
-              <w:t>Aprueban Lineamientos para la elaboración y modificación de la clasificación anticipada de proyectos de inversión con características comunes o similares en el marco del Sistema Nacional de Evaluación del Impacto Ambiental</w:t>
+              <w:t>Decreto Supremo que autoriza Transferencia de Partidas en el Presupuesto del Sector Público para el Año Fiscal 2026 a favor de la Reserva de Contingencia y del Ministerio de Defensa</w:t>
             </w:r>
           </w:p>
         </w:tc>
@@ -663,7 +633,517 @@
                 <w:i w:val="0"/>
                 <w:sz w:val="17"/>
               </w:rPr>
-              <w:t>29/10/2026</w:t>
+              <w:t>30/10/2026</w:t>
+            </w:r>
+          </w:p>
+        </w:tc>
+      </w:tr>
+      <w:tr>
+        <w:trPr>
+          <w:cantSplit/>
+        </w:trPr>
+        <w:tc>
+          <w:tcPr>
+            <w:tcW w:type="dxa" w:w="567"/>
+          </w:tcPr>
+          <w:p>
+            <w:pPr>
+              <w:spacing w:before="20" w:after="20" w:line="264" w:lineRule="auto"/>
+              <w:jc w:val="center"/>
+            </w:pPr>
+            <w:r>
+              <w:rPr>
+                <w:rFonts w:ascii="Arial" w:hAnsi="Arial" w:eastAsia="Arial"/>
+                <w:b/>
+                <w:i w:val="0"/>
+                <w:color w:val="0A2F5C"/>
+                <w:sz w:val="18"/>
+              </w:rPr>
+              <w:t>3</w:t>
+            </w:r>
+          </w:p>
+        </w:tc>
+        <w:tc>
+          <w:tcPr>
+            <w:tcW w:type="dxa" w:w="2835"/>
+          </w:tcPr>
+          <w:p>
+            <w:pPr>
+              <w:spacing w:before="20" w:after="20" w:line="264" w:lineRule="auto"/>
+            </w:pPr>
+            <w:hyperlink r:id="rId13">
+              <w:r>
+                <w:rPr>
+                  <w:rFonts w:ascii="Arial" w:hAnsi="Arial" w:eastAsia="Arial" w:cs="Arial"/>
+                  <w:b/>
+                  <w:color w:val="0B5CAD"/>
+                  <w:sz w:val="17"/>
+                  <w:u w:val="single"/>
+                </w:rPr>
+                <w:t xml:space="preserve">DECRETO SUPREMO  N° 229-2026-EF</w:t>
+              </w:r>
+            </w:hyperlink>
+          </w:p>
+          <w:p>
+            <w:pPr>
+              <w:spacing w:before="0" w:after="20" w:line="252" w:lineRule="auto"/>
+            </w:pPr>
+            <w:r>
+              <w:rPr>
+                <w:rFonts w:ascii="Arial" w:hAnsi="Arial" w:eastAsia="Arial"/>
+                <w:b w:val="0"/>
+                <w:i w:val="0"/>
+                <w:color w:val="5B6880"/>
+                <w:sz w:val="15"/>
+              </w:rPr>
+              <w:t>ECONOMÍA Y FINANZAS</w:t>
+            </w:r>
+          </w:p>
+        </w:tc>
+        <w:tc>
+          <w:tcPr>
+            <w:tcW w:type="dxa" w:w="4762"/>
+          </w:tcPr>
+          <w:p>
+            <w:pPr>
+              <w:spacing w:before="20" w:after="20" w:line="264" w:lineRule="auto"/>
+            </w:pPr>
+            <w:r>
+              <w:rPr>
+                <w:rFonts w:ascii="Arial" w:hAnsi="Arial" w:eastAsia="Arial"/>
+                <w:b w:val="0"/>
+                <w:i w:val="0"/>
+                <w:sz w:val="17"/>
+              </w:rPr>
+              <w:t>Decreto Supremo que autoriza Transferencia de Partidas en el Presupuesto del Sector Público para el Año Fiscal 2026 a favor del Centro Nacional de Planeamiento Estratégico</w:t>
+            </w:r>
+          </w:p>
+        </w:tc>
+        <w:tc>
+          <w:tcPr>
+            <w:tcW w:type="dxa" w:w="1247"/>
+          </w:tcPr>
+          <w:p>
+            <w:pPr>
+              <w:spacing w:before="20" w:after="20" w:line="264" w:lineRule="auto"/>
+              <w:jc w:val="center"/>
+            </w:pPr>
+            <w:r>
+              <w:rPr>
+                <w:rFonts w:ascii="Arial" w:hAnsi="Arial" w:eastAsia="Arial"/>
+                <w:b w:val="0"/>
+                <w:i w:val="0"/>
+                <w:sz w:val="17"/>
+              </w:rPr>
+              <w:t>30/10/2026</w:t>
+            </w:r>
+          </w:p>
+        </w:tc>
+      </w:tr>
+      <w:tr>
+        <w:trPr>
+          <w:cantSplit/>
+        </w:trPr>
+        <w:tc>
+          <w:tcPr>
+            <w:tcW w:type="dxa" w:w="567"/>
+          </w:tcPr>
+          <w:p>
+            <w:pPr>
+              <w:spacing w:before="20" w:after="20" w:line="264" w:lineRule="auto"/>
+              <w:jc w:val="center"/>
+            </w:pPr>
+            <w:r>
+              <w:rPr>
+                <w:rFonts w:ascii="Arial" w:hAnsi="Arial" w:eastAsia="Arial"/>
+                <w:b/>
+                <w:i w:val="0"/>
+                <w:color w:val="0A2F5C"/>
+                <w:sz w:val="18"/>
+              </w:rPr>
+              <w:t>4</w:t>
+            </w:r>
+          </w:p>
+        </w:tc>
+        <w:tc>
+          <w:tcPr>
+            <w:tcW w:type="dxa" w:w="2835"/>
+          </w:tcPr>
+          <w:p>
+            <w:pPr>
+              <w:spacing w:before="20" w:after="20" w:line="264" w:lineRule="auto"/>
+            </w:pPr>
+            <w:hyperlink r:id="rId14">
+              <w:r>
+                <w:rPr>
+                  <w:rFonts w:ascii="Arial" w:hAnsi="Arial" w:eastAsia="Arial" w:cs="Arial"/>
+                  <w:b/>
+                  <w:color w:val="0B5CAD"/>
+                  <w:sz w:val="17"/>
+                  <w:u w:val="single"/>
+                </w:rPr>
+                <w:t xml:space="preserve">RESOLUCIÓN  N° 535-2026-GOB</w:t>
+              </w:r>
+            </w:hyperlink>
+          </w:p>
+          <w:p>
+            <w:pPr>
+              <w:spacing w:before="0" w:after="20" w:line="252" w:lineRule="auto"/>
+            </w:pPr>
+            <w:r>
+              <w:rPr>
+                <w:rFonts w:ascii="Arial" w:hAnsi="Arial" w:eastAsia="Arial"/>
+                <w:b w:val="0"/>
+                <w:i w:val="0"/>
+                <w:color w:val="5B6880"/>
+                <w:sz w:val="15"/>
+              </w:rPr>
+              <w:t>GOBIERNO REGIONAL DE LIMA</w:t>
+            </w:r>
+          </w:p>
+        </w:tc>
+        <w:tc>
+          <w:tcPr>
+            <w:tcW w:type="dxa" w:w="4762"/>
+          </w:tcPr>
+          <w:p>
+            <w:pPr>
+              <w:spacing w:before="20" w:after="20" w:line="264" w:lineRule="auto"/>
+            </w:pPr>
+            <w:r>
+              <w:rPr>
+                <w:rFonts w:ascii="Arial" w:hAnsi="Arial" w:eastAsia="Arial"/>
+                <w:b w:val="0"/>
+                <w:i w:val="0"/>
+                <w:sz w:val="17"/>
+              </w:rPr>
+              <w:t>Aprueban transferencia financiera a favor de la Contraloría General de la República</w:t>
+            </w:r>
+          </w:p>
+        </w:tc>
+        <w:tc>
+          <w:tcPr>
+            <w:tcW w:type="dxa" w:w="1247"/>
+          </w:tcPr>
+          <w:p>
+            <w:pPr>
+              <w:spacing w:before="20" w:after="20" w:line="264" w:lineRule="auto"/>
+              <w:jc w:val="center"/>
+            </w:pPr>
+            <w:r>
+              <w:rPr>
+                <w:rFonts w:ascii="Arial" w:hAnsi="Arial" w:eastAsia="Arial"/>
+                <w:b w:val="0"/>
+                <w:i w:val="0"/>
+                <w:sz w:val="17"/>
+              </w:rPr>
+              <w:t>30/10/2026</w:t>
+            </w:r>
+          </w:p>
+        </w:tc>
+      </w:tr>
+      <w:tr>
+        <w:trPr>
+          <w:cantSplit/>
+        </w:trPr>
+        <w:tc>
+          <w:tcPr>
+            <w:tcW w:type="dxa" w:w="567"/>
+          </w:tcPr>
+          <w:p>
+            <w:pPr>
+              <w:spacing w:before="20" w:after="20" w:line="264" w:lineRule="auto"/>
+              <w:jc w:val="center"/>
+            </w:pPr>
+            <w:r>
+              <w:rPr>
+                <w:rFonts w:ascii="Arial" w:hAnsi="Arial" w:eastAsia="Arial"/>
+                <w:b/>
+                <w:i w:val="0"/>
+                <w:color w:val="0A2F5C"/>
+                <w:sz w:val="18"/>
+              </w:rPr>
+              <w:t>5</w:t>
+            </w:r>
+          </w:p>
+        </w:tc>
+        <w:tc>
+          <w:tcPr>
+            <w:tcW w:type="dxa" w:w="2835"/>
+          </w:tcPr>
+          <w:p>
+            <w:pPr>
+              <w:spacing w:before="20" w:after="20" w:line="264" w:lineRule="auto"/>
+            </w:pPr>
+            <w:hyperlink r:id="rId15">
+              <w:r>
+                <w:rPr>
+                  <w:rFonts w:ascii="Arial" w:hAnsi="Arial" w:eastAsia="Arial" w:cs="Arial"/>
+                  <w:b/>
+                  <w:color w:val="0B5CAD"/>
+                  <w:sz w:val="17"/>
+                  <w:u w:val="single"/>
+                </w:rPr>
+                <w:t xml:space="preserve">RESOLUCIÓN  N° 000053-2026-ITP/GG</w:t>
+              </w:r>
+            </w:hyperlink>
+          </w:p>
+          <w:p>
+            <w:pPr>
+              <w:spacing w:before="0" w:after="20" w:line="252" w:lineRule="auto"/>
+            </w:pPr>
+            <w:r>
+              <w:rPr>
+                <w:rFonts w:ascii="Arial" w:hAnsi="Arial" w:eastAsia="Arial"/>
+                <w:b w:val="0"/>
+                <w:i w:val="0"/>
+                <w:color w:val="5B6880"/>
+                <w:sz w:val="15"/>
+              </w:rPr>
+              <w:t>INSTITUTO TECNOLÓGICO DE LA PRODUCCIÓN</w:t>
+            </w:r>
+          </w:p>
+        </w:tc>
+        <w:tc>
+          <w:tcPr>
+            <w:tcW w:type="dxa" w:w="4762"/>
+          </w:tcPr>
+          <w:p>
+            <w:pPr>
+              <w:spacing w:before="20" w:after="20" w:line="264" w:lineRule="auto"/>
+            </w:pPr>
+            <w:r>
+              <w:rPr>
+                <w:rFonts w:ascii="Arial" w:hAnsi="Arial" w:eastAsia="Arial"/>
+                <w:b w:val="0"/>
+                <w:i w:val="0"/>
+                <w:sz w:val="17"/>
+              </w:rPr>
+              <w:t>Delegar en el/la Jefe/a de la Oficina de Planeamiento Presupuesto y Modernización del ITP la facultad de asegurar la implementación y cumplimiento de la Norma Técnica para la Gestión de la Calidad de Servicios del Sector Público</w:t>
+            </w:r>
+          </w:p>
+        </w:tc>
+        <w:tc>
+          <w:tcPr>
+            <w:tcW w:type="dxa" w:w="1247"/>
+          </w:tcPr>
+          <w:p>
+            <w:pPr>
+              <w:spacing w:before="20" w:after="20" w:line="264" w:lineRule="auto"/>
+              <w:jc w:val="center"/>
+            </w:pPr>
+            <w:r>
+              <w:rPr>
+                <w:rFonts w:ascii="Arial" w:hAnsi="Arial" w:eastAsia="Arial"/>
+                <w:b w:val="0"/>
+                <w:i w:val="0"/>
+                <w:sz w:val="17"/>
+              </w:rPr>
+              <w:t>30/10/2026</w:t>
+            </w:r>
+          </w:p>
+        </w:tc>
+      </w:tr>
+      <w:tr>
+        <w:trPr>
+          <w:cantSplit/>
+        </w:trPr>
+        <w:tc>
+          <w:tcPr>
+            <w:tcW w:type="dxa" w:w="567"/>
+          </w:tcPr>
+          <w:p>
+            <w:pPr>
+              <w:spacing w:before="20" w:after="20" w:line="264" w:lineRule="auto"/>
+              <w:jc w:val="center"/>
+            </w:pPr>
+            <w:r>
+              <w:rPr>
+                <w:rFonts w:ascii="Arial" w:hAnsi="Arial" w:eastAsia="Arial"/>
+                <w:b/>
+                <w:i w:val="0"/>
+                <w:color w:val="0A2F5C"/>
+                <w:sz w:val="18"/>
+              </w:rPr>
+              <w:t>6</w:t>
+            </w:r>
+          </w:p>
+        </w:tc>
+        <w:tc>
+          <w:tcPr>
+            <w:tcW w:type="dxa" w:w="2835"/>
+          </w:tcPr>
+          <w:p>
+            <w:pPr>
+              <w:spacing w:before="20" w:after="20" w:line="264" w:lineRule="auto"/>
+            </w:pPr>
+            <w:hyperlink r:id="rId16">
+              <w:r>
+                <w:rPr>
+                  <w:rFonts w:ascii="Arial" w:hAnsi="Arial" w:eastAsia="Arial" w:cs="Arial"/>
+                  <w:b/>
+                  <w:color w:val="0B5CAD"/>
+                  <w:sz w:val="17"/>
+                  <w:u w:val="single"/>
+                </w:rPr>
+                <w:t xml:space="preserve">DECRETO SUPREMO  N° 045-2026-RE</w:t>
+              </w:r>
+            </w:hyperlink>
+          </w:p>
+          <w:p>
+            <w:pPr>
+              <w:spacing w:before="0" w:after="20" w:line="252" w:lineRule="auto"/>
+            </w:pPr>
+            <w:r>
+              <w:rPr>
+                <w:rFonts w:ascii="Arial" w:hAnsi="Arial" w:eastAsia="Arial"/>
+                <w:b w:val="0"/>
+                <w:i w:val="0"/>
+                <w:color w:val="5B6880"/>
+                <w:sz w:val="15"/>
+              </w:rPr>
+              <w:t>RELACIONES EXTERIORES</w:t>
+            </w:r>
+          </w:p>
+        </w:tc>
+        <w:tc>
+          <w:tcPr>
+            <w:tcW w:type="dxa" w:w="4762"/>
+          </w:tcPr>
+          <w:p>
+            <w:pPr>
+              <w:spacing w:before="20" w:after="20" w:line="264" w:lineRule="auto"/>
+            </w:pPr>
+            <w:r>
+              <w:rPr>
+                <w:rFonts w:ascii="Arial" w:hAnsi="Arial" w:eastAsia="Arial"/>
+                <w:b w:val="0"/>
+                <w:i w:val="0"/>
+                <w:sz w:val="17"/>
+              </w:rPr>
+              <w:t>Decreto Supremo que autoriza al Ministerio de Salud a efectuar el pago de la cuota internacional no contemplada en el Anexo B de la Ley N° 32513 Ley de Presupuesto del Sector Público para el Año Fiscal 2026</w:t>
+            </w:r>
+          </w:p>
+        </w:tc>
+        <w:tc>
+          <w:tcPr>
+            <w:tcW w:type="dxa" w:w="1247"/>
+          </w:tcPr>
+          <w:p>
+            <w:pPr>
+              <w:spacing w:before="20" w:after="20" w:line="264" w:lineRule="auto"/>
+              <w:jc w:val="center"/>
+            </w:pPr>
+            <w:r>
+              <w:rPr>
+                <w:rFonts w:ascii="Arial" w:hAnsi="Arial" w:eastAsia="Arial"/>
+                <w:b w:val="0"/>
+                <w:i w:val="0"/>
+                <w:sz w:val="17"/>
+              </w:rPr>
+              <w:t>30/10/2026</w:t>
+            </w:r>
+          </w:p>
+        </w:tc>
+      </w:tr>
+      <w:tr>
+        <w:trPr>
+          <w:cantSplit/>
+        </w:trPr>
+        <w:tc>
+          <w:tcPr>
+            <w:tcW w:type="dxa" w:w="567"/>
+          </w:tcPr>
+          <w:p>
+            <w:pPr>
+              <w:spacing w:before="20" w:after="20" w:line="264" w:lineRule="auto"/>
+              <w:jc w:val="center"/>
+            </w:pPr>
+            <w:r>
+              <w:rPr>
+                <w:rFonts w:ascii="Arial" w:hAnsi="Arial" w:eastAsia="Arial"/>
+                <w:b/>
+                <w:i w:val="0"/>
+                <w:color w:val="0A2F5C"/>
+                <w:sz w:val="18"/>
+              </w:rPr>
+              <w:t>7</w:t>
+            </w:r>
+          </w:p>
+        </w:tc>
+        <w:tc>
+          <w:tcPr>
+            <w:tcW w:type="dxa" w:w="2835"/>
+          </w:tcPr>
+          <w:p>
+            <w:pPr>
+              <w:spacing w:before="20" w:after="20" w:line="264" w:lineRule="auto"/>
+            </w:pPr>
+            <w:hyperlink r:id="rId17">
+              <w:r>
+                <w:rPr>
+                  <w:rFonts w:ascii="Arial" w:hAnsi="Arial" w:eastAsia="Arial" w:cs="Arial"/>
+                  <w:b/>
+                  <w:color w:val="0B5CAD"/>
+                  <w:sz w:val="17"/>
+                  <w:u w:val="single"/>
+                </w:rPr>
+                <w:t xml:space="preserve">RESOLUCIÓN MINISTERIAL  N° 415-2026-VIVIENDA</w:t>
+              </w:r>
+            </w:hyperlink>
+          </w:p>
+          <w:p>
+            <w:pPr>
+              <w:spacing w:before="0" w:after="20" w:line="252" w:lineRule="auto"/>
+            </w:pPr>
+            <w:r>
+              <w:rPr>
+                <w:rFonts w:ascii="Arial" w:hAnsi="Arial" w:eastAsia="Arial"/>
+                <w:b w:val="0"/>
+                <w:i w:val="0"/>
+                <w:color w:val="5B6880"/>
+                <w:sz w:val="15"/>
+              </w:rPr>
+              <w:t>VIVIENDA, CONSTRUCCIÓN Y SANEAMIENTO</w:t>
+            </w:r>
+          </w:p>
+        </w:tc>
+        <w:tc>
+          <w:tcPr>
+            <w:tcW w:type="dxa" w:w="4762"/>
+          </w:tcPr>
+          <w:p>
+            <w:pPr>
+              <w:spacing w:before="20" w:after="20" w:line="264" w:lineRule="auto"/>
+            </w:pPr>
+            <w:r>
+              <w:rPr>
+                <w:rFonts w:ascii="Arial" w:hAnsi="Arial" w:eastAsia="Arial"/>
+                <w:b w:val="0"/>
+                <w:i w:val="0"/>
+                <w:sz w:val="17"/>
+              </w:rPr>
+              <w:t>Autorizan Transferencia Financiera a favor del Instituto Geofísico del Perú para financiar la elaboración de diversos estudios de zonificación geofísica - geotécnica en el departamento de Junín</w:t>
+            </w:r>
+          </w:p>
+        </w:tc>
+        <w:tc>
+          <w:tcPr>
+            <w:tcW w:type="dxa" w:w="1247"/>
+          </w:tcPr>
+          <w:p>
+            <w:pPr>
+              <w:spacing w:before="20" w:after="20" w:line="264" w:lineRule="auto"/>
+              <w:jc w:val="center"/>
+            </w:pPr>
+            <w:r>
+              <w:rPr>
+                <w:rFonts w:ascii="Arial" w:hAnsi="Arial" w:eastAsia="Arial"/>
+                <w:b w:val="0"/>
+                <w:i w:val="0"/>
+                <w:sz w:val="17"/>
+              </w:rPr>
+              <w:t>30/10/2026</w:t>
             </w:r>
           </w:p>
         </w:tc>
@@ -753,7 +1233,7 @@
                 <w:color w:val="0A2F5C"/>
                 <w:sz w:val="19"/>
               </w:rPr>
-              <w:t>1.  ACUERDO  N° 2889-2026/GRP-CR</w:t>
+              <w:t>1.  DECRETO SUPREMO  N° 227-2026-EF</w:t>
             </w:r>
           </w:p>
         </w:tc>
@@ -798,7 +1278,7 @@
                 <w:i w:val="0"/>
                 <w:sz w:val="18"/>
               </w:rPr>
-              <w:t>GOBIERNO REGIONAL DE PIURA</w:t>
+              <w:t>ECONOMÍA Y FINANZAS</w:t>
             </w:r>
           </w:p>
         </w:tc>
@@ -843,7 +1323,7 @@
                 <w:i w:val="0"/>
                 <w:sz w:val="18"/>
               </w:rPr>
-              <w:t>29/10/2026 · Edición ordinaria</w:t>
+              <w:t>30/10/2026 · Edición ordinaria</w:t>
             </w:r>
           </w:p>
         </w:tc>
@@ -933,7 +1413,7 @@
                 <w:i w:val="0"/>
                 <w:sz w:val="18"/>
               </w:rPr>
-              <w:t>Aprueban modificación del Presupuesto Institucional para el Año Fiscal 2026 del Gobierno Regional de Piura</w:t>
+              <w:t>Decreto Supremo que autoriza Crédito Suplementario en el Presupuesto del Sector Público para el Año Fiscal 2026 a favor del Ministerio de Defensa</w:t>
             </w:r>
           </w:p>
         </w:tc>
@@ -978,7 +1458,7 @@
                 <w:i w:val="0"/>
                 <w:sz w:val="18"/>
               </w:rPr>
-              <w:t>Artículo Primero.- APROBAR la modificación del Presupuesto Institucional del Año Fiscal 2026 del Pliego 457: Gobierno Regional del Departamento de Piura, en la fuente de financiamiento Recursos Determinados, hasta por los montos que se detallan a continuación, como consecuencia de la variación de los índices de distribución correspondientes: Rubro Incremento (S/) Reducción (S/) 15 Fondo de Compensación Regional - FONCOR 88,658,616.00 - 18 Canon y Sobrecanon, Regalías, Renta de Aduanas y Participaciones - 59,372,530.00 Variación neta 29,286,086.00 - Artículo Segundo.- ENCARGAR a Gerencia General Regional, a través de la Gerencia Regional de Planeamiento, Presupuesto, Modernización y…</w:t>
+              <w:t>Artículo 1.- Objeto Se autoriza la incorporación de recursos vía Crédito Suplementario en el Presupuesto del Sector Público para el Año Fiscal 2026, hasta por la suma de S/ 3 474 995,00 (TRES MILLONES CUATROCIENTOS SETENTA Y CUATRO MIL NOVECIENTOS NOVENTA Y CINCO Y 00/100 SOLES), en la fuente de financiamiento Recursos Ordinarios, a favor del Ministerio de Defensa, para financiar el cumplimiento de las competencias de la Autoridad Marítima en la defensa, seguridad y protección ambiental en las aguas jurisdiccionales del país, con cargo a los recursos depositados por la Autoridad Portuaria Nacional en la cuenta del Tesoro Público, correspondiente al 30% de las retribuciones pagadas por la…</w:t>
             </w:r>
           </w:p>
         </w:tc>
@@ -1023,7 +1503,7 @@
                 <w:i w:val="0"/>
                 <w:sz w:val="18"/>
               </w:rPr>
-              <w:t>S/ 936,091,142.00 · S/ 88,658,616.00 · S/ 79,000,285.00 · S/ 59,372,530.00</w:t>
+              <w:t>S/ 3 474 995,00 · S/ 5 412 702,95</w:t>
             </w:r>
           </w:p>
         </w:tc>
@@ -1082,7 +1562,7 @@
               </w:rPr>
               <w:t xml:space="preserve">   ·   </w:t>
             </w:r>
-            <w:hyperlink r:id="rId13">
+            <w:hyperlink r:id="rId18">
               <w:r>
                 <w:rPr>
                   <w:rFonts w:ascii="Arial" w:hAnsi="Arial" w:eastAsia="Arial" w:cs="Arial"/>
@@ -1103,7 +1583,7 @@
               </w:rPr>
               <w:t xml:space="preserve">   ·   </w:t>
             </w:r>
-            <w:hyperlink r:id="rId14">
+            <w:hyperlink r:id="rId19">
               <w:r>
                 <w:rPr>
                   <w:rFonts w:ascii="Arial" w:hAnsi="Arial" w:eastAsia="Arial" w:cs="Arial"/>
@@ -1122,22 +1602,6 @@
       <w:pPr>
         <w:spacing w:before="0" w:after="120" w:line="276" w:lineRule="auto"/>
       </w:pPr>
-    </w:p>
-    <w:p>
-      <w:pPr>
-        <w:keepNext/>
-        <w:spacing w:before="160" w:after="80" w:line="276" w:lineRule="auto"/>
-      </w:pPr>
-      <w:r>
-        <w:rPr>
-          <w:rFonts w:ascii="Arial" w:hAnsi="Arial" w:eastAsia="Arial"/>
-          <w:b/>
-          <w:i w:val="0"/>
-          <w:color w:val="0B5CAD"/>
-          <w:sz w:val="21"/>
-        </w:rPr>
-        <w:t>2.2  Inversiones</w:t>
-      </w:r>
     </w:p>
     <w:tbl>
       <w:tblPr>
@@ -1173,7 +1637,7 @@
             <w:gridSpan w:val="2"/>
             <w:shd w:val="clear" w:color="auto" w:fill="E8F0FA"/>
             <w:tcBorders>
-              <w:left w:val="single" w:sz="30" w:space="0" w:color="1BAF7A"/>
+              <w:left w:val="single" w:sz="30" w:space="0" w:color="EB6834"/>
             </w:tcBorders>
           </w:tcPr>
           <w:p>
@@ -1188,7 +1652,7 @@
                 <w:color w:val="0A2F5C"/>
                 <w:sz w:val="19"/>
               </w:rPr>
-              <w:t>2.  RESOLUCIÓN MINISTERIAL  N° D000350-2026-MINAM</w:t>
+              <w:t>2.  DECRETO SUPREMO  N° 228-2026-EF</w:t>
             </w:r>
           </w:p>
         </w:tc>
@@ -1233,7 +1697,7 @@
                 <w:i w:val="0"/>
                 <w:sz w:val="18"/>
               </w:rPr>
-              <w:t>AMBIENTE</w:t>
+              <w:t>ECONOMÍA Y FINANZAS</w:t>
             </w:r>
           </w:p>
         </w:tc>
@@ -1278,7 +1742,7 @@
                 <w:i w:val="0"/>
                 <w:sz w:val="18"/>
               </w:rPr>
-              <w:t>29/10/2026 · Edición ordinaria</w:t>
+              <w:t>30/10/2026 · Edición ordinaria</w:t>
             </w:r>
           </w:p>
         </w:tc>
@@ -1323,7 +1787,7 @@
                 <w:i w:val="0"/>
                 <w:sz w:val="18"/>
               </w:rPr>
-              <w:t>Inversiones</w:t>
+              <w:t>Normatividad presupuestal</w:t>
             </w:r>
           </w:p>
         </w:tc>
@@ -1368,7 +1832,7 @@
                 <w:i w:val="0"/>
                 <w:sz w:val="18"/>
               </w:rPr>
-              <w:t>Aprueban Lineamientos para la elaboración y modificación de la clasificación anticipada de proyectos de inversión con características comunes o similares en el marco del Sistema Nacional de Evaluación del Impacto Ambiental</w:t>
+              <w:t>Decreto Supremo que autoriza Transferencia de Partidas en el Presupuesto del Sector Público para el Año Fiscal 2026 a favor de la Reserva de Contingencia y del Ministerio de Defensa</w:t>
             </w:r>
           </w:p>
         </w:tc>
@@ -1413,7 +1877,52 @@
                 <w:i w:val="0"/>
                 <w:sz w:val="18"/>
               </w:rPr>
-              <w:t>Artículo 1.- Aprobar el Lineamiento N° 004-2026- MINAM-DM denominado “Lineamientos para la elaboración y modificación de la clasificación anticipada de proyectos de inversión con características comunes o similares en el marco del Sistema Nacional de Evaluación del Impacto Ambiental”, que forman parte integrante de la presente Resolución Ministerial. Artículo 2.- Dejar sin efecto la Resolución Ministerial N° 207-2016-MINAM, que aprueba las Disposiciones para la clasificación anticipada de proyectos de inversión en el marco del Sistema Nacional de Evaluación de Impacto Ambiental (SEIA). Artículo 3.- Disponer la publicación de la presente Resolución Ministerial y los Lineamientos en la sede…</w:t>
+              <w:t>Artículo 1.- Transferencia de Partidas a favor de la Reserva de Contingencia Se autoriza una Transferencia de Partidas en el Presupuesto del Sector Público para el Año Fiscal 2026, hasta por la suma de S/ 52 198 955,00 (CINCUENTA Y DOS MILLONES CIENTO NOVENTA Y OCHO MIL NOVECIENTOS CINCUENTA Y CINCO Y 00/100 SOLES), por la fuente de financiamiento Recursos Ordinarios, a favor de la Reserva de Contingencia del Ministerio de Economía y Finanzas, con cargo a los recursos del presupuesto institucional de la Autoridad Nacional del Agua, en el marco de lo dispuesto en la Décima Cuarta Disposición Complementaria Final de la Ley Nº 32513, Ley de Presupuesto del Sector Público para el Año Fiscal…</w:t>
+            </w:r>
+          </w:p>
+        </w:tc>
+      </w:tr>
+      <w:tr>
+        <w:trPr>
+          <w:cantSplit/>
+        </w:trPr>
+        <w:tc>
+          <w:tcPr>
+            <w:tcW w:type="dxa" w:w="2041"/>
+            <w:shd w:val="clear" w:color="auto" w:fill="F2F5FA"/>
+          </w:tcPr>
+          <w:p>
+            <w:pPr>
+              <w:spacing w:before="20" w:after="20" w:line="264" w:lineRule="auto"/>
+            </w:pPr>
+            <w:r>
+              <w:rPr>
+                <w:rFonts w:ascii="Arial" w:hAnsi="Arial" w:eastAsia="Arial"/>
+                <w:b/>
+                <w:i w:val="0"/>
+                <w:color w:val="0A2F5C"/>
+                <w:sz w:val="17"/>
+              </w:rPr>
+              <w:t>Montos citados</w:t>
+            </w:r>
+          </w:p>
+        </w:tc>
+        <w:tc>
+          <w:tcPr>
+            <w:tcW w:type="dxa" w:w="7370"/>
+          </w:tcPr>
+          <w:p>
+            <w:pPr>
+              <w:spacing w:before="20" w:after="20" w:line="264" w:lineRule="auto"/>
+            </w:pPr>
+            <w:r>
+              <w:rPr>
+                <w:rFonts w:ascii="Arial" w:hAnsi="Arial" w:eastAsia="Arial"/>
+                <w:b w:val="0"/>
+                <w:i w:val="0"/>
+                <w:sz w:val="18"/>
+              </w:rPr>
+              <w:t>S/ 52 198 955,00 · S/ 21 853 366,00</w:t>
             </w:r>
           </w:p>
         </w:tc>
@@ -1472,7 +1981,7 @@
               </w:rPr>
               <w:t xml:space="preserve">   ·   </w:t>
             </w:r>
-            <w:hyperlink r:id="rId15">
+            <w:hyperlink r:id="rId20">
               <w:r>
                 <w:rPr>
                   <w:rFonts w:ascii="Arial" w:hAnsi="Arial" w:eastAsia="Arial" w:cs="Arial"/>
@@ -1493,7 +2002,2012 @@
               </w:rPr>
               <w:t xml:space="preserve">   ·   </w:t>
             </w:r>
+            <w:hyperlink r:id="rId21">
+              <w:r>
+                <w:rPr>
+                  <w:rFonts w:ascii="Arial" w:hAnsi="Arial" w:eastAsia="Arial" w:cs="Arial"/>
+                  <w:color w:val="0B5CAD"/>
+                  <w:sz w:val="17"/>
+                  <w:u w:val="single"/>
+                </w:rPr>
+                <w:t xml:space="preserve">PDF</w:t>
+              </w:r>
+            </w:hyperlink>
+          </w:p>
+        </w:tc>
+      </w:tr>
+    </w:tbl>
+    <w:p>
+      <w:pPr>
+        <w:spacing w:before="0" w:after="120" w:line="276" w:lineRule="auto"/>
+      </w:pPr>
+    </w:p>
+    <w:tbl>
+      <w:tblPr>
+        <w:tblW w:type="auto" w:w="0"/>
+        <w:tblLook w:firstColumn="1" w:firstRow="1" w:lastColumn="0" w:lastRow="0" w:noHBand="0" w:noVBand="1" w:val="04A0"/>
+        <w:tblBorders>
+          <w:top w:val="single" w:sz="4" w:space="0" w:color="C9D2DF"/>
+          <w:left w:val="single" w:sz="4" w:space="0" w:color="C9D2DF"/>
+          <w:bottom w:val="single" w:sz="4" w:space="0" w:color="C9D2DF"/>
+          <w:right w:val="single" w:sz="4" w:space="0" w:color="C9D2DF"/>
+          <w:insideH w:val="single" w:sz="4" w:space="0" w:color="C9D2DF"/>
+          <w:insideV w:val="single" w:sz="4" w:space="0" w:color="C9D2DF"/>
+        </w:tblBorders>
+        <w:tblLayout w:type="fixed"/>
+        <w:tblCellMar>
+          <w:top w:w="50" w:type="dxa"/>
+          <w:bottom w:w="50" w:type="dxa"/>
+          <w:left w:w="100" w:type="dxa"/>
+          <w:right w:w="100" w:type="dxa"/>
+        </w:tblCellMar>
+      </w:tblPr>
+      <w:tblGrid>
+        <w:gridCol w:w="4706"/>
+        <w:gridCol w:w="4706"/>
+      </w:tblGrid>
+      <w:tr>
+        <w:trPr>
+          <w:cantSplit/>
+        </w:trPr>
+        <w:tc>
+          <w:tcPr>
+            <w:tcW w:type="dxa" w:w="7370"/>
+            <w:gridSpan w:val="2"/>
+            <w:shd w:val="clear" w:color="auto" w:fill="E8F0FA"/>
+            <w:tcBorders>
+              <w:left w:val="single" w:sz="30" w:space="0" w:color="EB6834"/>
+            </w:tcBorders>
+          </w:tcPr>
+          <w:p>
+            <w:pPr>
+              <w:spacing w:before="20" w:after="20" w:line="264" w:lineRule="auto"/>
+            </w:pPr>
+            <w:r>
+              <w:rPr>
+                <w:rFonts w:ascii="Arial" w:hAnsi="Arial" w:eastAsia="Arial"/>
+                <w:b/>
+                <w:i w:val="0"/>
+                <w:color w:val="0A2F5C"/>
+                <w:sz w:val="19"/>
+              </w:rPr>
+              <w:t>3.  DECRETO SUPREMO  N° 229-2026-EF</w:t>
+            </w:r>
+          </w:p>
+        </w:tc>
+      </w:tr>
+      <w:tr>
+        <w:trPr>
+          <w:cantSplit/>
+        </w:trPr>
+        <w:tc>
+          <w:tcPr>
+            <w:tcW w:type="dxa" w:w="2041"/>
+            <w:shd w:val="clear" w:color="auto" w:fill="F2F5FA"/>
+          </w:tcPr>
+          <w:p>
+            <w:pPr>
+              <w:spacing w:before="20" w:after="20" w:line="264" w:lineRule="auto"/>
+            </w:pPr>
+            <w:r>
+              <w:rPr>
+                <w:rFonts w:ascii="Arial" w:hAnsi="Arial" w:eastAsia="Arial"/>
+                <w:b/>
+                <w:i w:val="0"/>
+                <w:color w:val="0A2F5C"/>
+                <w:sz w:val="17"/>
+              </w:rPr>
+              <w:t>Entidad emisora</w:t>
+            </w:r>
+          </w:p>
+        </w:tc>
+        <w:tc>
+          <w:tcPr>
+            <w:tcW w:type="dxa" w:w="7370"/>
+          </w:tcPr>
+          <w:p>
+            <w:pPr>
+              <w:spacing w:before="20" w:after="20" w:line="264" w:lineRule="auto"/>
+            </w:pPr>
+            <w:r>
+              <w:rPr>
+                <w:rFonts w:ascii="Arial" w:hAnsi="Arial" w:eastAsia="Arial"/>
+                <w:b w:val="0"/>
+                <w:i w:val="0"/>
+                <w:sz w:val="18"/>
+              </w:rPr>
+              <w:t>ECONOMÍA Y FINANZAS</w:t>
+            </w:r>
+          </w:p>
+        </w:tc>
+      </w:tr>
+      <w:tr>
+        <w:trPr>
+          <w:cantSplit/>
+        </w:trPr>
+        <w:tc>
+          <w:tcPr>
+            <w:tcW w:type="dxa" w:w="2041"/>
+            <w:shd w:val="clear" w:color="auto" w:fill="F2F5FA"/>
+          </w:tcPr>
+          <w:p>
+            <w:pPr>
+              <w:spacing w:before="20" w:after="20" w:line="264" w:lineRule="auto"/>
+            </w:pPr>
+            <w:r>
+              <w:rPr>
+                <w:rFonts w:ascii="Arial" w:hAnsi="Arial" w:eastAsia="Arial"/>
+                <w:b/>
+                <w:i w:val="0"/>
+                <w:color w:val="0A2F5C"/>
+                <w:sz w:val="17"/>
+              </w:rPr>
+              <w:t>Publicación</w:t>
+            </w:r>
+          </w:p>
+        </w:tc>
+        <w:tc>
+          <w:tcPr>
+            <w:tcW w:type="dxa" w:w="7370"/>
+          </w:tcPr>
+          <w:p>
+            <w:pPr>
+              <w:spacing w:before="20" w:after="20" w:line="264" w:lineRule="auto"/>
+            </w:pPr>
+            <w:r>
+              <w:rPr>
+                <w:rFonts w:ascii="Arial" w:hAnsi="Arial" w:eastAsia="Arial"/>
+                <w:b w:val="0"/>
+                <w:i w:val="0"/>
+                <w:sz w:val="18"/>
+              </w:rPr>
+              <w:t>30/10/2026 · Edición ordinaria</w:t>
+            </w:r>
+          </w:p>
+        </w:tc>
+      </w:tr>
+      <w:tr>
+        <w:trPr>
+          <w:cantSplit/>
+        </w:trPr>
+        <w:tc>
+          <w:tcPr>
+            <w:tcW w:type="dxa" w:w="2041"/>
+            <w:shd w:val="clear" w:color="auto" w:fill="F2F5FA"/>
+          </w:tcPr>
+          <w:p>
+            <w:pPr>
+              <w:spacing w:before="20" w:after="20" w:line="264" w:lineRule="auto"/>
+            </w:pPr>
+            <w:r>
+              <w:rPr>
+                <w:rFonts w:ascii="Arial" w:hAnsi="Arial" w:eastAsia="Arial"/>
+                <w:b/>
+                <w:i w:val="0"/>
+                <w:color w:val="0A2F5C"/>
+                <w:sz w:val="17"/>
+              </w:rPr>
+              <w:t>Temas</w:t>
+            </w:r>
+          </w:p>
+        </w:tc>
+        <w:tc>
+          <w:tcPr>
+            <w:tcW w:type="dxa" w:w="7370"/>
+          </w:tcPr>
+          <w:p>
+            <w:pPr>
+              <w:spacing w:before="20" w:after="20" w:line="264" w:lineRule="auto"/>
+            </w:pPr>
+            <w:r>
+              <w:rPr>
+                <w:rFonts w:ascii="Arial" w:hAnsi="Arial" w:eastAsia="Arial"/>
+                <w:b w:val="0"/>
+                <w:i w:val="0"/>
+                <w:sz w:val="18"/>
+              </w:rPr>
+              <w:t>Normatividad presupuestal</w:t>
+            </w:r>
+          </w:p>
+        </w:tc>
+      </w:tr>
+      <w:tr>
+        <w:trPr>
+          <w:cantSplit/>
+        </w:trPr>
+        <w:tc>
+          <w:tcPr>
+            <w:tcW w:type="dxa" w:w="2041"/>
+            <w:shd w:val="clear" w:color="auto" w:fill="F2F5FA"/>
+          </w:tcPr>
+          <w:p>
+            <w:pPr>
+              <w:spacing w:before="20" w:after="20" w:line="264" w:lineRule="auto"/>
+            </w:pPr>
+            <w:r>
+              <w:rPr>
+                <w:rFonts w:ascii="Arial" w:hAnsi="Arial" w:eastAsia="Arial"/>
+                <w:b/>
+                <w:i w:val="0"/>
+                <w:color w:val="0A2F5C"/>
+                <w:sz w:val="17"/>
+              </w:rPr>
+              <w:t>Sumilla</w:t>
+            </w:r>
+          </w:p>
+        </w:tc>
+        <w:tc>
+          <w:tcPr>
+            <w:tcW w:type="dxa" w:w="7370"/>
+          </w:tcPr>
+          <w:p>
+            <w:pPr>
+              <w:spacing w:before="20" w:after="20" w:line="264" w:lineRule="auto"/>
+            </w:pPr>
+            <w:r>
+              <w:rPr>
+                <w:rFonts w:ascii="Arial" w:hAnsi="Arial" w:eastAsia="Arial"/>
+                <w:b w:val="0"/>
+                <w:i w:val="0"/>
+                <w:sz w:val="18"/>
+              </w:rPr>
+              <w:t>Decreto Supremo que autoriza Transferencia de Partidas en el Presupuesto del Sector Público para el Año Fiscal 2026 a favor del Centro Nacional de Planeamiento Estratégico</w:t>
+            </w:r>
+          </w:p>
+        </w:tc>
+      </w:tr>
+      <w:tr>
+        <w:trPr>
+          <w:cantSplit/>
+        </w:trPr>
+        <w:tc>
+          <w:tcPr>
+            <w:tcW w:type="dxa" w:w="2041"/>
+            <w:shd w:val="clear" w:color="auto" w:fill="F2F5FA"/>
+          </w:tcPr>
+          <w:p>
+            <w:pPr>
+              <w:spacing w:before="20" w:after="20" w:line="264" w:lineRule="auto"/>
+            </w:pPr>
+            <w:r>
+              <w:rPr>
+                <w:rFonts w:ascii="Arial" w:hAnsi="Arial" w:eastAsia="Arial"/>
+                <w:b/>
+                <w:i w:val="0"/>
+                <w:color w:val="0A2F5C"/>
+                <w:sz w:val="17"/>
+              </w:rPr>
+              <w:t>Disposición principal</w:t>
+            </w:r>
+          </w:p>
+        </w:tc>
+        <w:tc>
+          <w:tcPr>
+            <w:tcW w:type="dxa" w:w="7370"/>
+          </w:tcPr>
+          <w:p>
+            <w:pPr>
+              <w:spacing w:before="20" w:after="20" w:line="264" w:lineRule="auto"/>
+            </w:pPr>
+            <w:r>
+              <w:rPr>
+                <w:rFonts w:ascii="Arial" w:hAnsi="Arial" w:eastAsia="Arial"/>
+                <w:b w:val="0"/>
+                <w:i w:val="0"/>
+                <w:sz w:val="18"/>
+              </w:rPr>
+              <w:t>Artículo 1.- Objeto Se autoriza una Transferencia de Partidas en el Presupuesto del Sector Público para el Año Fiscal 2026, hasta por la suma de S/ 1 295 188,00 (UN MILLÓN DOSCIENTOS NOVENTA Y CINCO MIL CIENTO OCHENTA Y OCHO Y 00/100 SOLES), por la fuente de financiamiento Recursos por Operaciones Oficiales de Crédito, a favor del Centro Nacional de Planeamiento Estratégico, para financiar la ejecución del proyecto de inversión “Mejoramiento y Ampliación de los Servicios Operativos o Misionales Institucionales en Centro Nacional de Planeamiento Estratégico Distrito de San Isidro de la Provincia de Lima del Departamento de Lima”, con Código Único de Inversiones (CUI) Nº 2690555, vinculado a…</w:t>
+            </w:r>
+          </w:p>
+        </w:tc>
+      </w:tr>
+      <w:tr>
+        <w:trPr>
+          <w:cantSplit/>
+        </w:trPr>
+        <w:tc>
+          <w:tcPr>
+            <w:tcW w:type="dxa" w:w="2041"/>
+            <w:shd w:val="clear" w:color="auto" w:fill="F2F5FA"/>
+          </w:tcPr>
+          <w:p>
+            <w:pPr>
+              <w:spacing w:before="20" w:after="20" w:line="264" w:lineRule="auto"/>
+            </w:pPr>
+            <w:r>
+              <w:rPr>
+                <w:rFonts w:ascii="Arial" w:hAnsi="Arial" w:eastAsia="Arial"/>
+                <w:b/>
+                <w:i w:val="0"/>
+                <w:color w:val="0A2F5C"/>
+                <w:sz w:val="17"/>
+              </w:rPr>
+              <w:t>Montos citados</w:t>
+            </w:r>
+          </w:p>
+        </w:tc>
+        <w:tc>
+          <w:tcPr>
+            <w:tcW w:type="dxa" w:w="7370"/>
+          </w:tcPr>
+          <w:p>
+            <w:pPr>
+              <w:spacing w:before="20" w:after="20" w:line="264" w:lineRule="auto"/>
+            </w:pPr>
+            <w:r>
+              <w:rPr>
+                <w:rFonts w:ascii="Arial" w:hAnsi="Arial" w:eastAsia="Arial"/>
+                <w:b w:val="0"/>
+                <w:i w:val="0"/>
+                <w:sz w:val="18"/>
+              </w:rPr>
+              <w:t>S/ 1 295 188,00</w:t>
+            </w:r>
+          </w:p>
+        </w:tc>
+      </w:tr>
+      <w:tr>
+        <w:trPr>
+          <w:cantSplit/>
+        </w:trPr>
+        <w:tc>
+          <w:tcPr>
+            <w:tcW w:type="dxa" w:w="2041"/>
+            <w:shd w:val="clear" w:color="auto" w:fill="F2F5FA"/>
+          </w:tcPr>
+          <w:p>
+            <w:pPr>
+              <w:spacing w:before="20" w:after="20" w:line="264" w:lineRule="auto"/>
+            </w:pPr>
+            <w:r>
+              <w:rPr>
+                <w:rFonts w:ascii="Arial" w:hAnsi="Arial" w:eastAsia="Arial"/>
+                <w:b/>
+                <w:i w:val="0"/>
+                <w:color w:val="0A2F5C"/>
+                <w:sz w:val="17"/>
+              </w:rPr>
+              <w:t>Enlaces</w:t>
+            </w:r>
+          </w:p>
+        </w:tc>
+        <w:tc>
+          <w:tcPr>
+            <w:tcW w:type="dxa" w:w="7370"/>
+          </w:tcPr>
+          <w:p>
+            <w:pPr>
+              <w:spacing w:before="20" w:after="20" w:line="264" w:lineRule="auto"/>
+            </w:pPr>
+            <w:hyperlink r:id="rId13">
+              <w:r>
+                <w:rPr>
+                  <w:rFonts w:ascii="Arial" w:hAnsi="Arial" w:eastAsia="Arial" w:cs="Arial"/>
+                  <w:color w:val="0B5CAD"/>
+                  <w:sz w:val="17"/>
+                  <w:u w:val="single"/>
+                </w:rPr>
+                <w:t xml:space="preserve">Texto completo</w:t>
+              </w:r>
+            </w:hyperlink>
+            <w:r>
+              <w:rPr>
+                <w:rFonts w:ascii="Arial" w:hAnsi="Arial" w:eastAsia="Arial"/>
+                <w:b w:val="0"/>
+                <w:i w:val="0"/>
+                <w:color w:val="5B6880"/>
+                <w:sz w:val="17"/>
+              </w:rPr>
+              <w:t xml:space="preserve">   ·   </w:t>
+            </w:r>
+            <w:hyperlink r:id="rId22">
+              <w:r>
+                <w:rPr>
+                  <w:rFonts w:ascii="Arial" w:hAnsi="Arial" w:eastAsia="Arial" w:cs="Arial"/>
+                  <w:color w:val="0B5CAD"/>
+                  <w:sz w:val="17"/>
+                  <w:u w:val="single"/>
+                </w:rPr>
+                <w:t xml:space="preserve">El Peruano</w:t>
+              </w:r>
+            </w:hyperlink>
+            <w:r>
+              <w:rPr>
+                <w:rFonts w:ascii="Arial" w:hAnsi="Arial" w:eastAsia="Arial"/>
+                <w:b w:val="0"/>
+                <w:i w:val="0"/>
+                <w:color w:val="5B6880"/>
+                <w:sz w:val="17"/>
+              </w:rPr>
+              <w:t xml:space="preserve">   ·   </w:t>
+            </w:r>
+            <w:hyperlink r:id="rId23">
+              <w:r>
+                <w:rPr>
+                  <w:rFonts w:ascii="Arial" w:hAnsi="Arial" w:eastAsia="Arial" w:cs="Arial"/>
+                  <w:color w:val="0B5CAD"/>
+                  <w:sz w:val="17"/>
+                  <w:u w:val="single"/>
+                </w:rPr>
+                <w:t xml:space="preserve">PDF</w:t>
+              </w:r>
+            </w:hyperlink>
+          </w:p>
+        </w:tc>
+      </w:tr>
+    </w:tbl>
+    <w:p>
+      <w:pPr>
+        <w:spacing w:before="0" w:after="120" w:line="276" w:lineRule="auto"/>
+      </w:pPr>
+    </w:p>
+    <w:tbl>
+      <w:tblPr>
+        <w:tblW w:type="auto" w:w="0"/>
+        <w:tblLook w:firstColumn="1" w:firstRow="1" w:lastColumn="0" w:lastRow="0" w:noHBand="0" w:noVBand="1" w:val="04A0"/>
+        <w:tblBorders>
+          <w:top w:val="single" w:sz="4" w:space="0" w:color="C9D2DF"/>
+          <w:left w:val="single" w:sz="4" w:space="0" w:color="C9D2DF"/>
+          <w:bottom w:val="single" w:sz="4" w:space="0" w:color="C9D2DF"/>
+          <w:right w:val="single" w:sz="4" w:space="0" w:color="C9D2DF"/>
+          <w:insideH w:val="single" w:sz="4" w:space="0" w:color="C9D2DF"/>
+          <w:insideV w:val="single" w:sz="4" w:space="0" w:color="C9D2DF"/>
+        </w:tblBorders>
+        <w:tblLayout w:type="fixed"/>
+        <w:tblCellMar>
+          <w:top w:w="50" w:type="dxa"/>
+          <w:bottom w:w="50" w:type="dxa"/>
+          <w:left w:w="100" w:type="dxa"/>
+          <w:right w:w="100" w:type="dxa"/>
+        </w:tblCellMar>
+      </w:tblPr>
+      <w:tblGrid>
+        <w:gridCol w:w="4706"/>
+        <w:gridCol w:w="4706"/>
+      </w:tblGrid>
+      <w:tr>
+        <w:trPr>
+          <w:cantSplit/>
+        </w:trPr>
+        <w:tc>
+          <w:tcPr>
+            <w:tcW w:type="dxa" w:w="7370"/>
+            <w:gridSpan w:val="2"/>
+            <w:shd w:val="clear" w:color="auto" w:fill="E8F0FA"/>
+            <w:tcBorders>
+              <w:left w:val="single" w:sz="30" w:space="0" w:color="EB6834"/>
+            </w:tcBorders>
+          </w:tcPr>
+          <w:p>
+            <w:pPr>
+              <w:spacing w:before="20" w:after="20" w:line="264" w:lineRule="auto"/>
+            </w:pPr>
+            <w:r>
+              <w:rPr>
+                <w:rFonts w:ascii="Arial" w:hAnsi="Arial" w:eastAsia="Arial"/>
+                <w:b/>
+                <w:i w:val="0"/>
+                <w:color w:val="0A2F5C"/>
+                <w:sz w:val="19"/>
+              </w:rPr>
+              <w:t>4.  RESOLUCIÓN  N° 535-2026-GOB</w:t>
+            </w:r>
+          </w:p>
+        </w:tc>
+      </w:tr>
+      <w:tr>
+        <w:trPr>
+          <w:cantSplit/>
+        </w:trPr>
+        <w:tc>
+          <w:tcPr>
+            <w:tcW w:type="dxa" w:w="2041"/>
+            <w:shd w:val="clear" w:color="auto" w:fill="F2F5FA"/>
+          </w:tcPr>
+          <w:p>
+            <w:pPr>
+              <w:spacing w:before="20" w:after="20" w:line="264" w:lineRule="auto"/>
+            </w:pPr>
+            <w:r>
+              <w:rPr>
+                <w:rFonts w:ascii="Arial" w:hAnsi="Arial" w:eastAsia="Arial"/>
+                <w:b/>
+                <w:i w:val="0"/>
+                <w:color w:val="0A2F5C"/>
+                <w:sz w:val="17"/>
+              </w:rPr>
+              <w:t>Entidad emisora</w:t>
+            </w:r>
+          </w:p>
+        </w:tc>
+        <w:tc>
+          <w:tcPr>
+            <w:tcW w:type="dxa" w:w="7370"/>
+          </w:tcPr>
+          <w:p>
+            <w:pPr>
+              <w:spacing w:before="20" w:after="20" w:line="264" w:lineRule="auto"/>
+            </w:pPr>
+            <w:r>
+              <w:rPr>
+                <w:rFonts w:ascii="Arial" w:hAnsi="Arial" w:eastAsia="Arial"/>
+                <w:b w:val="0"/>
+                <w:i w:val="0"/>
+                <w:sz w:val="18"/>
+              </w:rPr>
+              <w:t>GOBIERNO REGIONAL DE LIMA</w:t>
+            </w:r>
+          </w:p>
+        </w:tc>
+      </w:tr>
+      <w:tr>
+        <w:trPr>
+          <w:cantSplit/>
+        </w:trPr>
+        <w:tc>
+          <w:tcPr>
+            <w:tcW w:type="dxa" w:w="2041"/>
+            <w:shd w:val="clear" w:color="auto" w:fill="F2F5FA"/>
+          </w:tcPr>
+          <w:p>
+            <w:pPr>
+              <w:spacing w:before="20" w:after="20" w:line="264" w:lineRule="auto"/>
+            </w:pPr>
+            <w:r>
+              <w:rPr>
+                <w:rFonts w:ascii="Arial" w:hAnsi="Arial" w:eastAsia="Arial"/>
+                <w:b/>
+                <w:i w:val="0"/>
+                <w:color w:val="0A2F5C"/>
+                <w:sz w:val="17"/>
+              </w:rPr>
+              <w:t>Publicación</w:t>
+            </w:r>
+          </w:p>
+        </w:tc>
+        <w:tc>
+          <w:tcPr>
+            <w:tcW w:type="dxa" w:w="7370"/>
+          </w:tcPr>
+          <w:p>
+            <w:pPr>
+              <w:spacing w:before="20" w:after="20" w:line="264" w:lineRule="auto"/>
+            </w:pPr>
+            <w:r>
+              <w:rPr>
+                <w:rFonts w:ascii="Arial" w:hAnsi="Arial" w:eastAsia="Arial"/>
+                <w:b w:val="0"/>
+                <w:i w:val="0"/>
+                <w:sz w:val="18"/>
+              </w:rPr>
+              <w:t>30/10/2026 · Edición ordinaria</w:t>
+            </w:r>
+          </w:p>
+        </w:tc>
+      </w:tr>
+      <w:tr>
+        <w:trPr>
+          <w:cantSplit/>
+        </w:trPr>
+        <w:tc>
+          <w:tcPr>
+            <w:tcW w:type="dxa" w:w="2041"/>
+            <w:shd w:val="clear" w:color="auto" w:fill="F2F5FA"/>
+          </w:tcPr>
+          <w:p>
+            <w:pPr>
+              <w:spacing w:before="20" w:after="20" w:line="264" w:lineRule="auto"/>
+            </w:pPr>
+            <w:r>
+              <w:rPr>
+                <w:rFonts w:ascii="Arial" w:hAnsi="Arial" w:eastAsia="Arial"/>
+                <w:b/>
+                <w:i w:val="0"/>
+                <w:color w:val="0A2F5C"/>
+                <w:sz w:val="17"/>
+              </w:rPr>
+              <w:t>Temas</w:t>
+            </w:r>
+          </w:p>
+        </w:tc>
+        <w:tc>
+          <w:tcPr>
+            <w:tcW w:type="dxa" w:w="7370"/>
+          </w:tcPr>
+          <w:p>
+            <w:pPr>
+              <w:spacing w:before="20" w:after="20" w:line="264" w:lineRule="auto"/>
+            </w:pPr>
+            <w:r>
+              <w:rPr>
+                <w:rFonts w:ascii="Arial" w:hAnsi="Arial" w:eastAsia="Arial"/>
+                <w:b w:val="0"/>
+                <w:i w:val="0"/>
+                <w:sz w:val="18"/>
+              </w:rPr>
+              <w:t>Normatividad presupuestal</w:t>
+            </w:r>
+          </w:p>
+        </w:tc>
+      </w:tr>
+      <w:tr>
+        <w:trPr>
+          <w:cantSplit/>
+        </w:trPr>
+        <w:tc>
+          <w:tcPr>
+            <w:tcW w:type="dxa" w:w="2041"/>
+            <w:shd w:val="clear" w:color="auto" w:fill="F2F5FA"/>
+          </w:tcPr>
+          <w:p>
+            <w:pPr>
+              <w:spacing w:before="20" w:after="20" w:line="264" w:lineRule="auto"/>
+            </w:pPr>
+            <w:r>
+              <w:rPr>
+                <w:rFonts w:ascii="Arial" w:hAnsi="Arial" w:eastAsia="Arial"/>
+                <w:b/>
+                <w:i w:val="0"/>
+                <w:color w:val="0A2F5C"/>
+                <w:sz w:val="17"/>
+              </w:rPr>
+              <w:t>Sumilla</w:t>
+            </w:r>
+          </w:p>
+        </w:tc>
+        <w:tc>
+          <w:tcPr>
+            <w:tcW w:type="dxa" w:w="7370"/>
+          </w:tcPr>
+          <w:p>
+            <w:pPr>
+              <w:spacing w:before="20" w:after="20" w:line="264" w:lineRule="auto"/>
+            </w:pPr>
+            <w:r>
+              <w:rPr>
+                <w:rFonts w:ascii="Arial" w:hAnsi="Arial" w:eastAsia="Arial"/>
+                <w:b w:val="0"/>
+                <w:i w:val="0"/>
+                <w:sz w:val="18"/>
+              </w:rPr>
+              <w:t>Aprueban transferencia financiera a favor de la Contraloría General de la República</w:t>
+            </w:r>
+          </w:p>
+        </w:tc>
+      </w:tr>
+      <w:tr>
+        <w:trPr>
+          <w:cantSplit/>
+        </w:trPr>
+        <w:tc>
+          <w:tcPr>
+            <w:tcW w:type="dxa" w:w="2041"/>
+            <w:shd w:val="clear" w:color="auto" w:fill="F2F5FA"/>
+          </w:tcPr>
+          <w:p>
+            <w:pPr>
+              <w:spacing w:before="20" w:after="20" w:line="264" w:lineRule="auto"/>
+            </w:pPr>
+            <w:r>
+              <w:rPr>
+                <w:rFonts w:ascii="Arial" w:hAnsi="Arial" w:eastAsia="Arial"/>
+                <w:b/>
+                <w:i w:val="0"/>
+                <w:color w:val="0A2F5C"/>
+                <w:sz w:val="17"/>
+              </w:rPr>
+              <w:t>Disposición principal</w:t>
+            </w:r>
+          </w:p>
+        </w:tc>
+        <w:tc>
+          <w:tcPr>
+            <w:tcW w:type="dxa" w:w="7370"/>
+          </w:tcPr>
+          <w:p>
+            <w:pPr>
+              <w:spacing w:before="20" w:after="20" w:line="264" w:lineRule="auto"/>
+            </w:pPr>
+            <w:r>
+              <w:rPr>
+                <w:rFonts w:ascii="Arial" w:hAnsi="Arial" w:eastAsia="Arial"/>
+                <w:b w:val="0"/>
+                <w:i w:val="0"/>
+                <w:sz w:val="18"/>
+              </w:rPr>
+              <w:t>Artículo Primero.- APROBAR la Transferencia Financiera por el monto total de S/ 311 120,00 (Trescientos once mil ciento veinte y 00/100 soles), con cargo a los recursos del Pliego 463: Gobierno Regional del Departamento de Lima, a favor del Pliego 019: Contraloría General, Unidad Ejecutora 001-196: Contraloría General de la República, destinada al financiamiento de las acciones de control concurrente correspondientes a nueve (09) proyectos de inversión priorizados por la Contraloría General de la República, en el marco de la Ley N° 31358, Ley que establece medidas para la expansión del control concurrente, y sus modificatorias, conforme al detalle de los proyectos consignados en el Anexo N°…</w:t>
+            </w:r>
+          </w:p>
+        </w:tc>
+      </w:tr>
+      <w:tr>
+        <w:trPr>
+          <w:cantSplit/>
+        </w:trPr>
+        <w:tc>
+          <w:tcPr>
+            <w:tcW w:type="dxa" w:w="2041"/>
+            <w:shd w:val="clear" w:color="auto" w:fill="F2F5FA"/>
+          </w:tcPr>
+          <w:p>
+            <w:pPr>
+              <w:spacing w:before="20" w:after="20" w:line="264" w:lineRule="auto"/>
+            </w:pPr>
+            <w:r>
+              <w:rPr>
+                <w:rFonts w:ascii="Arial" w:hAnsi="Arial" w:eastAsia="Arial"/>
+                <w:b/>
+                <w:i w:val="0"/>
+                <w:color w:val="0A2F5C"/>
+                <w:sz w:val="17"/>
+              </w:rPr>
+              <w:t>Montos citados</w:t>
+            </w:r>
+          </w:p>
+        </w:tc>
+        <w:tc>
+          <w:tcPr>
+            <w:tcW w:type="dxa" w:w="7370"/>
+          </w:tcPr>
+          <w:p>
+            <w:pPr>
+              <w:spacing w:before="20" w:after="20" w:line="264" w:lineRule="auto"/>
+            </w:pPr>
+            <w:r>
+              <w:rPr>
+                <w:rFonts w:ascii="Arial" w:hAnsi="Arial" w:eastAsia="Arial"/>
+                <w:b w:val="0"/>
+                <w:i w:val="0"/>
+                <w:sz w:val="18"/>
+              </w:rPr>
+              <w:t>S/ 311,120.00 · S/ 201 715,00 · S/ 109 405,00</w:t>
+            </w:r>
+          </w:p>
+        </w:tc>
+      </w:tr>
+      <w:tr>
+        <w:trPr>
+          <w:cantSplit/>
+        </w:trPr>
+        <w:tc>
+          <w:tcPr>
+            <w:tcW w:type="dxa" w:w="2041"/>
+            <w:shd w:val="clear" w:color="auto" w:fill="F2F5FA"/>
+          </w:tcPr>
+          <w:p>
+            <w:pPr>
+              <w:spacing w:before="20" w:after="20" w:line="264" w:lineRule="auto"/>
+            </w:pPr>
+            <w:r>
+              <w:rPr>
+                <w:rFonts w:ascii="Arial" w:hAnsi="Arial" w:eastAsia="Arial"/>
+                <w:b/>
+                <w:i w:val="0"/>
+                <w:color w:val="0A2F5C"/>
+                <w:sz w:val="17"/>
+              </w:rPr>
+              <w:t>Enlaces</w:t>
+            </w:r>
+          </w:p>
+        </w:tc>
+        <w:tc>
+          <w:tcPr>
+            <w:tcW w:type="dxa" w:w="7370"/>
+          </w:tcPr>
+          <w:p>
+            <w:pPr>
+              <w:spacing w:before="20" w:after="20" w:line="264" w:lineRule="auto"/>
+            </w:pPr>
+            <w:hyperlink r:id="rId14">
+              <w:r>
+                <w:rPr>
+                  <w:rFonts w:ascii="Arial" w:hAnsi="Arial" w:eastAsia="Arial" w:cs="Arial"/>
+                  <w:color w:val="0B5CAD"/>
+                  <w:sz w:val="17"/>
+                  <w:u w:val="single"/>
+                </w:rPr>
+                <w:t xml:space="preserve">Texto completo</w:t>
+              </w:r>
+            </w:hyperlink>
+            <w:r>
+              <w:rPr>
+                <w:rFonts w:ascii="Arial" w:hAnsi="Arial" w:eastAsia="Arial"/>
+                <w:b w:val="0"/>
+                <w:i w:val="0"/>
+                <w:color w:val="5B6880"/>
+                <w:sz w:val="17"/>
+              </w:rPr>
+              <w:t xml:space="preserve">   ·   </w:t>
+            </w:r>
+            <w:hyperlink r:id="rId24">
+              <w:r>
+                <w:rPr>
+                  <w:rFonts w:ascii="Arial" w:hAnsi="Arial" w:eastAsia="Arial" w:cs="Arial"/>
+                  <w:color w:val="0B5CAD"/>
+                  <w:sz w:val="17"/>
+                  <w:u w:val="single"/>
+                </w:rPr>
+                <w:t xml:space="preserve">El Peruano</w:t>
+              </w:r>
+            </w:hyperlink>
+            <w:r>
+              <w:rPr>
+                <w:rFonts w:ascii="Arial" w:hAnsi="Arial" w:eastAsia="Arial"/>
+                <w:b w:val="0"/>
+                <w:i w:val="0"/>
+                <w:color w:val="5B6880"/>
+                <w:sz w:val="17"/>
+              </w:rPr>
+              <w:t xml:space="preserve">   ·   </w:t>
+            </w:r>
+            <w:hyperlink r:id="rId25">
+              <w:r>
+                <w:rPr>
+                  <w:rFonts w:ascii="Arial" w:hAnsi="Arial" w:eastAsia="Arial" w:cs="Arial"/>
+                  <w:color w:val="0B5CAD"/>
+                  <w:sz w:val="17"/>
+                  <w:u w:val="single"/>
+                </w:rPr>
+                <w:t xml:space="preserve">PDF</w:t>
+              </w:r>
+            </w:hyperlink>
+          </w:p>
+        </w:tc>
+      </w:tr>
+    </w:tbl>
+    <w:p>
+      <w:pPr>
+        <w:spacing w:before="0" w:after="120" w:line="276" w:lineRule="auto"/>
+      </w:pPr>
+    </w:p>
+    <w:tbl>
+      <w:tblPr>
+        <w:tblW w:type="auto" w:w="0"/>
+        <w:tblLook w:firstColumn="1" w:firstRow="1" w:lastColumn="0" w:lastRow="0" w:noHBand="0" w:noVBand="1" w:val="04A0"/>
+        <w:tblBorders>
+          <w:top w:val="single" w:sz="4" w:space="0" w:color="C9D2DF"/>
+          <w:left w:val="single" w:sz="4" w:space="0" w:color="C9D2DF"/>
+          <w:bottom w:val="single" w:sz="4" w:space="0" w:color="C9D2DF"/>
+          <w:right w:val="single" w:sz="4" w:space="0" w:color="C9D2DF"/>
+          <w:insideH w:val="single" w:sz="4" w:space="0" w:color="C9D2DF"/>
+          <w:insideV w:val="single" w:sz="4" w:space="0" w:color="C9D2DF"/>
+        </w:tblBorders>
+        <w:tblLayout w:type="fixed"/>
+        <w:tblCellMar>
+          <w:top w:w="50" w:type="dxa"/>
+          <w:bottom w:w="50" w:type="dxa"/>
+          <w:left w:w="100" w:type="dxa"/>
+          <w:right w:w="100" w:type="dxa"/>
+        </w:tblCellMar>
+      </w:tblPr>
+      <w:tblGrid>
+        <w:gridCol w:w="4706"/>
+        <w:gridCol w:w="4706"/>
+      </w:tblGrid>
+      <w:tr>
+        <w:trPr>
+          <w:cantSplit/>
+        </w:trPr>
+        <w:tc>
+          <w:tcPr>
+            <w:tcW w:type="dxa" w:w="7370"/>
+            <w:gridSpan w:val="2"/>
+            <w:shd w:val="clear" w:color="auto" w:fill="E8F0FA"/>
+            <w:tcBorders>
+              <w:left w:val="single" w:sz="30" w:space="0" w:color="EB6834"/>
+            </w:tcBorders>
+          </w:tcPr>
+          <w:p>
+            <w:pPr>
+              <w:spacing w:before="20" w:after="20" w:line="264" w:lineRule="auto"/>
+            </w:pPr>
+            <w:r>
+              <w:rPr>
+                <w:rFonts w:ascii="Arial" w:hAnsi="Arial" w:eastAsia="Arial"/>
+                <w:b/>
+                <w:i w:val="0"/>
+                <w:color w:val="0A2F5C"/>
+                <w:sz w:val="19"/>
+              </w:rPr>
+              <w:t>5.  RESOLUCIÓN  N° 000053-2026-ITP/GG</w:t>
+            </w:r>
+          </w:p>
+        </w:tc>
+      </w:tr>
+      <w:tr>
+        <w:trPr>
+          <w:cantSplit/>
+        </w:trPr>
+        <w:tc>
+          <w:tcPr>
+            <w:tcW w:type="dxa" w:w="2041"/>
+            <w:shd w:val="clear" w:color="auto" w:fill="F2F5FA"/>
+          </w:tcPr>
+          <w:p>
+            <w:pPr>
+              <w:spacing w:before="20" w:after="20" w:line="264" w:lineRule="auto"/>
+            </w:pPr>
+            <w:r>
+              <w:rPr>
+                <w:rFonts w:ascii="Arial" w:hAnsi="Arial" w:eastAsia="Arial"/>
+                <w:b/>
+                <w:i w:val="0"/>
+                <w:color w:val="0A2F5C"/>
+                <w:sz w:val="17"/>
+              </w:rPr>
+              <w:t>Entidad emisora</w:t>
+            </w:r>
+          </w:p>
+        </w:tc>
+        <w:tc>
+          <w:tcPr>
+            <w:tcW w:type="dxa" w:w="7370"/>
+          </w:tcPr>
+          <w:p>
+            <w:pPr>
+              <w:spacing w:before="20" w:after="20" w:line="264" w:lineRule="auto"/>
+            </w:pPr>
+            <w:r>
+              <w:rPr>
+                <w:rFonts w:ascii="Arial" w:hAnsi="Arial" w:eastAsia="Arial"/>
+                <w:b w:val="0"/>
+                <w:i w:val="0"/>
+                <w:sz w:val="18"/>
+              </w:rPr>
+              <w:t>INSTITUTO TECNOLÓGICO DE LA PRODUCCIÓN</w:t>
+            </w:r>
+          </w:p>
+        </w:tc>
+      </w:tr>
+      <w:tr>
+        <w:trPr>
+          <w:cantSplit/>
+        </w:trPr>
+        <w:tc>
+          <w:tcPr>
+            <w:tcW w:type="dxa" w:w="2041"/>
+            <w:shd w:val="clear" w:color="auto" w:fill="F2F5FA"/>
+          </w:tcPr>
+          <w:p>
+            <w:pPr>
+              <w:spacing w:before="20" w:after="20" w:line="264" w:lineRule="auto"/>
+            </w:pPr>
+            <w:r>
+              <w:rPr>
+                <w:rFonts w:ascii="Arial" w:hAnsi="Arial" w:eastAsia="Arial"/>
+                <w:b/>
+                <w:i w:val="0"/>
+                <w:color w:val="0A2F5C"/>
+                <w:sz w:val="17"/>
+              </w:rPr>
+              <w:t>Publicación</w:t>
+            </w:r>
+          </w:p>
+        </w:tc>
+        <w:tc>
+          <w:tcPr>
+            <w:tcW w:type="dxa" w:w="7370"/>
+          </w:tcPr>
+          <w:p>
+            <w:pPr>
+              <w:spacing w:before="20" w:after="20" w:line="264" w:lineRule="auto"/>
+            </w:pPr>
+            <w:r>
+              <w:rPr>
+                <w:rFonts w:ascii="Arial" w:hAnsi="Arial" w:eastAsia="Arial"/>
+                <w:b w:val="0"/>
+                <w:i w:val="0"/>
+                <w:sz w:val="18"/>
+              </w:rPr>
+              <w:t>30/10/2026 · Edición ordinaria</w:t>
+            </w:r>
+          </w:p>
+        </w:tc>
+      </w:tr>
+      <w:tr>
+        <w:trPr>
+          <w:cantSplit/>
+        </w:trPr>
+        <w:tc>
+          <w:tcPr>
+            <w:tcW w:type="dxa" w:w="2041"/>
+            <w:shd w:val="clear" w:color="auto" w:fill="F2F5FA"/>
+          </w:tcPr>
+          <w:p>
+            <w:pPr>
+              <w:spacing w:before="20" w:after="20" w:line="264" w:lineRule="auto"/>
+            </w:pPr>
+            <w:r>
+              <w:rPr>
+                <w:rFonts w:ascii="Arial" w:hAnsi="Arial" w:eastAsia="Arial"/>
+                <w:b/>
+                <w:i w:val="0"/>
+                <w:color w:val="0A2F5C"/>
+                <w:sz w:val="17"/>
+              </w:rPr>
+              <w:t>Temas</w:t>
+            </w:r>
+          </w:p>
+        </w:tc>
+        <w:tc>
+          <w:tcPr>
+            <w:tcW w:type="dxa" w:w="7370"/>
+          </w:tcPr>
+          <w:p>
+            <w:pPr>
+              <w:spacing w:before="20" w:after="20" w:line="264" w:lineRule="auto"/>
+            </w:pPr>
+            <w:r>
+              <w:rPr>
+                <w:rFonts w:ascii="Arial" w:hAnsi="Arial" w:eastAsia="Arial"/>
+                <w:b w:val="0"/>
+                <w:i w:val="0"/>
+                <w:sz w:val="18"/>
+              </w:rPr>
+              <w:t>Normatividad presupuestal</w:t>
+            </w:r>
+          </w:p>
+        </w:tc>
+      </w:tr>
+      <w:tr>
+        <w:trPr>
+          <w:cantSplit/>
+        </w:trPr>
+        <w:tc>
+          <w:tcPr>
+            <w:tcW w:type="dxa" w:w="2041"/>
+            <w:shd w:val="clear" w:color="auto" w:fill="F2F5FA"/>
+          </w:tcPr>
+          <w:p>
+            <w:pPr>
+              <w:spacing w:before="20" w:after="20" w:line="264" w:lineRule="auto"/>
+            </w:pPr>
+            <w:r>
+              <w:rPr>
+                <w:rFonts w:ascii="Arial" w:hAnsi="Arial" w:eastAsia="Arial"/>
+                <w:b/>
+                <w:i w:val="0"/>
+                <w:color w:val="0A2F5C"/>
+                <w:sz w:val="17"/>
+              </w:rPr>
+              <w:t>Sumilla</w:t>
+            </w:r>
+          </w:p>
+        </w:tc>
+        <w:tc>
+          <w:tcPr>
+            <w:tcW w:type="dxa" w:w="7370"/>
+          </w:tcPr>
+          <w:p>
+            <w:pPr>
+              <w:spacing w:before="20" w:after="20" w:line="264" w:lineRule="auto"/>
+            </w:pPr>
+            <w:r>
+              <w:rPr>
+                <w:rFonts w:ascii="Arial" w:hAnsi="Arial" w:eastAsia="Arial"/>
+                <w:b w:val="0"/>
+                <w:i w:val="0"/>
+                <w:sz w:val="18"/>
+              </w:rPr>
+              <w:t>Delegar en el/la Jefe/a de la Oficina de Planeamiento Presupuesto y Modernización del ITP la facultad de asegurar la implementación y cumplimiento de la Norma Técnica para la Gestión de la Calidad de Servicios del Sector Público</w:t>
+            </w:r>
+          </w:p>
+        </w:tc>
+      </w:tr>
+      <w:tr>
+        <w:trPr>
+          <w:cantSplit/>
+        </w:trPr>
+        <w:tc>
+          <w:tcPr>
+            <w:tcW w:type="dxa" w:w="2041"/>
+            <w:shd w:val="clear" w:color="auto" w:fill="F2F5FA"/>
+          </w:tcPr>
+          <w:p>
+            <w:pPr>
+              <w:spacing w:before="20" w:after="20" w:line="264" w:lineRule="auto"/>
+            </w:pPr>
+            <w:r>
+              <w:rPr>
+                <w:rFonts w:ascii="Arial" w:hAnsi="Arial" w:eastAsia="Arial"/>
+                <w:b/>
+                <w:i w:val="0"/>
+                <w:color w:val="0A2F5C"/>
+                <w:sz w:val="17"/>
+              </w:rPr>
+              <w:t>Disposición principal</w:t>
+            </w:r>
+          </w:p>
+        </w:tc>
+        <w:tc>
+          <w:tcPr>
+            <w:tcW w:type="dxa" w:w="7370"/>
+          </w:tcPr>
+          <w:p>
+            <w:pPr>
+              <w:spacing w:before="20" w:after="20" w:line="264" w:lineRule="auto"/>
+            </w:pPr>
+            <w:r>
+              <w:rPr>
+                <w:rFonts w:ascii="Arial" w:hAnsi="Arial" w:eastAsia="Arial"/>
+                <w:b w:val="0"/>
+                <w:i w:val="0"/>
+                <w:sz w:val="18"/>
+              </w:rPr>
+              <w:t>Artículo 1.- Delegación de facultades en el/la Jefe/a de la Oficina de Planeamiento, Presupuesto y Modernización Delegar en el/la Jefe/a de la Oficina de Planeamiento, Presupuesto y Modernización del Instituto Tecnológico de la Producción (ITP) la facultad de asegurar la implementación y cumplimiento de la Norma Técnica N° 001-2022-PCM-SGP, Norma Técnica para la Gestión de la Calidad de Servicios del Sector Público, aprobada mediante Resolución de Secretaría de Gestión Pública N° 011-2022-PCM/SGP, conforme a lo establecido en el numeral 6.2 del acápite VI de la citada Norma Técnica, comprendiendo las siguientes atribuciones: a) Priorizar el bien o servicio sobre el cual se realiza la…</w:t>
+            </w:r>
+          </w:p>
+        </w:tc>
+      </w:tr>
+      <w:tr>
+        <w:trPr>
+          <w:cantSplit/>
+        </w:trPr>
+        <w:tc>
+          <w:tcPr>
+            <w:tcW w:type="dxa" w:w="2041"/>
+            <w:shd w:val="clear" w:color="auto" w:fill="F2F5FA"/>
+          </w:tcPr>
+          <w:p>
+            <w:pPr>
+              <w:spacing w:before="20" w:after="20" w:line="264" w:lineRule="auto"/>
+            </w:pPr>
+            <w:r>
+              <w:rPr>
+                <w:rFonts w:ascii="Arial" w:hAnsi="Arial" w:eastAsia="Arial"/>
+                <w:b/>
+                <w:i w:val="0"/>
+                <w:color w:val="0A2F5C"/>
+                <w:sz w:val="17"/>
+              </w:rPr>
+              <w:t>Enlaces</w:t>
+            </w:r>
+          </w:p>
+        </w:tc>
+        <w:tc>
+          <w:tcPr>
+            <w:tcW w:type="dxa" w:w="7370"/>
+          </w:tcPr>
+          <w:p>
+            <w:pPr>
+              <w:spacing w:before="20" w:after="20" w:line="264" w:lineRule="auto"/>
+            </w:pPr>
+            <w:hyperlink r:id="rId15">
+              <w:r>
+                <w:rPr>
+                  <w:rFonts w:ascii="Arial" w:hAnsi="Arial" w:eastAsia="Arial" w:cs="Arial"/>
+                  <w:color w:val="0B5CAD"/>
+                  <w:sz w:val="17"/>
+                  <w:u w:val="single"/>
+                </w:rPr>
+                <w:t xml:space="preserve">Texto completo</w:t>
+              </w:r>
+            </w:hyperlink>
+            <w:r>
+              <w:rPr>
+                <w:rFonts w:ascii="Arial" w:hAnsi="Arial" w:eastAsia="Arial"/>
+                <w:b w:val="0"/>
+                <w:i w:val="0"/>
+                <w:color w:val="5B6880"/>
+                <w:sz w:val="17"/>
+              </w:rPr>
+              <w:t xml:space="preserve">   ·   </w:t>
+            </w:r>
+            <w:hyperlink r:id="rId26">
+              <w:r>
+                <w:rPr>
+                  <w:rFonts w:ascii="Arial" w:hAnsi="Arial" w:eastAsia="Arial" w:cs="Arial"/>
+                  <w:color w:val="0B5CAD"/>
+                  <w:sz w:val="17"/>
+                  <w:u w:val="single"/>
+                </w:rPr>
+                <w:t xml:space="preserve">El Peruano</w:t>
+              </w:r>
+            </w:hyperlink>
+            <w:r>
+              <w:rPr>
+                <w:rFonts w:ascii="Arial" w:hAnsi="Arial" w:eastAsia="Arial"/>
+                <w:b w:val="0"/>
+                <w:i w:val="0"/>
+                <w:color w:val="5B6880"/>
+                <w:sz w:val="17"/>
+              </w:rPr>
+              <w:t xml:space="preserve">   ·   </w:t>
+            </w:r>
+            <w:hyperlink r:id="rId27">
+              <w:r>
+                <w:rPr>
+                  <w:rFonts w:ascii="Arial" w:hAnsi="Arial" w:eastAsia="Arial" w:cs="Arial"/>
+                  <w:color w:val="0B5CAD"/>
+                  <w:sz w:val="17"/>
+                  <w:u w:val="single"/>
+                </w:rPr>
+                <w:t xml:space="preserve">PDF</w:t>
+              </w:r>
+            </w:hyperlink>
+          </w:p>
+        </w:tc>
+      </w:tr>
+    </w:tbl>
+    <w:p>
+      <w:pPr>
+        <w:spacing w:before="0" w:after="120" w:line="276" w:lineRule="auto"/>
+      </w:pPr>
+    </w:p>
+    <w:tbl>
+      <w:tblPr>
+        <w:tblW w:type="auto" w:w="0"/>
+        <w:tblLook w:firstColumn="1" w:firstRow="1" w:lastColumn="0" w:lastRow="0" w:noHBand="0" w:noVBand="1" w:val="04A0"/>
+        <w:tblBorders>
+          <w:top w:val="single" w:sz="4" w:space="0" w:color="C9D2DF"/>
+          <w:left w:val="single" w:sz="4" w:space="0" w:color="C9D2DF"/>
+          <w:bottom w:val="single" w:sz="4" w:space="0" w:color="C9D2DF"/>
+          <w:right w:val="single" w:sz="4" w:space="0" w:color="C9D2DF"/>
+          <w:insideH w:val="single" w:sz="4" w:space="0" w:color="C9D2DF"/>
+          <w:insideV w:val="single" w:sz="4" w:space="0" w:color="C9D2DF"/>
+        </w:tblBorders>
+        <w:tblLayout w:type="fixed"/>
+        <w:tblCellMar>
+          <w:top w:w="50" w:type="dxa"/>
+          <w:bottom w:w="50" w:type="dxa"/>
+          <w:left w:w="100" w:type="dxa"/>
+          <w:right w:w="100" w:type="dxa"/>
+        </w:tblCellMar>
+      </w:tblPr>
+      <w:tblGrid>
+        <w:gridCol w:w="4706"/>
+        <w:gridCol w:w="4706"/>
+      </w:tblGrid>
+      <w:tr>
+        <w:trPr>
+          <w:cantSplit/>
+        </w:trPr>
+        <w:tc>
+          <w:tcPr>
+            <w:tcW w:type="dxa" w:w="7370"/>
+            <w:gridSpan w:val="2"/>
+            <w:shd w:val="clear" w:color="auto" w:fill="E8F0FA"/>
+            <w:tcBorders>
+              <w:left w:val="single" w:sz="30" w:space="0" w:color="EB6834"/>
+            </w:tcBorders>
+          </w:tcPr>
+          <w:p>
+            <w:pPr>
+              <w:spacing w:before="20" w:after="20" w:line="264" w:lineRule="auto"/>
+            </w:pPr>
+            <w:r>
+              <w:rPr>
+                <w:rFonts w:ascii="Arial" w:hAnsi="Arial" w:eastAsia="Arial"/>
+                <w:b/>
+                <w:i w:val="0"/>
+                <w:color w:val="0A2F5C"/>
+                <w:sz w:val="19"/>
+              </w:rPr>
+              <w:t>6.  DECRETO SUPREMO  N° 045-2026-RE</w:t>
+            </w:r>
+          </w:p>
+        </w:tc>
+      </w:tr>
+      <w:tr>
+        <w:trPr>
+          <w:cantSplit/>
+        </w:trPr>
+        <w:tc>
+          <w:tcPr>
+            <w:tcW w:type="dxa" w:w="2041"/>
+            <w:shd w:val="clear" w:color="auto" w:fill="F2F5FA"/>
+          </w:tcPr>
+          <w:p>
+            <w:pPr>
+              <w:spacing w:before="20" w:after="20" w:line="264" w:lineRule="auto"/>
+            </w:pPr>
+            <w:r>
+              <w:rPr>
+                <w:rFonts w:ascii="Arial" w:hAnsi="Arial" w:eastAsia="Arial"/>
+                <w:b/>
+                <w:i w:val="0"/>
+                <w:color w:val="0A2F5C"/>
+                <w:sz w:val="17"/>
+              </w:rPr>
+              <w:t>Entidad emisora</w:t>
+            </w:r>
+          </w:p>
+        </w:tc>
+        <w:tc>
+          <w:tcPr>
+            <w:tcW w:type="dxa" w:w="7370"/>
+          </w:tcPr>
+          <w:p>
+            <w:pPr>
+              <w:spacing w:before="20" w:after="20" w:line="264" w:lineRule="auto"/>
+            </w:pPr>
+            <w:r>
+              <w:rPr>
+                <w:rFonts w:ascii="Arial" w:hAnsi="Arial" w:eastAsia="Arial"/>
+                <w:b w:val="0"/>
+                <w:i w:val="0"/>
+                <w:sz w:val="18"/>
+              </w:rPr>
+              <w:t>RELACIONES EXTERIORES</w:t>
+            </w:r>
+          </w:p>
+        </w:tc>
+      </w:tr>
+      <w:tr>
+        <w:trPr>
+          <w:cantSplit/>
+        </w:trPr>
+        <w:tc>
+          <w:tcPr>
+            <w:tcW w:type="dxa" w:w="2041"/>
+            <w:shd w:val="clear" w:color="auto" w:fill="F2F5FA"/>
+          </w:tcPr>
+          <w:p>
+            <w:pPr>
+              <w:spacing w:before="20" w:after="20" w:line="264" w:lineRule="auto"/>
+            </w:pPr>
+            <w:r>
+              <w:rPr>
+                <w:rFonts w:ascii="Arial" w:hAnsi="Arial" w:eastAsia="Arial"/>
+                <w:b/>
+                <w:i w:val="0"/>
+                <w:color w:val="0A2F5C"/>
+                <w:sz w:val="17"/>
+              </w:rPr>
+              <w:t>Publicación</w:t>
+            </w:r>
+          </w:p>
+        </w:tc>
+        <w:tc>
+          <w:tcPr>
+            <w:tcW w:type="dxa" w:w="7370"/>
+          </w:tcPr>
+          <w:p>
+            <w:pPr>
+              <w:spacing w:before="20" w:after="20" w:line="264" w:lineRule="auto"/>
+            </w:pPr>
+            <w:r>
+              <w:rPr>
+                <w:rFonts w:ascii="Arial" w:hAnsi="Arial" w:eastAsia="Arial"/>
+                <w:b w:val="0"/>
+                <w:i w:val="0"/>
+                <w:sz w:val="18"/>
+              </w:rPr>
+              <w:t>30/10/2026 · Edición ordinaria</w:t>
+            </w:r>
+          </w:p>
+        </w:tc>
+      </w:tr>
+      <w:tr>
+        <w:trPr>
+          <w:cantSplit/>
+        </w:trPr>
+        <w:tc>
+          <w:tcPr>
+            <w:tcW w:type="dxa" w:w="2041"/>
+            <w:shd w:val="clear" w:color="auto" w:fill="F2F5FA"/>
+          </w:tcPr>
+          <w:p>
+            <w:pPr>
+              <w:spacing w:before="20" w:after="20" w:line="264" w:lineRule="auto"/>
+            </w:pPr>
+            <w:r>
+              <w:rPr>
+                <w:rFonts w:ascii="Arial" w:hAnsi="Arial" w:eastAsia="Arial"/>
+                <w:b/>
+                <w:i w:val="0"/>
+                <w:color w:val="0A2F5C"/>
+                <w:sz w:val="17"/>
+              </w:rPr>
+              <w:t>Temas</w:t>
+            </w:r>
+          </w:p>
+        </w:tc>
+        <w:tc>
+          <w:tcPr>
+            <w:tcW w:type="dxa" w:w="7370"/>
+          </w:tcPr>
+          <w:p>
+            <w:pPr>
+              <w:spacing w:before="20" w:after="20" w:line="264" w:lineRule="auto"/>
+            </w:pPr>
+            <w:r>
+              <w:rPr>
+                <w:rFonts w:ascii="Arial" w:hAnsi="Arial" w:eastAsia="Arial"/>
+                <w:b w:val="0"/>
+                <w:i w:val="0"/>
+                <w:sz w:val="18"/>
+              </w:rPr>
+              <w:t>Normatividad presupuestal</w:t>
+            </w:r>
+          </w:p>
+        </w:tc>
+      </w:tr>
+      <w:tr>
+        <w:trPr>
+          <w:cantSplit/>
+        </w:trPr>
+        <w:tc>
+          <w:tcPr>
+            <w:tcW w:type="dxa" w:w="2041"/>
+            <w:shd w:val="clear" w:color="auto" w:fill="F2F5FA"/>
+          </w:tcPr>
+          <w:p>
+            <w:pPr>
+              <w:spacing w:before="20" w:after="20" w:line="264" w:lineRule="auto"/>
+            </w:pPr>
+            <w:r>
+              <w:rPr>
+                <w:rFonts w:ascii="Arial" w:hAnsi="Arial" w:eastAsia="Arial"/>
+                <w:b/>
+                <w:i w:val="0"/>
+                <w:color w:val="0A2F5C"/>
+                <w:sz w:val="17"/>
+              </w:rPr>
+              <w:t>Sumilla</w:t>
+            </w:r>
+          </w:p>
+        </w:tc>
+        <w:tc>
+          <w:tcPr>
+            <w:tcW w:type="dxa" w:w="7370"/>
+          </w:tcPr>
+          <w:p>
+            <w:pPr>
+              <w:spacing w:before="20" w:after="20" w:line="264" w:lineRule="auto"/>
+            </w:pPr>
+            <w:r>
+              <w:rPr>
+                <w:rFonts w:ascii="Arial" w:hAnsi="Arial" w:eastAsia="Arial"/>
+                <w:b w:val="0"/>
+                <w:i w:val="0"/>
+                <w:sz w:val="18"/>
+              </w:rPr>
+              <w:t>Decreto Supremo que autoriza al Ministerio de Salud a efectuar el pago de la cuota internacional no contemplada en el Anexo B de la Ley N° 32513 Ley de Presupuesto del Sector Público para el Año Fiscal 2026</w:t>
+            </w:r>
+          </w:p>
+        </w:tc>
+      </w:tr>
+      <w:tr>
+        <w:trPr>
+          <w:cantSplit/>
+        </w:trPr>
+        <w:tc>
+          <w:tcPr>
+            <w:tcW w:type="dxa" w:w="2041"/>
+            <w:shd w:val="clear" w:color="auto" w:fill="F2F5FA"/>
+          </w:tcPr>
+          <w:p>
+            <w:pPr>
+              <w:spacing w:before="20" w:after="20" w:line="264" w:lineRule="auto"/>
+            </w:pPr>
+            <w:r>
+              <w:rPr>
+                <w:rFonts w:ascii="Arial" w:hAnsi="Arial" w:eastAsia="Arial"/>
+                <w:b/>
+                <w:i w:val="0"/>
+                <w:color w:val="0A2F5C"/>
+                <w:sz w:val="17"/>
+              </w:rPr>
+              <w:t>Disposición principal</w:t>
+            </w:r>
+          </w:p>
+        </w:tc>
+        <w:tc>
+          <w:tcPr>
+            <w:tcW w:type="dxa" w:w="7370"/>
+          </w:tcPr>
+          <w:p>
+            <w:pPr>
+              <w:spacing w:before="20" w:after="20" w:line="264" w:lineRule="auto"/>
+            </w:pPr>
+            <w:r>
+              <w:rPr>
+                <w:rFonts w:ascii="Arial" w:hAnsi="Arial" w:eastAsia="Arial"/>
+                <w:b w:val="0"/>
+                <w:i w:val="0"/>
+                <w:sz w:val="18"/>
+              </w:rPr>
+              <w:t>Artículo 1.- Aprobación Se aprueba la cuota internacional a favor del Fondo de Cooperación Técnica del Organismo Internacional de Energía Atómica – OIEA. Artículo 2.- Autorización Se autoriza al Ministerio de Salud a efectuar el pago de la cuota internacional no contemplada en el Anexo B de la Ley Nº 32513, Ley de Presupuesto del Sector Público para el Año Fiscal 2026, con cargo a la Fuente de Financiamiento Recursos Ordinarios, de acuerdo al siguiente detalle: PLIEGO PRESUPUESTAL MONEDA MONTO PERSONA JURÍDICA 011: Ministerio de Salud Euros € 21 847,00 Fondo de Cooperación Técnica del Organismo Internacional de Energía Atómica - OIEA Artículo 3.- Afectación presupuestal Se dispone que los…</w:t>
+            </w:r>
+          </w:p>
+        </w:tc>
+      </w:tr>
+      <w:tr>
+        <w:trPr>
+          <w:cantSplit/>
+        </w:trPr>
+        <w:tc>
+          <w:tcPr>
+            <w:tcW w:type="dxa" w:w="2041"/>
+            <w:shd w:val="clear" w:color="auto" w:fill="F2F5FA"/>
+          </w:tcPr>
+          <w:p>
+            <w:pPr>
+              <w:spacing w:before="20" w:after="20" w:line="264" w:lineRule="auto"/>
+            </w:pPr>
+            <w:r>
+              <w:rPr>
+                <w:rFonts w:ascii="Arial" w:hAnsi="Arial" w:eastAsia="Arial"/>
+                <w:b/>
+                <w:i w:val="0"/>
+                <w:color w:val="0A2F5C"/>
+                <w:sz w:val="17"/>
+              </w:rPr>
+              <w:t>Enlaces</w:t>
+            </w:r>
+          </w:p>
+        </w:tc>
+        <w:tc>
+          <w:tcPr>
+            <w:tcW w:type="dxa" w:w="7370"/>
+          </w:tcPr>
+          <w:p>
+            <w:pPr>
+              <w:spacing w:before="20" w:after="20" w:line="264" w:lineRule="auto"/>
+            </w:pPr>
             <w:hyperlink r:id="rId16">
+              <w:r>
+                <w:rPr>
+                  <w:rFonts w:ascii="Arial" w:hAnsi="Arial" w:eastAsia="Arial" w:cs="Arial"/>
+                  <w:color w:val="0B5CAD"/>
+                  <w:sz w:val="17"/>
+                  <w:u w:val="single"/>
+                </w:rPr>
+                <w:t xml:space="preserve">Texto completo</w:t>
+              </w:r>
+            </w:hyperlink>
+            <w:r>
+              <w:rPr>
+                <w:rFonts w:ascii="Arial" w:hAnsi="Arial" w:eastAsia="Arial"/>
+                <w:b w:val="0"/>
+                <w:i w:val="0"/>
+                <w:color w:val="5B6880"/>
+                <w:sz w:val="17"/>
+              </w:rPr>
+              <w:t xml:space="preserve">   ·   </w:t>
+            </w:r>
+            <w:hyperlink r:id="rId28">
+              <w:r>
+                <w:rPr>
+                  <w:rFonts w:ascii="Arial" w:hAnsi="Arial" w:eastAsia="Arial" w:cs="Arial"/>
+                  <w:color w:val="0B5CAD"/>
+                  <w:sz w:val="17"/>
+                  <w:u w:val="single"/>
+                </w:rPr>
+                <w:t xml:space="preserve">El Peruano</w:t>
+              </w:r>
+            </w:hyperlink>
+            <w:r>
+              <w:rPr>
+                <w:rFonts w:ascii="Arial" w:hAnsi="Arial" w:eastAsia="Arial"/>
+                <w:b w:val="0"/>
+                <w:i w:val="0"/>
+                <w:color w:val="5B6880"/>
+                <w:sz w:val="17"/>
+              </w:rPr>
+              <w:t xml:space="preserve">   ·   </w:t>
+            </w:r>
+            <w:hyperlink r:id="rId29">
+              <w:r>
+                <w:rPr>
+                  <w:rFonts w:ascii="Arial" w:hAnsi="Arial" w:eastAsia="Arial" w:cs="Arial"/>
+                  <w:color w:val="0B5CAD"/>
+                  <w:sz w:val="17"/>
+                  <w:u w:val="single"/>
+                </w:rPr>
+                <w:t xml:space="preserve">PDF</w:t>
+              </w:r>
+            </w:hyperlink>
+          </w:p>
+        </w:tc>
+      </w:tr>
+    </w:tbl>
+    <w:p>
+      <w:pPr>
+        <w:spacing w:before="0" w:after="120" w:line="276" w:lineRule="auto"/>
+      </w:pPr>
+    </w:p>
+    <w:tbl>
+      <w:tblPr>
+        <w:tblW w:type="auto" w:w="0"/>
+        <w:tblLook w:firstColumn="1" w:firstRow="1" w:lastColumn="0" w:lastRow="0" w:noHBand="0" w:noVBand="1" w:val="04A0"/>
+        <w:tblBorders>
+          <w:top w:val="single" w:sz="4" w:space="0" w:color="C9D2DF"/>
+          <w:left w:val="single" w:sz="4" w:space="0" w:color="C9D2DF"/>
+          <w:bottom w:val="single" w:sz="4" w:space="0" w:color="C9D2DF"/>
+          <w:right w:val="single" w:sz="4" w:space="0" w:color="C9D2DF"/>
+          <w:insideH w:val="single" w:sz="4" w:space="0" w:color="C9D2DF"/>
+          <w:insideV w:val="single" w:sz="4" w:space="0" w:color="C9D2DF"/>
+        </w:tblBorders>
+        <w:tblLayout w:type="fixed"/>
+        <w:tblCellMar>
+          <w:top w:w="50" w:type="dxa"/>
+          <w:bottom w:w="50" w:type="dxa"/>
+          <w:left w:w="100" w:type="dxa"/>
+          <w:right w:w="100" w:type="dxa"/>
+        </w:tblCellMar>
+      </w:tblPr>
+      <w:tblGrid>
+        <w:gridCol w:w="4706"/>
+        <w:gridCol w:w="4706"/>
+      </w:tblGrid>
+      <w:tr>
+        <w:trPr>
+          <w:cantSplit/>
+        </w:trPr>
+        <w:tc>
+          <w:tcPr>
+            <w:tcW w:type="dxa" w:w="7370"/>
+            <w:gridSpan w:val="2"/>
+            <w:shd w:val="clear" w:color="auto" w:fill="E8F0FA"/>
+            <w:tcBorders>
+              <w:left w:val="single" w:sz="30" w:space="0" w:color="EB6834"/>
+            </w:tcBorders>
+          </w:tcPr>
+          <w:p>
+            <w:pPr>
+              <w:spacing w:before="20" w:after="20" w:line="264" w:lineRule="auto"/>
+            </w:pPr>
+            <w:r>
+              <w:rPr>
+                <w:rFonts w:ascii="Arial" w:hAnsi="Arial" w:eastAsia="Arial"/>
+                <w:b/>
+                <w:i w:val="0"/>
+                <w:color w:val="0A2F5C"/>
+                <w:sz w:val="19"/>
+              </w:rPr>
+              <w:t>7.  RESOLUCIÓN MINISTERIAL  N° 415-2026-VIVIENDA</w:t>
+            </w:r>
+          </w:p>
+        </w:tc>
+      </w:tr>
+      <w:tr>
+        <w:trPr>
+          <w:cantSplit/>
+        </w:trPr>
+        <w:tc>
+          <w:tcPr>
+            <w:tcW w:type="dxa" w:w="2041"/>
+            <w:shd w:val="clear" w:color="auto" w:fill="F2F5FA"/>
+          </w:tcPr>
+          <w:p>
+            <w:pPr>
+              <w:spacing w:before="20" w:after="20" w:line="264" w:lineRule="auto"/>
+            </w:pPr>
+            <w:r>
+              <w:rPr>
+                <w:rFonts w:ascii="Arial" w:hAnsi="Arial" w:eastAsia="Arial"/>
+                <w:b/>
+                <w:i w:val="0"/>
+                <w:color w:val="0A2F5C"/>
+                <w:sz w:val="17"/>
+              </w:rPr>
+              <w:t>Entidad emisora</w:t>
+            </w:r>
+          </w:p>
+        </w:tc>
+        <w:tc>
+          <w:tcPr>
+            <w:tcW w:type="dxa" w:w="7370"/>
+          </w:tcPr>
+          <w:p>
+            <w:pPr>
+              <w:spacing w:before="20" w:after="20" w:line="264" w:lineRule="auto"/>
+            </w:pPr>
+            <w:r>
+              <w:rPr>
+                <w:rFonts w:ascii="Arial" w:hAnsi="Arial" w:eastAsia="Arial"/>
+                <w:b w:val="0"/>
+                <w:i w:val="0"/>
+                <w:sz w:val="18"/>
+              </w:rPr>
+              <w:t>VIVIENDA, CONSTRUCCIÓN Y SANEAMIENTO</w:t>
+            </w:r>
+          </w:p>
+        </w:tc>
+      </w:tr>
+      <w:tr>
+        <w:trPr>
+          <w:cantSplit/>
+        </w:trPr>
+        <w:tc>
+          <w:tcPr>
+            <w:tcW w:type="dxa" w:w="2041"/>
+            <w:shd w:val="clear" w:color="auto" w:fill="F2F5FA"/>
+          </w:tcPr>
+          <w:p>
+            <w:pPr>
+              <w:spacing w:before="20" w:after="20" w:line="264" w:lineRule="auto"/>
+            </w:pPr>
+            <w:r>
+              <w:rPr>
+                <w:rFonts w:ascii="Arial" w:hAnsi="Arial" w:eastAsia="Arial"/>
+                <w:b/>
+                <w:i w:val="0"/>
+                <w:color w:val="0A2F5C"/>
+                <w:sz w:val="17"/>
+              </w:rPr>
+              <w:t>Publicación</w:t>
+            </w:r>
+          </w:p>
+        </w:tc>
+        <w:tc>
+          <w:tcPr>
+            <w:tcW w:type="dxa" w:w="7370"/>
+          </w:tcPr>
+          <w:p>
+            <w:pPr>
+              <w:spacing w:before="20" w:after="20" w:line="264" w:lineRule="auto"/>
+            </w:pPr>
+            <w:r>
+              <w:rPr>
+                <w:rFonts w:ascii="Arial" w:hAnsi="Arial" w:eastAsia="Arial"/>
+                <w:b w:val="0"/>
+                <w:i w:val="0"/>
+                <w:sz w:val="18"/>
+              </w:rPr>
+              <w:t>30/10/2026 · Edición ordinaria</w:t>
+            </w:r>
+          </w:p>
+        </w:tc>
+      </w:tr>
+      <w:tr>
+        <w:trPr>
+          <w:cantSplit/>
+        </w:trPr>
+        <w:tc>
+          <w:tcPr>
+            <w:tcW w:type="dxa" w:w="2041"/>
+            <w:shd w:val="clear" w:color="auto" w:fill="F2F5FA"/>
+          </w:tcPr>
+          <w:p>
+            <w:pPr>
+              <w:spacing w:before="20" w:after="20" w:line="264" w:lineRule="auto"/>
+            </w:pPr>
+            <w:r>
+              <w:rPr>
+                <w:rFonts w:ascii="Arial" w:hAnsi="Arial" w:eastAsia="Arial"/>
+                <w:b/>
+                <w:i w:val="0"/>
+                <w:color w:val="0A2F5C"/>
+                <w:sz w:val="17"/>
+              </w:rPr>
+              <w:t>Temas</w:t>
+            </w:r>
+          </w:p>
+        </w:tc>
+        <w:tc>
+          <w:tcPr>
+            <w:tcW w:type="dxa" w:w="7370"/>
+          </w:tcPr>
+          <w:p>
+            <w:pPr>
+              <w:spacing w:before="20" w:after="20" w:line="264" w:lineRule="auto"/>
+            </w:pPr>
+            <w:r>
+              <w:rPr>
+                <w:rFonts w:ascii="Arial" w:hAnsi="Arial" w:eastAsia="Arial"/>
+                <w:b w:val="0"/>
+                <w:i w:val="0"/>
+                <w:sz w:val="18"/>
+              </w:rPr>
+              <w:t>Normatividad presupuestal</w:t>
+            </w:r>
+          </w:p>
+        </w:tc>
+      </w:tr>
+      <w:tr>
+        <w:trPr>
+          <w:cantSplit/>
+        </w:trPr>
+        <w:tc>
+          <w:tcPr>
+            <w:tcW w:type="dxa" w:w="2041"/>
+            <w:shd w:val="clear" w:color="auto" w:fill="F2F5FA"/>
+          </w:tcPr>
+          <w:p>
+            <w:pPr>
+              <w:spacing w:before="20" w:after="20" w:line="264" w:lineRule="auto"/>
+            </w:pPr>
+            <w:r>
+              <w:rPr>
+                <w:rFonts w:ascii="Arial" w:hAnsi="Arial" w:eastAsia="Arial"/>
+                <w:b/>
+                <w:i w:val="0"/>
+                <w:color w:val="0A2F5C"/>
+                <w:sz w:val="17"/>
+              </w:rPr>
+              <w:t>Sumilla</w:t>
+            </w:r>
+          </w:p>
+        </w:tc>
+        <w:tc>
+          <w:tcPr>
+            <w:tcW w:type="dxa" w:w="7370"/>
+          </w:tcPr>
+          <w:p>
+            <w:pPr>
+              <w:spacing w:before="20" w:after="20" w:line="264" w:lineRule="auto"/>
+            </w:pPr>
+            <w:r>
+              <w:rPr>
+                <w:rFonts w:ascii="Arial" w:hAnsi="Arial" w:eastAsia="Arial"/>
+                <w:b w:val="0"/>
+                <w:i w:val="0"/>
+                <w:sz w:val="18"/>
+              </w:rPr>
+              <w:t>Autorizan Transferencia Financiera a favor del Instituto Geofísico del Perú para financiar la elaboración de diversos estudios de zonificación geofísica - geotécnica en el departamento de Junín</w:t>
+            </w:r>
+          </w:p>
+        </w:tc>
+      </w:tr>
+      <w:tr>
+        <w:trPr>
+          <w:cantSplit/>
+        </w:trPr>
+        <w:tc>
+          <w:tcPr>
+            <w:tcW w:type="dxa" w:w="2041"/>
+            <w:shd w:val="clear" w:color="auto" w:fill="F2F5FA"/>
+          </w:tcPr>
+          <w:p>
+            <w:pPr>
+              <w:spacing w:before="20" w:after="20" w:line="264" w:lineRule="auto"/>
+            </w:pPr>
+            <w:r>
+              <w:rPr>
+                <w:rFonts w:ascii="Arial" w:hAnsi="Arial" w:eastAsia="Arial"/>
+                <w:b/>
+                <w:i w:val="0"/>
+                <w:color w:val="0A2F5C"/>
+                <w:sz w:val="17"/>
+              </w:rPr>
+              <w:t>Disposición principal</w:t>
+            </w:r>
+          </w:p>
+        </w:tc>
+        <w:tc>
+          <w:tcPr>
+            <w:tcW w:type="dxa" w:w="7370"/>
+          </w:tcPr>
+          <w:p>
+            <w:pPr>
+              <w:spacing w:before="20" w:after="20" w:line="264" w:lineRule="auto"/>
+            </w:pPr>
+            <w:r>
+              <w:rPr>
+                <w:rFonts w:ascii="Arial" w:hAnsi="Arial" w:eastAsia="Arial"/>
+                <w:b w:val="0"/>
+                <w:i w:val="0"/>
+                <w:sz w:val="18"/>
+              </w:rPr>
+              <w:t>Artículo 1.- Transferencia Financiera a favor del Instituto Geofísico del Perú Autorizar la Transferencia Financiera del Pliego 037: Ministerio de Vivienda, Construcción y Saneamiento, Unidad Ejecutora 001: Ministerio de Vivienda, Construcción y Saneamiento - Administración General, hasta por la suma de S/ 10 680,00 (DIEZ MIL SEISCIENTOS OCHENTA Y 00/100 SOLES), a favor del Pliego 112: Instituto Geofísico del Perú, para financiar la elaboración de los estudios de Zonificación Geofísica - Geotécnica en las áreas de los distritos de San Juan de Iscos, Chongos Bajo y Chupaca, provincia de Chupaca, Chupuro, Huayucachi y Viques provincia de Huancayo, departamento de Junín, en cumplimiento de los…</w:t>
+            </w:r>
+          </w:p>
+        </w:tc>
+      </w:tr>
+      <w:tr>
+        <w:trPr>
+          <w:cantSplit/>
+        </w:trPr>
+        <w:tc>
+          <w:tcPr>
+            <w:tcW w:type="dxa" w:w="2041"/>
+            <w:shd w:val="clear" w:color="auto" w:fill="F2F5FA"/>
+          </w:tcPr>
+          <w:p>
+            <w:pPr>
+              <w:spacing w:before="20" w:after="20" w:line="264" w:lineRule="auto"/>
+            </w:pPr>
+            <w:r>
+              <w:rPr>
+                <w:rFonts w:ascii="Arial" w:hAnsi="Arial" w:eastAsia="Arial"/>
+                <w:b/>
+                <w:i w:val="0"/>
+                <w:color w:val="0A2F5C"/>
+                <w:sz w:val="17"/>
+              </w:rPr>
+              <w:t>Montos citados</w:t>
+            </w:r>
+          </w:p>
+        </w:tc>
+        <w:tc>
+          <w:tcPr>
+            <w:tcW w:type="dxa" w:w="7370"/>
+          </w:tcPr>
+          <w:p>
+            <w:pPr>
+              <w:spacing w:before="20" w:after="20" w:line="264" w:lineRule="auto"/>
+            </w:pPr>
+            <w:r>
+              <w:rPr>
+                <w:rFonts w:ascii="Arial" w:hAnsi="Arial" w:eastAsia="Arial"/>
+                <w:b w:val="0"/>
+                <w:i w:val="0"/>
+                <w:sz w:val="18"/>
+              </w:rPr>
+              <w:t>S/ 3 930 661 286,00 · S/ 93 430,00 · S/ 104 110,00 · S/ 10 680,00</w:t>
+            </w:r>
+          </w:p>
+        </w:tc>
+      </w:tr>
+      <w:tr>
+        <w:trPr>
+          <w:cantSplit/>
+        </w:trPr>
+        <w:tc>
+          <w:tcPr>
+            <w:tcW w:type="dxa" w:w="2041"/>
+            <w:shd w:val="clear" w:color="auto" w:fill="F2F5FA"/>
+          </w:tcPr>
+          <w:p>
+            <w:pPr>
+              <w:spacing w:before="20" w:after="20" w:line="264" w:lineRule="auto"/>
+            </w:pPr>
+            <w:r>
+              <w:rPr>
+                <w:rFonts w:ascii="Arial" w:hAnsi="Arial" w:eastAsia="Arial"/>
+                <w:b/>
+                <w:i w:val="0"/>
+                <w:color w:val="0A2F5C"/>
+                <w:sz w:val="17"/>
+              </w:rPr>
+              <w:t>Enlaces</w:t>
+            </w:r>
+          </w:p>
+        </w:tc>
+        <w:tc>
+          <w:tcPr>
+            <w:tcW w:type="dxa" w:w="7370"/>
+          </w:tcPr>
+          <w:p>
+            <w:pPr>
+              <w:spacing w:before="20" w:after="20" w:line="264" w:lineRule="auto"/>
+            </w:pPr>
+            <w:hyperlink r:id="rId17">
+              <w:r>
+                <w:rPr>
+                  <w:rFonts w:ascii="Arial" w:hAnsi="Arial" w:eastAsia="Arial" w:cs="Arial"/>
+                  <w:color w:val="0B5CAD"/>
+                  <w:sz w:val="17"/>
+                  <w:u w:val="single"/>
+                </w:rPr>
+                <w:t xml:space="preserve">Texto completo</w:t>
+              </w:r>
+            </w:hyperlink>
+            <w:r>
+              <w:rPr>
+                <w:rFonts w:ascii="Arial" w:hAnsi="Arial" w:eastAsia="Arial"/>
+                <w:b w:val="0"/>
+                <w:i w:val="0"/>
+                <w:color w:val="5B6880"/>
+                <w:sz w:val="17"/>
+              </w:rPr>
+              <w:t xml:space="preserve">   ·   </w:t>
+            </w:r>
+            <w:hyperlink r:id="rId30">
+              <w:r>
+                <w:rPr>
+                  <w:rFonts w:ascii="Arial" w:hAnsi="Arial" w:eastAsia="Arial" w:cs="Arial"/>
+                  <w:color w:val="0B5CAD"/>
+                  <w:sz w:val="17"/>
+                  <w:u w:val="single"/>
+                </w:rPr>
+                <w:t xml:space="preserve">El Peruano</w:t>
+              </w:r>
+            </w:hyperlink>
+            <w:r>
+              <w:rPr>
+                <w:rFonts w:ascii="Arial" w:hAnsi="Arial" w:eastAsia="Arial"/>
+                <w:b w:val="0"/>
+                <w:i w:val="0"/>
+                <w:color w:val="5B6880"/>
+                <w:sz w:val="17"/>
+              </w:rPr>
+              <w:t xml:space="preserve">   ·   </w:t>
+            </w:r>
+            <w:hyperlink r:id="rId31">
               <w:r>
                 <w:rPr>
                   <w:rFonts w:ascii="Arial" w:hAnsi="Arial" w:eastAsia="Arial" w:cs="Arial"/>
@@ -1541,7 +4055,7 @@
         </w:rPr>
         <w:t xml:space="preserve">se revisan todas las normas publicadas en el Diario Oficial El Peruano en el periodo. Una norma se selecciona cuando su entidad, título o sumilla contiene alguno de los términos definidos para cada tema, o cuando su texto completo menciona a la ATU. Los criterios pueden consultarse y editarse en el panel: </w:t>
       </w:r>
-      <w:hyperlink r:id="rId17">
+      <w:hyperlink r:id="rId32">
         <w:r>
           <w:rPr>
             <w:rFonts w:ascii="Arial" w:hAnsi="Arial" w:eastAsia="Arial" w:cs="Arial"/>

</xml_diff>

<commit_message>
Panel: normas al 31/10/2026
</commit_message>
<xml_diff>
--- a/docs/resumenes/Normas_ElPeruano_ultimo.docx
+++ b/docs/resumenes/Normas_ElPeruano_ultimo.docx
@@ -31,7 +31,7 @@
           <w:color w:val="5B6880"/>
           <w:sz w:val="21"/>
         </w:rPr>
-        <w:t>Diario Oficial El Peruano · Viernes 30 de octubre de 2026</w:t>
+        <w:t>Diario Oficial El Peruano · Sábado 31 de octubre de 2026</w:t>
       </w:r>
     </w:p>
     <w:p>
@@ -105,7 +105,7 @@
                 <w:i w:val="0"/>
                 <w:sz w:val="19"/>
               </w:rPr>
-              <w:t>30/10/2026</w:t>
+              <w:t>31/10/2026</w:t>
             </w:r>
           </w:p>
         </w:tc>
@@ -145,7 +145,7 @@
                 <w:i w:val="0"/>
                 <w:sz w:val="19"/>
               </w:rPr>
-              <w:t>30/10/2026 10:46</w:t>
+              <w:t>31/10/2026 08:11</w:t>
             </w:r>
           </w:p>
         </w:tc>
@@ -187,7 +187,7 @@
                 <w:i w:val="0"/>
                 <w:sz w:val="19"/>
               </w:rPr>
-              <w:t>112</w:t>
+              <w:t>105</w:t>
             </w:r>
           </w:p>
         </w:tc>
@@ -228,7 +228,7 @@
                 <w:color w:val="0A2F5C"/>
                 <w:sz w:val="19"/>
               </w:rPr>
-              <w:t>7</w:t>
+              <w:t>10</w:t>
             </w:r>
           </w:p>
         </w:tc>
@@ -265,7 +265,7 @@
           <w:i w:val="0"/>
           <w:sz w:val="20"/>
         </w:rPr>
-        <w:t>De las 112 normas publicadas en el periodo, 7 resultan de interés institucional: 7 de normatividad presupuestal. No se identificaron normas que involucren a la ATU. El Cuadro 1 presenta la relación completa y la sección 2, el detalle de cada norma.</w:t>
+        <w:t>De las 105 normas publicadas en el periodo, 10 resultan de interés institucional: 5 de normatividad presupuestal y 5 de inversiones. No se identificaron normas que involucren a la ATU. El Cuadro 1 presenta la relación completa y la sección 2, el detalle de cada norma.</w:t>
       </w:r>
     </w:p>
     <w:p>
@@ -429,7 +429,7 @@
                 <w:color w:val="0A2F5C"/>
                 <w:sz w:val="17"/>
               </w:rPr>
-              <w:t>NORMATIVIDAD PRESUPUESTAL  (7)</w:t>
+              <w:t>NORMATIVIDAD PRESUPUESTAL  (5)</w:t>
             </w:r>
           </w:p>
         </w:tc>
@@ -476,7 +476,7 @@
                   <w:sz w:val="17"/>
                   <w:u w:val="single"/>
                 </w:rPr>
-                <w:t xml:space="preserve">DECRETO SUPREMO  N° 227-2026-EF</w:t>
+                <w:t xml:space="preserve">DECRETO SUPREMO  N° 234-2026-EF</w:t>
               </w:r>
             </w:hyperlink>
           </w:p>
@@ -511,7 +511,7 @@
                 <w:i w:val="0"/>
                 <w:sz w:val="17"/>
               </w:rPr>
-              <w:t>Decreto Supremo que autoriza Crédito Suplementario en el Presupuesto del Sector Público para el Año Fiscal 2026 a favor del Ministerio de Defensa</w:t>
+              <w:t>Decreto Supremo que autoriza Transferencia de Partidas en el Presupuesto del Sector Público para el Año Fiscal 2026 a favor de diversos gobiernos regionales</w:t>
             </w:r>
           </w:p>
         </w:tc>
@@ -531,7 +531,7 @@
                 <w:i w:val="0"/>
                 <w:sz w:val="17"/>
               </w:rPr>
-              <w:t>30/10/2026</w:t>
+              <w:t>31/10/2026</w:t>
             </w:r>
           </w:p>
         </w:tc>
@@ -578,7 +578,7 @@
                   <w:sz w:val="17"/>
                   <w:u w:val="single"/>
                 </w:rPr>
-                <w:t xml:space="preserve">DECRETO SUPREMO  N° 228-2026-EF</w:t>
+                <w:t xml:space="preserve">DECRETO SUPREMO  N° 235-2026-EF</w:t>
               </w:r>
             </w:hyperlink>
           </w:p>
@@ -613,7 +613,7 @@
                 <w:i w:val="0"/>
                 <w:sz w:val="17"/>
               </w:rPr>
-              <w:t>Decreto Supremo que autoriza Transferencia de Partidas en el Presupuesto del Sector Público para el Año Fiscal 2026 a favor de la Reserva de Contingencia y del Ministerio de Defensa</w:t>
+              <w:t>Decreto Supremo que autoriza Transferencia de Partidas en el Presupuesto del Sector Público para el Año Fiscal 2026 a favor del Gobierno Regional de Ancash</w:t>
             </w:r>
           </w:p>
         </w:tc>
@@ -633,7 +633,7 @@
                 <w:i w:val="0"/>
                 <w:sz w:val="17"/>
               </w:rPr>
-              <w:t>30/10/2026</w:t>
+              <w:t>31/10/2026</w:t>
             </w:r>
           </w:p>
         </w:tc>
@@ -680,7 +680,7 @@
                   <w:sz w:val="17"/>
                   <w:u w:val="single"/>
                 </w:rPr>
-                <w:t xml:space="preserve">DECRETO SUPREMO  N° 229-2026-EF</w:t>
+                <w:t xml:space="preserve">DECRETO SUPREMO  N° 236-2026-EF</w:t>
               </w:r>
             </w:hyperlink>
           </w:p>
@@ -715,7 +715,7 @@
                 <w:i w:val="0"/>
                 <w:sz w:val="17"/>
               </w:rPr>
-              <w:t>Decreto Supremo que autoriza Transferencia de Partidas en el Presupuesto del Sector Público para el Año Fiscal 2026 a favor del Centro Nacional de Planeamiento Estratégico</w:t>
+              <w:t>Decreto Supremo que autoriza Transferencia de Partidas en el Presupuesto del Sector Público para el Año Fiscal 2026 a favor del Gobierno Regional de Ayacucho</w:t>
             </w:r>
           </w:p>
         </w:tc>
@@ -735,7 +735,7 @@
                 <w:i w:val="0"/>
                 <w:sz w:val="17"/>
               </w:rPr>
-              <w:t>30/10/2026</w:t>
+              <w:t>31/10/2026</w:t>
             </w:r>
           </w:p>
         </w:tc>
@@ -782,7 +782,7 @@
                   <w:sz w:val="17"/>
                   <w:u w:val="single"/>
                 </w:rPr>
-                <w:t xml:space="preserve">RESOLUCIÓN  N° 535-2026-GOB</w:t>
+                <w:t xml:space="preserve">DECRETO SUPREMO  N° 237-2026-EF</w:t>
               </w:r>
             </w:hyperlink>
           </w:p>
@@ -798,7 +798,7 @@
                 <w:color w:val="5B6880"/>
                 <w:sz w:val="15"/>
               </w:rPr>
-              <w:t>GOBIERNO REGIONAL DE LIMA</w:t>
+              <w:t>ECONOMÍA Y FINANZAS</w:t>
             </w:r>
           </w:p>
         </w:tc>
@@ -817,7 +817,7 @@
                 <w:i w:val="0"/>
                 <w:sz w:val="17"/>
               </w:rPr>
-              <w:t>Aprueban transferencia financiera a favor de la Contraloría General de la República</w:t>
+              <w:t>Decreto Supremo que autoriza Transferencia de Partidas en el Presupuesto del Sector Público para el Año Fiscal 2026 a favor de la Municipalidad Provincial de Alto Amazonas</w:t>
             </w:r>
           </w:p>
         </w:tc>
@@ -837,7 +837,7 @@
                 <w:i w:val="0"/>
                 <w:sz w:val="17"/>
               </w:rPr>
-              <w:t>30/10/2026</w:t>
+              <w:t>31/10/2026</w:t>
             </w:r>
           </w:p>
         </w:tc>
@@ -884,7 +884,7 @@
                   <w:sz w:val="17"/>
                   <w:u w:val="single"/>
                 </w:rPr>
-                <w:t xml:space="preserve">RESOLUCIÓN  N° 000053-2026-ITP/GG</w:t>
+                <w:t xml:space="preserve">RESOLUCIÓN JEFATURAL  N° 000169-2026-SIS/J</w:t>
               </w:r>
             </w:hyperlink>
           </w:p>
@@ -900,7 +900,7 @@
                 <w:color w:val="5B6880"/>
                 <w:sz w:val="15"/>
               </w:rPr>
-              <w:t>INSTITUTO TECNOLÓGICO DE LA PRODUCCIÓN</w:t>
+              <w:t>SEGURO INTEGRAL DE SALUD</w:t>
             </w:r>
           </w:p>
         </w:tc>
@@ -919,7 +919,7 @@
                 <w:i w:val="0"/>
                 <w:sz w:val="17"/>
               </w:rPr>
-              <w:t>Delegar en el/la Jefe/a de la Oficina de Planeamiento Presupuesto y Modernización del ITP la facultad de asegurar la implementación y cumplimiento de la Norma Técnica para la Gestión de la Calidad de Servicios del Sector Público</w:t>
+              <w:t>Aprueban transferencia financiera del FISSAL a favor de unidades ejecutoras para financiar prestaciones de salud e incentivos prestacionales</w:t>
             </w:r>
           </w:p>
         </w:tc>
@@ -939,7 +939,37 @@
                 <w:i w:val="0"/>
                 <w:sz w:val="17"/>
               </w:rPr>
-              <w:t>30/10/2026</w:t>
+              <w:t>31/10/2026</w:t>
+            </w:r>
+          </w:p>
+        </w:tc>
+      </w:tr>
+      <w:tr>
+        <w:trPr>
+          <w:cantSplit/>
+        </w:trPr>
+        <w:tc>
+          <w:tcPr>
+            <w:tcW w:type="dxa" w:w="1247"/>
+            <w:gridSpan w:val="4"/>
+            <w:shd w:val="clear" w:color="auto" w:fill="F2F5FA"/>
+            <w:tcBorders>
+              <w:left w:val="single" w:sz="30" w:space="0" w:color="1BAF7A"/>
+            </w:tcBorders>
+          </w:tcPr>
+          <w:p>
+            <w:pPr>
+              <w:spacing w:before="20" w:after="20" w:line="264" w:lineRule="auto"/>
+            </w:pPr>
+            <w:r>
+              <w:rPr>
+                <w:rFonts w:ascii="Arial" w:hAnsi="Arial" w:eastAsia="Arial"/>
+                <w:b/>
+                <w:i w:val="0"/>
+                <w:color w:val="0A2F5C"/>
+                <w:sz w:val="17"/>
+              </w:rPr>
+              <w:t>INVERSIONES  (5)</w:t>
             </w:r>
           </w:p>
         </w:tc>
@@ -986,7 +1016,7 @@
                   <w:sz w:val="17"/>
                   <w:u w:val="single"/>
                 </w:rPr>
-                <w:t xml:space="preserve">DECRETO SUPREMO  N° 045-2026-RE</w:t>
+                <w:t xml:space="preserve">DECRETO DE URGENCIA  N° 016-2026</w:t>
               </w:r>
             </w:hyperlink>
           </w:p>
@@ -1002,7 +1032,7 @@
                 <w:color w:val="5B6880"/>
                 <w:sz w:val="15"/>
               </w:rPr>
-              <w:t>RELACIONES EXTERIORES</w:t>
+              <w:t>DECRETOS DE URGENCIA</w:t>
             </w:r>
           </w:p>
         </w:tc>
@@ -1021,7 +1051,7 @@
                 <w:i w:val="0"/>
                 <w:sz w:val="17"/>
               </w:rPr>
-              <w:t>Decreto Supremo que autoriza al Ministerio de Salud a efectuar el pago de la cuota internacional no contemplada en el Anexo B de la Ley N° 32513 Ley de Presupuesto del Sector Público para el Año Fiscal 2026</w:t>
+              <w:t>Decreto de Urgencia que dicta medidas extraordinarias para la ejecución de actividades de mantenimiento en establecimientos educativos públicos mediante Obras por Impuestos ante el Fenómeno El Niño</w:t>
             </w:r>
           </w:p>
         </w:tc>
@@ -1041,7 +1071,7 @@
                 <w:i w:val="0"/>
                 <w:sz w:val="17"/>
               </w:rPr>
-              <w:t>30/10/2026</w:t>
+              <w:t>31/10/2026</w:t>
             </w:r>
           </w:p>
         </w:tc>
@@ -1088,7 +1118,7 @@
                   <w:sz w:val="17"/>
                   <w:u w:val="single"/>
                 </w:rPr>
-                <w:t xml:space="preserve">RESOLUCIÓN MINISTERIAL  N° 415-2026-VIVIENDA</w:t>
+                <w:t xml:space="preserve">RESOLUCIÓN MINISTERIAL  N° 456-2026-MINEM/DM</w:t>
               </w:r>
             </w:hyperlink>
           </w:p>
@@ -1104,7 +1134,7 @@
                 <w:color w:val="5B6880"/>
                 <w:sz w:val="15"/>
               </w:rPr>
-              <w:t>VIVIENDA, CONSTRUCCIÓN Y SANEAMIENTO</w:t>
+              <w:t>ENERGÍA Y MINAS</w:t>
             </w:r>
           </w:p>
         </w:tc>
@@ -1123,7 +1153,7 @@
                 <w:i w:val="0"/>
                 <w:sz w:val="17"/>
               </w:rPr>
-              <w:t>Autorizan Transferencia Financiera a favor del Instituto Geofísico del Perú para financiar la elaboración de diversos estudios de zonificación geofísica - geotécnica en el departamento de Junín</w:t>
+              <w:t>Aprueban texto de la Sexta Modificación al Contrato de Concesión N° 028-94 a suscribirse entre el Ministerio de Energía y Minas y la empresa ELECTRO DUNAS S.A.A. a fin de modificar anexos y dictan otras disposiciones</w:t>
             </w:r>
           </w:p>
         </w:tc>
@@ -1143,7 +1173,313 @@
                 <w:i w:val="0"/>
                 <w:sz w:val="17"/>
               </w:rPr>
-              <w:t>30/10/2026</w:t>
+              <w:t>31/10/2026</w:t>
+            </w:r>
+          </w:p>
+        </w:tc>
+      </w:tr>
+      <w:tr>
+        <w:trPr>
+          <w:cantSplit/>
+        </w:trPr>
+        <w:tc>
+          <w:tcPr>
+            <w:tcW w:type="dxa" w:w="567"/>
+          </w:tcPr>
+          <w:p>
+            <w:pPr>
+              <w:spacing w:before="20" w:after="20" w:line="264" w:lineRule="auto"/>
+              <w:jc w:val="center"/>
+            </w:pPr>
+            <w:r>
+              <w:rPr>
+                <w:rFonts w:ascii="Arial" w:hAnsi="Arial" w:eastAsia="Arial"/>
+                <w:b/>
+                <w:i w:val="0"/>
+                <w:color w:val="0A2F5C"/>
+                <w:sz w:val="18"/>
+              </w:rPr>
+              <w:t>8</w:t>
+            </w:r>
+          </w:p>
+        </w:tc>
+        <w:tc>
+          <w:tcPr>
+            <w:tcW w:type="dxa" w:w="2835"/>
+          </w:tcPr>
+          <w:p>
+            <w:pPr>
+              <w:spacing w:before="20" w:after="20" w:line="264" w:lineRule="auto"/>
+            </w:pPr>
+            <w:hyperlink r:id="rId18">
+              <w:r>
+                <w:rPr>
+                  <w:rFonts w:ascii="Arial" w:hAnsi="Arial" w:eastAsia="Arial" w:cs="Arial"/>
+                  <w:b/>
+                  <w:color w:val="0B5CAD"/>
+                  <w:sz w:val="17"/>
+                  <w:u w:val="single"/>
+                </w:rPr>
+                <w:t xml:space="preserve">RESOLUCIÓN  N° D000305-2026-OECE-PRE</w:t>
+              </w:r>
+            </w:hyperlink>
+          </w:p>
+          <w:p>
+            <w:pPr>
+              <w:spacing w:before="0" w:after="20" w:line="252" w:lineRule="auto"/>
+            </w:pPr>
+            <w:r>
+              <w:rPr>
+                <w:rFonts w:ascii="Arial" w:hAnsi="Arial" w:eastAsia="Arial"/>
+                <w:b w:val="0"/>
+                <w:i w:val="0"/>
+                <w:color w:val="5B6880"/>
+                <w:sz w:val="15"/>
+              </w:rPr>
+              <w:t>ORGANISMO ESPECIALIZADO PARA LAS CONTRATACIONES PÚBLICAS EFICIENTES</w:t>
+            </w:r>
+          </w:p>
+        </w:tc>
+        <w:tc>
+          <w:tcPr>
+            <w:tcW w:type="dxa" w:w="4762"/>
+          </w:tcPr>
+          <w:p>
+            <w:pPr>
+              <w:spacing w:before="20" w:after="20" w:line="264" w:lineRule="auto"/>
+            </w:pPr>
+            <w:r>
+              <w:rPr>
+                <w:rFonts w:ascii="Arial" w:hAnsi="Arial" w:eastAsia="Arial"/>
+                <w:b w:val="0"/>
+                <w:i w:val="0"/>
+                <w:sz w:val="17"/>
+              </w:rPr>
+              <w:t>Autorizan al Procurador Público y al Procurador Público Adjunto de la Procuraduría Pública Especializada en Materia Hacendaria a conciliar en audiencias y demás diligencias que se deriven de los procesos judiciales tramitados con la Ley Nº 29497 Nueva Ley Procesal del Trabajo y a delegar las facultades para conciliar a favor de los abogados a su cargo</w:t>
+            </w:r>
+          </w:p>
+        </w:tc>
+        <w:tc>
+          <w:tcPr>
+            <w:tcW w:type="dxa" w:w="1247"/>
+          </w:tcPr>
+          <w:p>
+            <w:pPr>
+              <w:spacing w:before="20" w:after="20" w:line="264" w:lineRule="auto"/>
+              <w:jc w:val="center"/>
+            </w:pPr>
+            <w:r>
+              <w:rPr>
+                <w:rFonts w:ascii="Arial" w:hAnsi="Arial" w:eastAsia="Arial"/>
+                <w:b w:val="0"/>
+                <w:i w:val="0"/>
+                <w:sz w:val="17"/>
+              </w:rPr>
+              <w:t>31/10/2026</w:t>
+            </w:r>
+          </w:p>
+        </w:tc>
+      </w:tr>
+      <w:tr>
+        <w:trPr>
+          <w:cantSplit/>
+        </w:trPr>
+        <w:tc>
+          <w:tcPr>
+            <w:tcW w:type="dxa" w:w="567"/>
+          </w:tcPr>
+          <w:p>
+            <w:pPr>
+              <w:spacing w:before="20" w:after="20" w:line="264" w:lineRule="auto"/>
+              <w:jc w:val="center"/>
+            </w:pPr>
+            <w:r>
+              <w:rPr>
+                <w:rFonts w:ascii="Arial" w:hAnsi="Arial" w:eastAsia="Arial"/>
+                <w:b/>
+                <w:i w:val="0"/>
+                <w:color w:val="0A2F5C"/>
+                <w:sz w:val="18"/>
+              </w:rPr>
+              <w:t>9</w:t>
+            </w:r>
+          </w:p>
+        </w:tc>
+        <w:tc>
+          <w:tcPr>
+            <w:tcW w:type="dxa" w:w="2835"/>
+          </w:tcPr>
+          <w:p>
+            <w:pPr>
+              <w:spacing w:before="20" w:after="20" w:line="264" w:lineRule="auto"/>
+            </w:pPr>
+            <w:hyperlink r:id="rId19">
+              <w:r>
+                <w:rPr>
+                  <w:rFonts w:ascii="Arial" w:hAnsi="Arial" w:eastAsia="Arial" w:cs="Arial"/>
+                  <w:b/>
+                  <w:color w:val="0B5CAD"/>
+                  <w:sz w:val="17"/>
+                  <w:u w:val="single"/>
+                </w:rPr>
+                <w:t xml:space="preserve">RESOLUCIÓN  N° 000286-2026-GG/OSIPTEL</w:t>
+              </w:r>
+            </w:hyperlink>
+          </w:p>
+          <w:p>
+            <w:pPr>
+              <w:spacing w:before="0" w:after="20" w:line="252" w:lineRule="auto"/>
+            </w:pPr>
+            <w:r>
+              <w:rPr>
+                <w:rFonts w:ascii="Arial" w:hAnsi="Arial" w:eastAsia="Arial"/>
+                <w:b w:val="0"/>
+                <w:i w:val="0"/>
+                <w:color w:val="5B6880"/>
+                <w:sz w:val="15"/>
+              </w:rPr>
+              <w:t>ORGANISMO SUPERVISOR DE INVERSIÓN PRIVADA EN TELECOMUNICACIONES</w:t>
+            </w:r>
+          </w:p>
+        </w:tc>
+        <w:tc>
+          <w:tcPr>
+            <w:tcW w:type="dxa" w:w="4762"/>
+          </w:tcPr>
+          <w:p>
+            <w:pPr>
+              <w:spacing w:before="20" w:after="20" w:line="264" w:lineRule="auto"/>
+            </w:pPr>
+            <w:r>
+              <w:rPr>
+                <w:rFonts w:ascii="Arial" w:hAnsi="Arial" w:eastAsia="Arial"/>
+                <w:b w:val="0"/>
+                <w:i w:val="0"/>
+                <w:sz w:val="17"/>
+              </w:rPr>
+              <w:t>Modifican el Instructivo Técnico para el cumplimiento de las Normas Complementarias para la Implementación del Registro Nacional de Equipos Terminales Móviles para la Seguridad aprobado por Resolución de Gerencia General N° 00070-2020-GG/OSIPTEL</w:t>
+            </w:r>
+          </w:p>
+        </w:tc>
+        <w:tc>
+          <w:tcPr>
+            <w:tcW w:type="dxa" w:w="1247"/>
+          </w:tcPr>
+          <w:p>
+            <w:pPr>
+              <w:spacing w:before="20" w:after="20" w:line="264" w:lineRule="auto"/>
+              <w:jc w:val="center"/>
+            </w:pPr>
+            <w:r>
+              <w:rPr>
+                <w:rFonts w:ascii="Arial" w:hAnsi="Arial" w:eastAsia="Arial"/>
+                <w:b w:val="0"/>
+                <w:i w:val="0"/>
+                <w:sz w:val="17"/>
+              </w:rPr>
+              <w:t>31/10/2026</w:t>
+            </w:r>
+          </w:p>
+        </w:tc>
+      </w:tr>
+      <w:tr>
+        <w:trPr>
+          <w:cantSplit/>
+        </w:trPr>
+        <w:tc>
+          <w:tcPr>
+            <w:tcW w:type="dxa" w:w="567"/>
+          </w:tcPr>
+          <w:p>
+            <w:pPr>
+              <w:spacing w:before="20" w:after="20" w:line="264" w:lineRule="auto"/>
+              <w:jc w:val="center"/>
+            </w:pPr>
+            <w:r>
+              <w:rPr>
+                <w:rFonts w:ascii="Arial" w:hAnsi="Arial" w:eastAsia="Arial"/>
+                <w:b/>
+                <w:i w:val="0"/>
+                <w:color w:val="0A2F5C"/>
+                <w:sz w:val="18"/>
+              </w:rPr>
+              <w:t>10</w:t>
+            </w:r>
+          </w:p>
+        </w:tc>
+        <w:tc>
+          <w:tcPr>
+            <w:tcW w:type="dxa" w:w="2835"/>
+          </w:tcPr>
+          <w:p>
+            <w:pPr>
+              <w:spacing w:before="20" w:after="20" w:line="264" w:lineRule="auto"/>
+            </w:pPr>
+            <w:hyperlink r:id="rId20">
+              <w:r>
+                <w:rPr>
+                  <w:rFonts w:ascii="Arial" w:hAnsi="Arial" w:eastAsia="Arial" w:cs="Arial"/>
+                  <w:b/>
+                  <w:color w:val="0B5CAD"/>
+                  <w:sz w:val="17"/>
+                  <w:u w:val="single"/>
+                </w:rPr>
+                <w:t xml:space="preserve">RESOLUCIÓN  N° 000140 2026-CD/OSIPTEL</w:t>
+              </w:r>
+            </w:hyperlink>
+          </w:p>
+          <w:p>
+            <w:pPr>
+              <w:spacing w:before="0" w:after="20" w:line="252" w:lineRule="auto"/>
+            </w:pPr>
+            <w:r>
+              <w:rPr>
+                <w:rFonts w:ascii="Arial" w:hAnsi="Arial" w:eastAsia="Arial"/>
+                <w:b w:val="0"/>
+                <w:i w:val="0"/>
+                <w:color w:val="5B6880"/>
+                <w:sz w:val="15"/>
+              </w:rPr>
+              <w:t>ORGANISMO SUPERVISOR DE INVERSIÓN PRIVADA EN TELECOMUNICACIONES</w:t>
+            </w:r>
+          </w:p>
+        </w:tc>
+        <w:tc>
+          <w:tcPr>
+            <w:tcW w:type="dxa" w:w="4762"/>
+          </w:tcPr>
+          <w:p>
+            <w:pPr>
+              <w:spacing w:before="20" w:after="20" w:line="264" w:lineRule="auto"/>
+            </w:pPr>
+            <w:r>
+              <w:rPr>
+                <w:rFonts w:ascii="Arial" w:hAnsi="Arial" w:eastAsia="Arial"/>
+                <w:b w:val="0"/>
+                <w:i w:val="0"/>
+                <w:sz w:val="17"/>
+              </w:rPr>
+              <w:t>Aprueban Mandato de Interconexión entre las empresas FIBERMAX TELECOM S.A.C. e INTEGRATEL PERÚ S.A.A.</w:t>
+            </w:r>
+          </w:p>
+        </w:tc>
+        <w:tc>
+          <w:tcPr>
+            <w:tcW w:type="dxa" w:w="1247"/>
+          </w:tcPr>
+          <w:p>
+            <w:pPr>
+              <w:spacing w:before="20" w:after="20" w:line="264" w:lineRule="auto"/>
+              <w:jc w:val="center"/>
+            </w:pPr>
+            <w:r>
+              <w:rPr>
+                <w:rFonts w:ascii="Arial" w:hAnsi="Arial" w:eastAsia="Arial"/>
+                <w:b w:val="0"/>
+                <w:i w:val="0"/>
+                <w:sz w:val="17"/>
+              </w:rPr>
+              <w:t>31/10/2026</w:t>
             </w:r>
           </w:p>
         </w:tc>
@@ -1233,7 +1569,7 @@
                 <w:color w:val="0A2F5C"/>
                 <w:sz w:val="19"/>
               </w:rPr>
-              <w:t>1.  DECRETO SUPREMO  N° 227-2026-EF</w:t>
+              <w:t>1.  DECRETO SUPREMO  N° 234-2026-EF</w:t>
             </w:r>
           </w:p>
         </w:tc>
@@ -1323,7 +1659,7 @@
                 <w:i w:val="0"/>
                 <w:sz w:val="18"/>
               </w:rPr>
-              <w:t>30/10/2026 · Edición ordinaria</w:t>
+              <w:t>31/10/2026 · Edición ordinaria</w:t>
             </w:r>
           </w:p>
         </w:tc>
@@ -1413,7 +1749,7 @@
                 <w:i w:val="0"/>
                 <w:sz w:val="18"/>
               </w:rPr>
-              <w:t>Decreto Supremo que autoriza Crédito Suplementario en el Presupuesto del Sector Público para el Año Fiscal 2026 a favor del Ministerio de Defensa</w:t>
+              <w:t>Decreto Supremo que autoriza Transferencia de Partidas en el Presupuesto del Sector Público para el Año Fiscal 2026 a favor de diversos gobiernos regionales</w:t>
             </w:r>
           </w:p>
         </w:tc>
@@ -1458,7 +1794,7 @@
                 <w:i w:val="0"/>
                 <w:sz w:val="18"/>
               </w:rPr>
-              <w:t>Artículo 1.- Objeto Se autoriza la incorporación de recursos vía Crédito Suplementario en el Presupuesto del Sector Público para el Año Fiscal 2026, hasta por la suma de S/ 3 474 995,00 (TRES MILLONES CUATROCIENTOS SETENTA Y CUATRO MIL NOVECIENTOS NOVENTA Y CINCO Y 00/100 SOLES), en la fuente de financiamiento Recursos Ordinarios, a favor del Ministerio de Defensa, para financiar el cumplimiento de las competencias de la Autoridad Marítima en la defensa, seguridad y protección ambiental en las aguas jurisdiccionales del país, con cargo a los recursos depositados por la Autoridad Portuaria Nacional en la cuenta del Tesoro Público, correspondiente al 30% de las retribuciones pagadas por la…</w:t>
+              <w:t>Artículo 1.- Objeto 1.1. Se autoriza una Transferencia de Partidas en el Presupuesto del Sector Público para el Año Fiscal 2026, hasta por la suma de S/ 38 000,00 (TREINTA Y OCHO MIL Y 00/100 SOLES), por la fuente de financiamiento Recursos Ordinarios, a favor de diversos gobiernos regionales, para financiar el pago de la entrega económica y bonificaciones por otorgamiento correspondiente a los condecorados con las Palmas Magisteriales 2025, en el marco del literal f) del numeral 82.1 del artículo 82 de la Ley N° 32513, Ley de Presupuesto del Sector Público para el Año Fiscal 2026, con cargo a los recursos del presupuesto institucional del Ministerio de Educación, de acuerdo con el…</w:t>
             </w:r>
           </w:p>
         </w:tc>
@@ -1503,7 +1839,7 @@
                 <w:i w:val="0"/>
                 <w:sz w:val="18"/>
               </w:rPr>
-              <w:t>S/ 3 474 995,00 · S/ 5 412 702,95</w:t>
+              <w:t>S/ 587 272 027,00 · S/ 38 000,00</w:t>
             </w:r>
           </w:p>
         </w:tc>
@@ -1562,7 +1898,7 @@
               </w:rPr>
               <w:t xml:space="preserve">   ·   </w:t>
             </w:r>
-            <w:hyperlink r:id="rId18">
+            <w:hyperlink r:id="rId21">
               <w:r>
                 <w:rPr>
                   <w:rFonts w:ascii="Arial" w:hAnsi="Arial" w:eastAsia="Arial" w:cs="Arial"/>
@@ -1583,7 +1919,7 @@
               </w:rPr>
               <w:t xml:space="preserve">   ·   </w:t>
             </w:r>
-            <w:hyperlink r:id="rId19">
+            <w:hyperlink r:id="rId22">
               <w:r>
                 <w:rPr>
                   <w:rFonts w:ascii="Arial" w:hAnsi="Arial" w:eastAsia="Arial" w:cs="Arial"/>
@@ -1652,7 +1988,7 @@
                 <w:color w:val="0A2F5C"/>
                 <w:sz w:val="19"/>
               </w:rPr>
-              <w:t>2.  DECRETO SUPREMO  N° 228-2026-EF</w:t>
+              <w:t>2.  DECRETO SUPREMO  N° 235-2026-EF</w:t>
             </w:r>
           </w:p>
         </w:tc>
@@ -1742,7 +2078,7 @@
                 <w:i w:val="0"/>
                 <w:sz w:val="18"/>
               </w:rPr>
-              <w:t>30/10/2026 · Edición ordinaria</w:t>
+              <w:t>31/10/2026 · Edición ordinaria</w:t>
             </w:r>
           </w:p>
         </w:tc>
@@ -1832,7 +2168,7 @@
                 <w:i w:val="0"/>
                 <w:sz w:val="18"/>
               </w:rPr>
-              <w:t>Decreto Supremo que autoriza Transferencia de Partidas en el Presupuesto del Sector Público para el Año Fiscal 2026 a favor de la Reserva de Contingencia y del Ministerio de Defensa</w:t>
+              <w:t>Decreto Supremo que autoriza Transferencia de Partidas en el Presupuesto del Sector Público para el Año Fiscal 2026 a favor del Gobierno Regional de Ancash</w:t>
             </w:r>
           </w:p>
         </w:tc>
@@ -1877,7 +2213,7 @@
                 <w:i w:val="0"/>
                 <w:sz w:val="18"/>
               </w:rPr>
-              <w:t>Artículo 1.- Transferencia de Partidas a favor de la Reserva de Contingencia Se autoriza una Transferencia de Partidas en el Presupuesto del Sector Público para el Año Fiscal 2026, hasta por la suma de S/ 52 198 955,00 (CINCUENTA Y DOS MILLONES CIENTO NOVENTA Y OCHO MIL NOVECIENTOS CINCUENTA Y CINCO Y 00/100 SOLES), por la fuente de financiamiento Recursos Ordinarios, a favor de la Reserva de Contingencia del Ministerio de Economía y Finanzas, con cargo a los recursos del presupuesto institucional de la Autoridad Nacional del Agua, en el marco de lo dispuesto en la Décima Cuarta Disposición Complementaria Final de la Ley Nº 32513, Ley de Presupuesto del Sector Público para el Año Fiscal…</w:t>
+              <w:t>Artículo 1.- Objeto Se autoriza una Transferencia de Partidas en el Presupuesto del Sector Público para el Año Fiscal 2026, hasta por la suma de S/ 4 090 168,00 (CUATRO MILLONES NOVENTA MIL CIENTO SESENTA Y OCHO Y 00/100 SOLES), por la fuente de financiamiento Recursos Ordinarios, a favor del Gobierno Regional de Ancash, para financiar la operación y el mantenimiento del Hospital de Apoyo Huarmey, con cargo a los recursos del presupuesto institucional del Ministerio de Salud, en el marco de lo establecido en el artículo 44 de la Ley N° 32513, Ley de Presupuesto del Sector Público para el Año Fiscal 2026, de acuerdo con el siguiente detalle: DE LA: En Soles SECCIÓN PRIMERA : Gobierno Central…</w:t>
             </w:r>
           </w:p>
         </w:tc>
@@ -1922,7 +2258,7 @@
                 <w:i w:val="0"/>
                 <w:sz w:val="18"/>
               </w:rPr>
-              <w:t>S/ 52 198 955,00 · S/ 21 853 366,00</w:t>
+              <w:t>S/ 4 090 168,00</w:t>
             </w:r>
           </w:p>
         </w:tc>
@@ -1981,7 +2317,7 @@
               </w:rPr>
               <w:t xml:space="preserve">   ·   </w:t>
             </w:r>
-            <w:hyperlink r:id="rId20">
+            <w:hyperlink r:id="rId23">
               <w:r>
                 <w:rPr>
                   <w:rFonts w:ascii="Arial" w:hAnsi="Arial" w:eastAsia="Arial" w:cs="Arial"/>
@@ -2002,7 +2338,7 @@
               </w:rPr>
               <w:t xml:space="preserve">   ·   </w:t>
             </w:r>
-            <w:hyperlink r:id="rId21">
+            <w:hyperlink r:id="rId24">
               <w:r>
                 <w:rPr>
                   <w:rFonts w:ascii="Arial" w:hAnsi="Arial" w:eastAsia="Arial" w:cs="Arial"/>
@@ -2071,7 +2407,7 @@
                 <w:color w:val="0A2F5C"/>
                 <w:sz w:val="19"/>
               </w:rPr>
-              <w:t>3.  DECRETO SUPREMO  N° 229-2026-EF</w:t>
+              <w:t>3.  DECRETO SUPREMO  N° 236-2026-EF</w:t>
             </w:r>
           </w:p>
         </w:tc>
@@ -2161,7 +2497,7 @@
                 <w:i w:val="0"/>
                 <w:sz w:val="18"/>
               </w:rPr>
-              <w:t>30/10/2026 · Edición ordinaria</w:t>
+              <w:t>31/10/2026 · Edición ordinaria</w:t>
             </w:r>
           </w:p>
         </w:tc>
@@ -2251,7 +2587,7 @@
                 <w:i w:val="0"/>
                 <w:sz w:val="18"/>
               </w:rPr>
-              <w:t>Decreto Supremo que autoriza Transferencia de Partidas en el Presupuesto del Sector Público para el Año Fiscal 2026 a favor del Centro Nacional de Planeamiento Estratégico</w:t>
+              <w:t>Decreto Supremo que autoriza Transferencia de Partidas en el Presupuesto del Sector Público para el Año Fiscal 2026 a favor del Gobierno Regional de Ayacucho</w:t>
             </w:r>
           </w:p>
         </w:tc>
@@ -2296,7 +2632,7 @@
                 <w:i w:val="0"/>
                 <w:sz w:val="18"/>
               </w:rPr>
-              <w:t>Artículo 1.- Objeto Se autoriza una Transferencia de Partidas en el Presupuesto del Sector Público para el Año Fiscal 2026, hasta por la suma de S/ 1 295 188,00 (UN MILLÓN DOSCIENTOS NOVENTA Y CINCO MIL CIENTO OCHENTA Y OCHO Y 00/100 SOLES), por la fuente de financiamiento Recursos por Operaciones Oficiales de Crédito, a favor del Centro Nacional de Planeamiento Estratégico, para financiar la ejecución del proyecto de inversión “Mejoramiento y Ampliación de los Servicios Operativos o Misionales Institucionales en Centro Nacional de Planeamiento Estratégico Distrito de San Isidro de la Provincia de Lima del Departamento de Lima”, con Código Único de Inversiones (CUI) Nº 2690555, vinculado a…</w:t>
+              <w:t>Artículo 1.- Objeto Se autoriza una Transferencia de Partidas en el Presupuesto del Sector Público para el Año Fiscal 2026, hasta por la suma de S/ 4 089 671,00 (CUATRO MILLONES OCHENTA Y NUEVE MIL SEISCIENTOS SETENTA Y UNO Y 00/100 SOLES), por la fuente de financiamiento Recursos Ordinarios, a favor del Gobierno Regional de Ayacucho, para financiar la operación y el mantenimiento del Establecimiento de Salud San Juan Bautista, con cargo a los recursos del presupuesto institucional del Ministerio de Salud, en el marco de lo establecido en el artículo 44 de la Ley N° 32513, Ley de Presupuesto del Sector Público para el Año Fiscal 2026, de acuerdo con el siguiente detalle: DE LA: En Soles…</w:t>
             </w:r>
           </w:p>
         </w:tc>
@@ -2341,7 +2677,7 @@
                 <w:i w:val="0"/>
                 <w:sz w:val="18"/>
               </w:rPr>
-              <w:t>S/ 1 295 188,00</w:t>
+              <w:t>S/ 4 089 671,00</w:t>
             </w:r>
           </w:p>
         </w:tc>
@@ -2400,7 +2736,7 @@
               </w:rPr>
               <w:t xml:space="preserve">   ·   </w:t>
             </w:r>
-            <w:hyperlink r:id="rId22">
+            <w:hyperlink r:id="rId25">
               <w:r>
                 <w:rPr>
                   <w:rFonts w:ascii="Arial" w:hAnsi="Arial" w:eastAsia="Arial" w:cs="Arial"/>
@@ -2421,7 +2757,7 @@
               </w:rPr>
               <w:t xml:space="preserve">   ·   </w:t>
             </w:r>
-            <w:hyperlink r:id="rId23">
+            <w:hyperlink r:id="rId26">
               <w:r>
                 <w:rPr>
                   <w:rFonts w:ascii="Arial" w:hAnsi="Arial" w:eastAsia="Arial" w:cs="Arial"/>
@@ -2490,7 +2826,7 @@
                 <w:color w:val="0A2F5C"/>
                 <w:sz w:val="19"/>
               </w:rPr>
-              <w:t>4.  RESOLUCIÓN  N° 535-2026-GOB</w:t>
+              <w:t>4.  DECRETO SUPREMO  N° 237-2026-EF</w:t>
             </w:r>
           </w:p>
         </w:tc>
@@ -2535,7 +2871,7 @@
                 <w:i w:val="0"/>
                 <w:sz w:val="18"/>
               </w:rPr>
-              <w:t>GOBIERNO REGIONAL DE LIMA</w:t>
+              <w:t>ECONOMÍA Y FINANZAS</w:t>
             </w:r>
           </w:p>
         </w:tc>
@@ -2580,7 +2916,7 @@
                 <w:i w:val="0"/>
                 <w:sz w:val="18"/>
               </w:rPr>
-              <w:t>30/10/2026 · Edición ordinaria</w:t>
+              <w:t>31/10/2026 · Edición ordinaria</w:t>
             </w:r>
           </w:p>
         </w:tc>
@@ -2670,7 +3006,7 @@
                 <w:i w:val="0"/>
                 <w:sz w:val="18"/>
               </w:rPr>
-              <w:t>Aprueban transferencia financiera a favor de la Contraloría General de la República</w:t>
+              <w:t>Decreto Supremo que autoriza Transferencia de Partidas en el Presupuesto del Sector Público para el Año Fiscal 2026 a favor de la Municipalidad Provincial de Alto Amazonas</w:t>
             </w:r>
           </w:p>
         </w:tc>
@@ -2715,7 +3051,7 @@
                 <w:i w:val="0"/>
                 <w:sz w:val="18"/>
               </w:rPr>
-              <w:t>Artículo Primero.- APROBAR la Transferencia Financiera por el monto total de S/ 311 120,00 (Trescientos once mil ciento veinte y 00/100 soles), con cargo a los recursos del Pliego 463: Gobierno Regional del Departamento de Lima, a favor del Pliego 019: Contraloría General, Unidad Ejecutora 001-196: Contraloría General de la República, destinada al financiamiento de las acciones de control concurrente correspondientes a nueve (09) proyectos de inversión priorizados por la Contraloría General de la República, en el marco de la Ley N° 31358, Ley que establece medidas para la expansión del control concurrente, y sus modificatorias, conforme al detalle de los proyectos consignados en el Anexo N°…</w:t>
+              <w:t>Artículo 1.- Objeto Se autoriza una Transferencia de Partidas en el Presupuesto del Sector Público para el Año Fiscal 2026, hasta por la suma de S/ 8 111 952,00 (OCHO MILLONES CIENTO ONCE MIL NOVECIENTOS CINCUENTA Y DOS Y 00/100 SOLES), en la fuente de financiamiento Recursos Ordinarios, con cargo a los recursos del presupuesto institucional del Ministerio de Educación, a favor de la Municipalidad Provincial de Alto Amazonas, para financiar la continuidad de la ejecución del proyecto de inversión en infraestructura educativa con CUI N° 2308038 “Mejoramiento de los servicios educativos de inicial, primaria y secundaria de la educación básica regular en la institución educativa Santo Tomás,…</w:t>
             </w:r>
           </w:p>
         </w:tc>
@@ -2760,7 +3096,7 @@
                 <w:i w:val="0"/>
                 <w:sz w:val="18"/>
               </w:rPr>
-              <w:t>S/ 311,120.00 · S/ 201 715,00 · S/ 109 405,00</w:t>
+              <w:t>S/ 8 111 952,00</w:t>
             </w:r>
           </w:p>
         </w:tc>
@@ -2819,7 +3155,7 @@
               </w:rPr>
               <w:t xml:space="preserve">   ·   </w:t>
             </w:r>
-            <w:hyperlink r:id="rId24">
+            <w:hyperlink r:id="rId27">
               <w:r>
                 <w:rPr>
                   <w:rFonts w:ascii="Arial" w:hAnsi="Arial" w:eastAsia="Arial" w:cs="Arial"/>
@@ -2840,7 +3176,7 @@
               </w:rPr>
               <w:t xml:space="preserve">   ·   </w:t>
             </w:r>
-            <w:hyperlink r:id="rId25">
+            <w:hyperlink r:id="rId28">
               <w:r>
                 <w:rPr>
                   <w:rFonts w:ascii="Arial" w:hAnsi="Arial" w:eastAsia="Arial" w:cs="Arial"/>
@@ -2909,7 +3245,7 @@
                 <w:color w:val="0A2F5C"/>
                 <w:sz w:val="19"/>
               </w:rPr>
-              <w:t>5.  RESOLUCIÓN  N° 000053-2026-ITP/GG</w:t>
+              <w:t>5.  RESOLUCIÓN JEFATURAL  N° 000169-2026-SIS/J</w:t>
             </w:r>
           </w:p>
         </w:tc>
@@ -2954,7 +3290,7 @@
                 <w:i w:val="0"/>
                 <w:sz w:val="18"/>
               </w:rPr>
-              <w:t>INSTITUTO TECNOLÓGICO DE LA PRODUCCIÓN</w:t>
+              <w:t>SEGURO INTEGRAL DE SALUD</w:t>
             </w:r>
           </w:p>
         </w:tc>
@@ -2999,7 +3335,7 @@
                 <w:i w:val="0"/>
                 <w:sz w:val="18"/>
               </w:rPr>
-              <w:t>30/10/2026 · Edición ordinaria</w:t>
+              <w:t>31/10/2026 · Edición ordinaria</w:t>
             </w:r>
           </w:p>
         </w:tc>
@@ -3089,7 +3425,7 @@
                 <w:i w:val="0"/>
                 <w:sz w:val="18"/>
               </w:rPr>
-              <w:t>Delegar en el/la Jefe/a de la Oficina de Planeamiento Presupuesto y Modernización del ITP la facultad de asegurar la implementación y cumplimiento de la Norma Técnica para la Gestión de la Calidad de Servicios del Sector Público</w:t>
+              <w:t>Aprueban transferencia financiera del FISSAL a favor de unidades ejecutoras para financiar prestaciones de salud e incentivos prestacionales</w:t>
             </w:r>
           </w:p>
         </w:tc>
@@ -3134,7 +3470,52 @@
                 <w:i w:val="0"/>
                 <w:sz w:val="18"/>
               </w:rPr>
-              <w:t>Artículo 1.- Delegación de facultades en el/la Jefe/a de la Oficina de Planeamiento, Presupuesto y Modernización Delegar en el/la Jefe/a de la Oficina de Planeamiento, Presupuesto y Modernización del Instituto Tecnológico de la Producción (ITP) la facultad de asegurar la implementación y cumplimiento de la Norma Técnica N° 001-2022-PCM-SGP, Norma Técnica para la Gestión de la Calidad de Servicios del Sector Público, aprobada mediante Resolución de Secretaría de Gestión Pública N° 011-2022-PCM/SGP, conforme a lo establecido en el numeral 6.2 del acápite VI de la citada Norma Técnica, comprendiendo las siguientes atribuciones: a) Priorizar el bien o servicio sobre el cual se realiza la…</w:t>
+              <w:t>Artículo 1.- Aprobación de la Transferencia Financiera Aprobar la Transferencia Financiera de la Unidad Ejecutora 002 - 1423 Fondo Intangible Solidario de Salud - FISSAL, correspondiente al calendario octubre 2026, hasta por la suma de S/ 4,196,872.00 (CUATRO MILLONES CIENTO NOVENTA Y SEIS MIL OCHOCIENTOS SETENTA Y DOS Y 00/100 SOLES), con cargo a la Fuente de Financiamiento 1. Recursos Ordinarios, a favor de las unidades ejecutoras descritas en los Anexos N° 1 “Pliego 135 - Seguro Integral de Salud - Unidad Ejecutora 002 - 1423 Fondo Intangible Solidario de Salud Transferencia Financiera - Recursos Ordinarios - Calendario octubre 2026 - Pago por Prestación - Financiamiento de Prestaciones…</w:t>
+            </w:r>
+          </w:p>
+        </w:tc>
+      </w:tr>
+      <w:tr>
+        <w:trPr>
+          <w:cantSplit/>
+        </w:trPr>
+        <w:tc>
+          <w:tcPr>
+            <w:tcW w:type="dxa" w:w="2041"/>
+            <w:shd w:val="clear" w:color="auto" w:fill="F2F5FA"/>
+          </w:tcPr>
+          <w:p>
+            <w:pPr>
+              <w:spacing w:before="20" w:after="20" w:line="264" w:lineRule="auto"/>
+            </w:pPr>
+            <w:r>
+              <w:rPr>
+                <w:rFonts w:ascii="Arial" w:hAnsi="Arial" w:eastAsia="Arial"/>
+                <w:b/>
+                <w:i w:val="0"/>
+                <w:color w:val="0A2F5C"/>
+                <w:sz w:val="17"/>
+              </w:rPr>
+              <w:t>Montos citados</w:t>
+            </w:r>
+          </w:p>
+        </w:tc>
+        <w:tc>
+          <w:tcPr>
+            <w:tcW w:type="dxa" w:w="7370"/>
+          </w:tcPr>
+          <w:p>
+            <w:pPr>
+              <w:spacing w:before="20" w:after="20" w:line="264" w:lineRule="auto"/>
+            </w:pPr>
+            <w:r>
+              <w:rPr>
+                <w:rFonts w:ascii="Arial" w:hAnsi="Arial" w:eastAsia="Arial"/>
+                <w:b w:val="0"/>
+                <w:i w:val="0"/>
+                <w:sz w:val="18"/>
+              </w:rPr>
+              <w:t>S/ 4,196,872.00 · S/ 2,264,023.00 · S/ 1,932,849.00</w:t>
             </w:r>
           </w:p>
         </w:tc>
@@ -3193,7 +3574,7 @@
               </w:rPr>
               <w:t xml:space="preserve">   ·   </w:t>
             </w:r>
-            <w:hyperlink r:id="rId26">
+            <w:hyperlink r:id="rId29">
               <w:r>
                 <w:rPr>
                   <w:rFonts w:ascii="Arial" w:hAnsi="Arial" w:eastAsia="Arial" w:cs="Arial"/>
@@ -3214,7 +3595,7 @@
               </w:rPr>
               <w:t xml:space="preserve">   ·   </w:t>
             </w:r>
-            <w:hyperlink r:id="rId27">
+            <w:hyperlink r:id="rId30">
               <w:r>
                 <w:rPr>
                   <w:rFonts w:ascii="Arial" w:hAnsi="Arial" w:eastAsia="Arial" w:cs="Arial"/>
@@ -3233,6 +3614,22 @@
       <w:pPr>
         <w:spacing w:before="0" w:after="120" w:line="276" w:lineRule="auto"/>
       </w:pPr>
+    </w:p>
+    <w:p>
+      <w:pPr>
+        <w:keepNext/>
+        <w:spacing w:before="160" w:after="80" w:line="276" w:lineRule="auto"/>
+      </w:pPr>
+      <w:r>
+        <w:rPr>
+          <w:rFonts w:ascii="Arial" w:hAnsi="Arial" w:eastAsia="Arial"/>
+          <w:b/>
+          <w:i w:val="0"/>
+          <w:color w:val="0B5CAD"/>
+          <w:sz w:val="21"/>
+        </w:rPr>
+        <w:t>2.2  Inversiones</w:t>
+      </w:r>
     </w:p>
     <w:tbl>
       <w:tblPr>
@@ -3268,7 +3665,7 @@
             <w:gridSpan w:val="2"/>
             <w:shd w:val="clear" w:color="auto" w:fill="E8F0FA"/>
             <w:tcBorders>
-              <w:left w:val="single" w:sz="30" w:space="0" w:color="EB6834"/>
+              <w:left w:val="single" w:sz="30" w:space="0" w:color="1BAF7A"/>
             </w:tcBorders>
           </w:tcPr>
           <w:p>
@@ -3283,7 +3680,7 @@
                 <w:color w:val="0A2F5C"/>
                 <w:sz w:val="19"/>
               </w:rPr>
-              <w:t>6.  DECRETO SUPREMO  N° 045-2026-RE</w:t>
+              <w:t>6.  DECRETO DE URGENCIA  N° 016-2026</w:t>
             </w:r>
           </w:p>
         </w:tc>
@@ -3328,7 +3725,7 @@
                 <w:i w:val="0"/>
                 <w:sz w:val="18"/>
               </w:rPr>
-              <w:t>RELACIONES EXTERIORES</w:t>
+              <w:t>DECRETOS DE URGENCIA</w:t>
             </w:r>
           </w:p>
         </w:tc>
@@ -3373,7 +3770,7 @@
                 <w:i w:val="0"/>
                 <w:sz w:val="18"/>
               </w:rPr>
-              <w:t>30/10/2026 · Edición ordinaria</w:t>
+              <w:t>31/10/2026 · Edición ordinaria</w:t>
             </w:r>
           </w:p>
         </w:tc>
@@ -3418,7 +3815,7 @@
                 <w:i w:val="0"/>
                 <w:sz w:val="18"/>
               </w:rPr>
-              <w:t>Normatividad presupuestal</w:t>
+              <w:t>Inversiones</w:t>
             </w:r>
           </w:p>
         </w:tc>
@@ -3463,7 +3860,7 @@
                 <w:i w:val="0"/>
                 <w:sz w:val="18"/>
               </w:rPr>
-              <w:t>Decreto Supremo que autoriza al Ministerio de Salud a efectuar el pago de la cuota internacional no contemplada en el Anexo B de la Ley N° 32513 Ley de Presupuesto del Sector Público para el Año Fiscal 2026</w:t>
+              <w:t>Decreto de Urgencia que dicta medidas extraordinarias para la ejecución de actividades de mantenimiento en establecimientos educativos públicos mediante Obras por Impuestos ante el Fenómeno El Niño</w:t>
             </w:r>
           </w:p>
         </w:tc>
@@ -3508,7 +3905,7 @@
                 <w:i w:val="0"/>
                 <w:sz w:val="18"/>
               </w:rPr>
-              <w:t>Artículo 1.- Aprobación Se aprueba la cuota internacional a favor del Fondo de Cooperación Técnica del Organismo Internacional de Energía Atómica – OIEA. Artículo 2.- Autorización Se autoriza al Ministerio de Salud a efectuar el pago de la cuota internacional no contemplada en el Anexo B de la Ley Nº 32513, Ley de Presupuesto del Sector Público para el Año Fiscal 2026, con cargo a la Fuente de Financiamiento Recursos Ordinarios, de acuerdo al siguiente detalle: PLIEGO PRESUPUESTAL MONEDA MONTO PERSONA JURÍDICA 011: Ministerio de Salud Euros € 21 847,00 Fondo de Cooperación Técnica del Organismo Internacional de Energía Atómica - OIEA Artículo 3.- Afectación presupuestal Se dispone que los…</w:t>
+              <w:t>Artículo 1.- Objeto El presente Decreto de Urgencia tiene por objeto establecer medidas extraordinarias y temporales en materia económica y financiera orientadas a habilitar y agilizar la ejecución de actividades de mantenimiento correctivo en los establecimientos educativos públicos, vinculadas a la prevención, preparación y respuesta ante el peligro inminente y los efectos generados en el marco de la atención del Fenómeno El Niño 2026-2027, mediante el mecanismo de Obras por Impuestos regulado por la Ley Nº 29230, Ley que impulsa la inversión pública regional y local con la participación del sector privado, y su Reglamento; así como simplificar los plazos y procedimientos aplicables a…</w:t>
             </w:r>
           </w:p>
         </w:tc>
@@ -3567,7 +3964,7 @@
               </w:rPr>
               <w:t xml:space="preserve">   ·   </w:t>
             </w:r>
-            <w:hyperlink r:id="rId28">
+            <w:hyperlink r:id="rId31">
               <w:r>
                 <w:rPr>
                   <w:rFonts w:ascii="Arial" w:hAnsi="Arial" w:eastAsia="Arial" w:cs="Arial"/>
@@ -3588,7 +3985,7 @@
               </w:rPr>
               <w:t xml:space="preserve">   ·   </w:t>
             </w:r>
-            <w:hyperlink r:id="rId29">
+            <w:hyperlink r:id="rId32">
               <w:r>
                 <w:rPr>
                   <w:rFonts w:ascii="Arial" w:hAnsi="Arial" w:eastAsia="Arial" w:cs="Arial"/>
@@ -3642,7 +4039,7 @@
             <w:gridSpan w:val="2"/>
             <w:shd w:val="clear" w:color="auto" w:fill="E8F0FA"/>
             <w:tcBorders>
-              <w:left w:val="single" w:sz="30" w:space="0" w:color="EB6834"/>
+              <w:left w:val="single" w:sz="30" w:space="0" w:color="1BAF7A"/>
             </w:tcBorders>
           </w:tcPr>
           <w:p>
@@ -3657,7 +4054,7 @@
                 <w:color w:val="0A2F5C"/>
                 <w:sz w:val="19"/>
               </w:rPr>
-              <w:t>7.  RESOLUCIÓN MINISTERIAL  N° 415-2026-VIVIENDA</w:t>
+              <w:t>7.  RESOLUCIÓN MINISTERIAL  N° 456-2026-MINEM/DM</w:t>
             </w:r>
           </w:p>
         </w:tc>
@@ -3702,7 +4099,7 @@
                 <w:i w:val="0"/>
                 <w:sz w:val="18"/>
               </w:rPr>
-              <w:t>VIVIENDA, CONSTRUCCIÓN Y SANEAMIENTO</w:t>
+              <w:t>ENERGÍA Y MINAS</w:t>
             </w:r>
           </w:p>
         </w:tc>
@@ -3747,7 +4144,7 @@
                 <w:i w:val="0"/>
                 <w:sz w:val="18"/>
               </w:rPr>
-              <w:t>30/10/2026 · Edición ordinaria</w:t>
+              <w:t>31/10/2026 · Edición ordinaria</w:t>
             </w:r>
           </w:p>
         </w:tc>
@@ -3792,7 +4189,7 @@
                 <w:i w:val="0"/>
                 <w:sz w:val="18"/>
               </w:rPr>
-              <w:t>Normatividad presupuestal</w:t>
+              <w:t>Inversiones</w:t>
             </w:r>
           </w:p>
         </w:tc>
@@ -3837,7 +4234,7 @@
                 <w:i w:val="0"/>
                 <w:sz w:val="18"/>
               </w:rPr>
-              <w:t>Autorizan Transferencia Financiera a favor del Instituto Geofísico del Perú para financiar la elaboración de diversos estudios de zonificación geofísica - geotécnica en el departamento de Junín</w:t>
+              <w:t>Aprueban texto de la Sexta Modificación al Contrato de Concesión N° 028-94 a suscribirse entre el Ministerio de Energía y Minas y la empresa ELECTRO DUNAS S.A.A. a fin de modificar anexos y dictan otras disposiciones</w:t>
             </w:r>
           </w:p>
         </w:tc>
@@ -3882,52 +4279,7 @@
                 <w:i w:val="0"/>
                 <w:sz w:val="18"/>
               </w:rPr>
-              <w:t>Artículo 1.- Transferencia Financiera a favor del Instituto Geofísico del Perú Autorizar la Transferencia Financiera del Pliego 037: Ministerio de Vivienda, Construcción y Saneamiento, Unidad Ejecutora 001: Ministerio de Vivienda, Construcción y Saneamiento - Administración General, hasta por la suma de S/ 10 680,00 (DIEZ MIL SEISCIENTOS OCHENTA Y 00/100 SOLES), a favor del Pliego 112: Instituto Geofísico del Perú, para financiar la elaboración de los estudios de Zonificación Geofísica - Geotécnica en las áreas de los distritos de San Juan de Iscos, Chongos Bajo y Chupaca, provincia de Chupaca, Chupuro, Huayucachi y Viques provincia de Huancayo, departamento de Junín, en cumplimiento de los…</w:t>
-            </w:r>
-          </w:p>
-        </w:tc>
-      </w:tr>
-      <w:tr>
-        <w:trPr>
-          <w:cantSplit/>
-        </w:trPr>
-        <w:tc>
-          <w:tcPr>
-            <w:tcW w:type="dxa" w:w="2041"/>
-            <w:shd w:val="clear" w:color="auto" w:fill="F2F5FA"/>
-          </w:tcPr>
-          <w:p>
-            <w:pPr>
-              <w:spacing w:before="20" w:after="20" w:line="264" w:lineRule="auto"/>
-            </w:pPr>
-            <w:r>
-              <w:rPr>
-                <w:rFonts w:ascii="Arial" w:hAnsi="Arial" w:eastAsia="Arial"/>
-                <w:b/>
-                <w:i w:val="0"/>
-                <w:color w:val="0A2F5C"/>
-                <w:sz w:val="17"/>
-              </w:rPr>
-              <w:t>Montos citados</w:t>
-            </w:r>
-          </w:p>
-        </w:tc>
-        <w:tc>
-          <w:tcPr>
-            <w:tcW w:type="dxa" w:w="7370"/>
-          </w:tcPr>
-          <w:p>
-            <w:pPr>
-              <w:spacing w:before="20" w:after="20" w:line="264" w:lineRule="auto"/>
-            </w:pPr>
-            <w:r>
-              <w:rPr>
-                <w:rFonts w:ascii="Arial" w:hAnsi="Arial" w:eastAsia="Arial"/>
-                <w:b w:val="0"/>
-                <w:i w:val="0"/>
-                <w:sz w:val="18"/>
-              </w:rPr>
-              <w:t>S/ 3 930 661 286,00 · S/ 93 430,00 · S/ 104 110,00 · S/ 10 680,00</w:t>
+              <w:t>Artículo 1.- Declarar la resolución ficta que por silencio administrativo positivo reconoció con fecha 7 de marzo de 2023, a favor de la empresa ELECTRO DUNAS S.A.A., la sexta modificación de la Concesión Definitiva de Distribución otorgada mediante Resolución Suprema Nº 066-94-EM, a favor de la citada empresa, con la finalidad de incorporar el sector denominado “Eje Chiribamba-Pacococha”, por las razones y fundamentos legales señalados en la parte considerativa de la presente Resolución Ministerial. Artículo 2.- Aprobar el texto de la Sexta Modificación al Contrato de Concesión Nº 028-94, a suscribirse entre el Ministerio de Energía y Minas y la empresa ELECTRO DUNAS S.A.A., a fin de…</w:t>
             </w:r>
           </w:p>
         </w:tc>
@@ -3986,7 +4338,7 @@
               </w:rPr>
               <w:t xml:space="preserve">   ·   </w:t>
             </w:r>
-            <w:hyperlink r:id="rId30">
+            <w:hyperlink r:id="rId33">
               <w:r>
                 <w:rPr>
                   <w:rFonts w:ascii="Arial" w:hAnsi="Arial" w:eastAsia="Arial" w:cs="Arial"/>
@@ -4007,7 +4359,1129 @@
               </w:rPr>
               <w:t xml:space="preserve">   ·   </w:t>
             </w:r>
-            <w:hyperlink r:id="rId31">
+            <w:hyperlink r:id="rId34">
+              <w:r>
+                <w:rPr>
+                  <w:rFonts w:ascii="Arial" w:hAnsi="Arial" w:eastAsia="Arial" w:cs="Arial"/>
+                  <w:color w:val="0B5CAD"/>
+                  <w:sz w:val="17"/>
+                  <w:u w:val="single"/>
+                </w:rPr>
+                <w:t xml:space="preserve">PDF</w:t>
+              </w:r>
+            </w:hyperlink>
+          </w:p>
+        </w:tc>
+      </w:tr>
+    </w:tbl>
+    <w:p>
+      <w:pPr>
+        <w:spacing w:before="0" w:after="120" w:line="276" w:lineRule="auto"/>
+      </w:pPr>
+    </w:p>
+    <w:tbl>
+      <w:tblPr>
+        <w:tblW w:type="auto" w:w="0"/>
+        <w:tblLook w:firstColumn="1" w:firstRow="1" w:lastColumn="0" w:lastRow="0" w:noHBand="0" w:noVBand="1" w:val="04A0"/>
+        <w:tblBorders>
+          <w:top w:val="single" w:sz="4" w:space="0" w:color="C9D2DF"/>
+          <w:left w:val="single" w:sz="4" w:space="0" w:color="C9D2DF"/>
+          <w:bottom w:val="single" w:sz="4" w:space="0" w:color="C9D2DF"/>
+          <w:right w:val="single" w:sz="4" w:space="0" w:color="C9D2DF"/>
+          <w:insideH w:val="single" w:sz="4" w:space="0" w:color="C9D2DF"/>
+          <w:insideV w:val="single" w:sz="4" w:space="0" w:color="C9D2DF"/>
+        </w:tblBorders>
+        <w:tblLayout w:type="fixed"/>
+        <w:tblCellMar>
+          <w:top w:w="50" w:type="dxa"/>
+          <w:bottom w:w="50" w:type="dxa"/>
+          <w:left w:w="100" w:type="dxa"/>
+          <w:right w:w="100" w:type="dxa"/>
+        </w:tblCellMar>
+      </w:tblPr>
+      <w:tblGrid>
+        <w:gridCol w:w="4706"/>
+        <w:gridCol w:w="4706"/>
+      </w:tblGrid>
+      <w:tr>
+        <w:trPr>
+          <w:cantSplit/>
+        </w:trPr>
+        <w:tc>
+          <w:tcPr>
+            <w:tcW w:type="dxa" w:w="7370"/>
+            <w:gridSpan w:val="2"/>
+            <w:shd w:val="clear" w:color="auto" w:fill="E8F0FA"/>
+            <w:tcBorders>
+              <w:left w:val="single" w:sz="30" w:space="0" w:color="1BAF7A"/>
+            </w:tcBorders>
+          </w:tcPr>
+          <w:p>
+            <w:pPr>
+              <w:spacing w:before="20" w:after="20" w:line="264" w:lineRule="auto"/>
+            </w:pPr>
+            <w:r>
+              <w:rPr>
+                <w:rFonts w:ascii="Arial" w:hAnsi="Arial" w:eastAsia="Arial"/>
+                <w:b/>
+                <w:i w:val="0"/>
+                <w:color w:val="0A2F5C"/>
+                <w:sz w:val="19"/>
+              </w:rPr>
+              <w:t>8.  RESOLUCIÓN  N° D000305-2026-OECE-PRE</w:t>
+            </w:r>
+          </w:p>
+        </w:tc>
+      </w:tr>
+      <w:tr>
+        <w:trPr>
+          <w:cantSplit/>
+        </w:trPr>
+        <w:tc>
+          <w:tcPr>
+            <w:tcW w:type="dxa" w:w="2041"/>
+            <w:shd w:val="clear" w:color="auto" w:fill="F2F5FA"/>
+          </w:tcPr>
+          <w:p>
+            <w:pPr>
+              <w:spacing w:before="20" w:after="20" w:line="264" w:lineRule="auto"/>
+            </w:pPr>
+            <w:r>
+              <w:rPr>
+                <w:rFonts w:ascii="Arial" w:hAnsi="Arial" w:eastAsia="Arial"/>
+                <w:b/>
+                <w:i w:val="0"/>
+                <w:color w:val="0A2F5C"/>
+                <w:sz w:val="17"/>
+              </w:rPr>
+              <w:t>Entidad emisora</w:t>
+            </w:r>
+          </w:p>
+        </w:tc>
+        <w:tc>
+          <w:tcPr>
+            <w:tcW w:type="dxa" w:w="7370"/>
+          </w:tcPr>
+          <w:p>
+            <w:pPr>
+              <w:spacing w:before="20" w:after="20" w:line="264" w:lineRule="auto"/>
+            </w:pPr>
+            <w:r>
+              <w:rPr>
+                <w:rFonts w:ascii="Arial" w:hAnsi="Arial" w:eastAsia="Arial"/>
+                <w:b w:val="0"/>
+                <w:i w:val="0"/>
+                <w:sz w:val="18"/>
+              </w:rPr>
+              <w:t>ORGANISMO ESPECIALIZADO PARA LAS CONTRATACIONES PÚBLICAS EFICIENTES</w:t>
+            </w:r>
+          </w:p>
+        </w:tc>
+      </w:tr>
+      <w:tr>
+        <w:trPr>
+          <w:cantSplit/>
+        </w:trPr>
+        <w:tc>
+          <w:tcPr>
+            <w:tcW w:type="dxa" w:w="2041"/>
+            <w:shd w:val="clear" w:color="auto" w:fill="F2F5FA"/>
+          </w:tcPr>
+          <w:p>
+            <w:pPr>
+              <w:spacing w:before="20" w:after="20" w:line="264" w:lineRule="auto"/>
+            </w:pPr>
+            <w:r>
+              <w:rPr>
+                <w:rFonts w:ascii="Arial" w:hAnsi="Arial" w:eastAsia="Arial"/>
+                <w:b/>
+                <w:i w:val="0"/>
+                <w:color w:val="0A2F5C"/>
+                <w:sz w:val="17"/>
+              </w:rPr>
+              <w:t>Publicación</w:t>
+            </w:r>
+          </w:p>
+        </w:tc>
+        <w:tc>
+          <w:tcPr>
+            <w:tcW w:type="dxa" w:w="7370"/>
+          </w:tcPr>
+          <w:p>
+            <w:pPr>
+              <w:spacing w:before="20" w:after="20" w:line="264" w:lineRule="auto"/>
+            </w:pPr>
+            <w:r>
+              <w:rPr>
+                <w:rFonts w:ascii="Arial" w:hAnsi="Arial" w:eastAsia="Arial"/>
+                <w:b w:val="0"/>
+                <w:i w:val="0"/>
+                <w:sz w:val="18"/>
+              </w:rPr>
+              <w:t>31/10/2026 · Edición ordinaria</w:t>
+            </w:r>
+          </w:p>
+        </w:tc>
+      </w:tr>
+      <w:tr>
+        <w:trPr>
+          <w:cantSplit/>
+        </w:trPr>
+        <w:tc>
+          <w:tcPr>
+            <w:tcW w:type="dxa" w:w="2041"/>
+            <w:shd w:val="clear" w:color="auto" w:fill="F2F5FA"/>
+          </w:tcPr>
+          <w:p>
+            <w:pPr>
+              <w:spacing w:before="20" w:after="20" w:line="264" w:lineRule="auto"/>
+            </w:pPr>
+            <w:r>
+              <w:rPr>
+                <w:rFonts w:ascii="Arial" w:hAnsi="Arial" w:eastAsia="Arial"/>
+                <w:b/>
+                <w:i w:val="0"/>
+                <w:color w:val="0A2F5C"/>
+                <w:sz w:val="17"/>
+              </w:rPr>
+              <w:t>Temas</w:t>
+            </w:r>
+          </w:p>
+        </w:tc>
+        <w:tc>
+          <w:tcPr>
+            <w:tcW w:type="dxa" w:w="7370"/>
+          </w:tcPr>
+          <w:p>
+            <w:pPr>
+              <w:spacing w:before="20" w:after="20" w:line="264" w:lineRule="auto"/>
+            </w:pPr>
+            <w:r>
+              <w:rPr>
+                <w:rFonts w:ascii="Arial" w:hAnsi="Arial" w:eastAsia="Arial"/>
+                <w:b w:val="0"/>
+                <w:i w:val="0"/>
+                <w:sz w:val="18"/>
+              </w:rPr>
+              <w:t>Inversiones</w:t>
+            </w:r>
+          </w:p>
+        </w:tc>
+      </w:tr>
+      <w:tr>
+        <w:trPr>
+          <w:cantSplit/>
+        </w:trPr>
+        <w:tc>
+          <w:tcPr>
+            <w:tcW w:type="dxa" w:w="2041"/>
+            <w:shd w:val="clear" w:color="auto" w:fill="F2F5FA"/>
+          </w:tcPr>
+          <w:p>
+            <w:pPr>
+              <w:spacing w:before="20" w:after="20" w:line="264" w:lineRule="auto"/>
+            </w:pPr>
+            <w:r>
+              <w:rPr>
+                <w:rFonts w:ascii="Arial" w:hAnsi="Arial" w:eastAsia="Arial"/>
+                <w:b/>
+                <w:i w:val="0"/>
+                <w:color w:val="0A2F5C"/>
+                <w:sz w:val="17"/>
+              </w:rPr>
+              <w:t>Sumilla</w:t>
+            </w:r>
+          </w:p>
+        </w:tc>
+        <w:tc>
+          <w:tcPr>
+            <w:tcW w:type="dxa" w:w="7370"/>
+          </w:tcPr>
+          <w:p>
+            <w:pPr>
+              <w:spacing w:before="20" w:after="20" w:line="264" w:lineRule="auto"/>
+            </w:pPr>
+            <w:r>
+              <w:rPr>
+                <w:rFonts w:ascii="Arial" w:hAnsi="Arial" w:eastAsia="Arial"/>
+                <w:b w:val="0"/>
+                <w:i w:val="0"/>
+                <w:sz w:val="18"/>
+              </w:rPr>
+              <w:t>Autorizan al Procurador Público y al Procurador Público Adjunto de la Procuraduría Pública Especializada en Materia Hacendaria a conciliar en audiencias y demás diligencias que se deriven de los procesos judiciales tramitados con la Ley Nº 29497 Nueva Ley Procesal del Trabajo y a delegar las facultades para conciliar a favor de los abogados a su cargo</w:t>
+            </w:r>
+          </w:p>
+        </w:tc>
+      </w:tr>
+      <w:tr>
+        <w:trPr>
+          <w:cantSplit/>
+        </w:trPr>
+        <w:tc>
+          <w:tcPr>
+            <w:tcW w:type="dxa" w:w="2041"/>
+            <w:shd w:val="clear" w:color="auto" w:fill="F2F5FA"/>
+          </w:tcPr>
+          <w:p>
+            <w:pPr>
+              <w:spacing w:before="20" w:after="20" w:line="264" w:lineRule="auto"/>
+            </w:pPr>
+            <w:r>
+              <w:rPr>
+                <w:rFonts w:ascii="Arial" w:hAnsi="Arial" w:eastAsia="Arial"/>
+                <w:b/>
+                <w:i w:val="0"/>
+                <w:color w:val="0A2F5C"/>
+                <w:sz w:val="17"/>
+              </w:rPr>
+              <w:t>Disposición principal</w:t>
+            </w:r>
+          </w:p>
+        </w:tc>
+        <w:tc>
+          <w:tcPr>
+            <w:tcW w:type="dxa" w:w="7370"/>
+          </w:tcPr>
+          <w:p>
+            <w:pPr>
+              <w:spacing w:before="20" w:after="20" w:line="264" w:lineRule="auto"/>
+            </w:pPr>
+            <w:r>
+              <w:rPr>
+                <w:rFonts w:ascii="Arial" w:hAnsi="Arial" w:eastAsia="Arial"/>
+                <w:b w:val="0"/>
+                <w:i w:val="0"/>
+                <w:sz w:val="18"/>
+              </w:rPr>
+              <w:t>Artículo 1.- Autorizar al Procurador Público y al Procurador Público Adjunto de la Procuraduría Pública Especializada en Materia Hacendaria, para que, de manera indistinta, puedan asistir y conciliar en las audiencias de conciliación que se realicen en el marco de los procesos judiciales que se tramiten bajo los alcances de la Ley Nº 29497, Nueva Ley Procesal del Trabajo, en los que el Organismo Especializado para las Contrataciones Públicas Eficientes (OECE) sea parte demandada o demandante, siempre que resulten de su competencia de conformidad con lo establecido en los artículos 4 y 5 de los “Criterios adicionales sobre las competencias de la Procuraduría Pública Especializada en Materia…</w:t>
+            </w:r>
+          </w:p>
+        </w:tc>
+      </w:tr>
+      <w:tr>
+        <w:trPr>
+          <w:cantSplit/>
+        </w:trPr>
+        <w:tc>
+          <w:tcPr>
+            <w:tcW w:type="dxa" w:w="2041"/>
+            <w:shd w:val="clear" w:color="auto" w:fill="F2F5FA"/>
+          </w:tcPr>
+          <w:p>
+            <w:pPr>
+              <w:spacing w:before="20" w:after="20" w:line="264" w:lineRule="auto"/>
+            </w:pPr>
+            <w:r>
+              <w:rPr>
+                <w:rFonts w:ascii="Arial" w:hAnsi="Arial" w:eastAsia="Arial"/>
+                <w:b/>
+                <w:i w:val="0"/>
+                <w:color w:val="0A2F5C"/>
+                <w:sz w:val="17"/>
+              </w:rPr>
+              <w:t>Enlaces</w:t>
+            </w:r>
+          </w:p>
+        </w:tc>
+        <w:tc>
+          <w:tcPr>
+            <w:tcW w:type="dxa" w:w="7370"/>
+          </w:tcPr>
+          <w:p>
+            <w:pPr>
+              <w:spacing w:before="20" w:after="20" w:line="264" w:lineRule="auto"/>
+            </w:pPr>
+            <w:hyperlink r:id="rId18">
+              <w:r>
+                <w:rPr>
+                  <w:rFonts w:ascii="Arial" w:hAnsi="Arial" w:eastAsia="Arial" w:cs="Arial"/>
+                  <w:color w:val="0B5CAD"/>
+                  <w:sz w:val="17"/>
+                  <w:u w:val="single"/>
+                </w:rPr>
+                <w:t xml:space="preserve">Texto completo</w:t>
+              </w:r>
+            </w:hyperlink>
+            <w:r>
+              <w:rPr>
+                <w:rFonts w:ascii="Arial" w:hAnsi="Arial" w:eastAsia="Arial"/>
+                <w:b w:val="0"/>
+                <w:i w:val="0"/>
+                <w:color w:val="5B6880"/>
+                <w:sz w:val="17"/>
+              </w:rPr>
+              <w:t xml:space="preserve">   ·   </w:t>
+            </w:r>
+            <w:hyperlink r:id="rId35">
+              <w:r>
+                <w:rPr>
+                  <w:rFonts w:ascii="Arial" w:hAnsi="Arial" w:eastAsia="Arial" w:cs="Arial"/>
+                  <w:color w:val="0B5CAD"/>
+                  <w:sz w:val="17"/>
+                  <w:u w:val="single"/>
+                </w:rPr>
+                <w:t xml:space="preserve">El Peruano</w:t>
+              </w:r>
+            </w:hyperlink>
+            <w:r>
+              <w:rPr>
+                <w:rFonts w:ascii="Arial" w:hAnsi="Arial" w:eastAsia="Arial"/>
+                <w:b w:val="0"/>
+                <w:i w:val="0"/>
+                <w:color w:val="5B6880"/>
+                <w:sz w:val="17"/>
+              </w:rPr>
+              <w:t xml:space="preserve">   ·   </w:t>
+            </w:r>
+            <w:hyperlink r:id="rId36">
+              <w:r>
+                <w:rPr>
+                  <w:rFonts w:ascii="Arial" w:hAnsi="Arial" w:eastAsia="Arial" w:cs="Arial"/>
+                  <w:color w:val="0B5CAD"/>
+                  <w:sz w:val="17"/>
+                  <w:u w:val="single"/>
+                </w:rPr>
+                <w:t xml:space="preserve">PDF</w:t>
+              </w:r>
+            </w:hyperlink>
+          </w:p>
+        </w:tc>
+      </w:tr>
+    </w:tbl>
+    <w:p>
+      <w:pPr>
+        <w:spacing w:before="0" w:after="120" w:line="276" w:lineRule="auto"/>
+      </w:pPr>
+    </w:p>
+    <w:tbl>
+      <w:tblPr>
+        <w:tblW w:type="auto" w:w="0"/>
+        <w:tblLook w:firstColumn="1" w:firstRow="1" w:lastColumn="0" w:lastRow="0" w:noHBand="0" w:noVBand="1" w:val="04A0"/>
+        <w:tblBorders>
+          <w:top w:val="single" w:sz="4" w:space="0" w:color="C9D2DF"/>
+          <w:left w:val="single" w:sz="4" w:space="0" w:color="C9D2DF"/>
+          <w:bottom w:val="single" w:sz="4" w:space="0" w:color="C9D2DF"/>
+          <w:right w:val="single" w:sz="4" w:space="0" w:color="C9D2DF"/>
+          <w:insideH w:val="single" w:sz="4" w:space="0" w:color="C9D2DF"/>
+          <w:insideV w:val="single" w:sz="4" w:space="0" w:color="C9D2DF"/>
+        </w:tblBorders>
+        <w:tblLayout w:type="fixed"/>
+        <w:tblCellMar>
+          <w:top w:w="50" w:type="dxa"/>
+          <w:bottom w:w="50" w:type="dxa"/>
+          <w:left w:w="100" w:type="dxa"/>
+          <w:right w:w="100" w:type="dxa"/>
+        </w:tblCellMar>
+      </w:tblPr>
+      <w:tblGrid>
+        <w:gridCol w:w="4706"/>
+        <w:gridCol w:w="4706"/>
+      </w:tblGrid>
+      <w:tr>
+        <w:trPr>
+          <w:cantSplit/>
+        </w:trPr>
+        <w:tc>
+          <w:tcPr>
+            <w:tcW w:type="dxa" w:w="7370"/>
+            <w:gridSpan w:val="2"/>
+            <w:shd w:val="clear" w:color="auto" w:fill="E8F0FA"/>
+            <w:tcBorders>
+              <w:left w:val="single" w:sz="30" w:space="0" w:color="1BAF7A"/>
+            </w:tcBorders>
+          </w:tcPr>
+          <w:p>
+            <w:pPr>
+              <w:spacing w:before="20" w:after="20" w:line="264" w:lineRule="auto"/>
+            </w:pPr>
+            <w:r>
+              <w:rPr>
+                <w:rFonts w:ascii="Arial" w:hAnsi="Arial" w:eastAsia="Arial"/>
+                <w:b/>
+                <w:i w:val="0"/>
+                <w:color w:val="0A2F5C"/>
+                <w:sz w:val="19"/>
+              </w:rPr>
+              <w:t>9.  RESOLUCIÓN  N° 000286-2026-GG/OSIPTEL</w:t>
+            </w:r>
+          </w:p>
+        </w:tc>
+      </w:tr>
+      <w:tr>
+        <w:trPr>
+          <w:cantSplit/>
+        </w:trPr>
+        <w:tc>
+          <w:tcPr>
+            <w:tcW w:type="dxa" w:w="2041"/>
+            <w:shd w:val="clear" w:color="auto" w:fill="F2F5FA"/>
+          </w:tcPr>
+          <w:p>
+            <w:pPr>
+              <w:spacing w:before="20" w:after="20" w:line="264" w:lineRule="auto"/>
+            </w:pPr>
+            <w:r>
+              <w:rPr>
+                <w:rFonts w:ascii="Arial" w:hAnsi="Arial" w:eastAsia="Arial"/>
+                <w:b/>
+                <w:i w:val="0"/>
+                <w:color w:val="0A2F5C"/>
+                <w:sz w:val="17"/>
+              </w:rPr>
+              <w:t>Entidad emisora</w:t>
+            </w:r>
+          </w:p>
+        </w:tc>
+        <w:tc>
+          <w:tcPr>
+            <w:tcW w:type="dxa" w:w="7370"/>
+          </w:tcPr>
+          <w:p>
+            <w:pPr>
+              <w:spacing w:before="20" w:after="20" w:line="264" w:lineRule="auto"/>
+            </w:pPr>
+            <w:r>
+              <w:rPr>
+                <w:rFonts w:ascii="Arial" w:hAnsi="Arial" w:eastAsia="Arial"/>
+                <w:b w:val="0"/>
+                <w:i w:val="0"/>
+                <w:sz w:val="18"/>
+              </w:rPr>
+              <w:t>ORGANISMO SUPERVISOR DE INVERSIÓN PRIVADA EN TELECOMUNICACIONES</w:t>
+            </w:r>
+          </w:p>
+        </w:tc>
+      </w:tr>
+      <w:tr>
+        <w:trPr>
+          <w:cantSplit/>
+        </w:trPr>
+        <w:tc>
+          <w:tcPr>
+            <w:tcW w:type="dxa" w:w="2041"/>
+            <w:shd w:val="clear" w:color="auto" w:fill="F2F5FA"/>
+          </w:tcPr>
+          <w:p>
+            <w:pPr>
+              <w:spacing w:before="20" w:after="20" w:line="264" w:lineRule="auto"/>
+            </w:pPr>
+            <w:r>
+              <w:rPr>
+                <w:rFonts w:ascii="Arial" w:hAnsi="Arial" w:eastAsia="Arial"/>
+                <w:b/>
+                <w:i w:val="0"/>
+                <w:color w:val="0A2F5C"/>
+                <w:sz w:val="17"/>
+              </w:rPr>
+              <w:t>Publicación</w:t>
+            </w:r>
+          </w:p>
+        </w:tc>
+        <w:tc>
+          <w:tcPr>
+            <w:tcW w:type="dxa" w:w="7370"/>
+          </w:tcPr>
+          <w:p>
+            <w:pPr>
+              <w:spacing w:before="20" w:after="20" w:line="264" w:lineRule="auto"/>
+            </w:pPr>
+            <w:r>
+              <w:rPr>
+                <w:rFonts w:ascii="Arial" w:hAnsi="Arial" w:eastAsia="Arial"/>
+                <w:b w:val="0"/>
+                <w:i w:val="0"/>
+                <w:sz w:val="18"/>
+              </w:rPr>
+              <w:t>31/10/2026 · Edición ordinaria</w:t>
+            </w:r>
+          </w:p>
+        </w:tc>
+      </w:tr>
+      <w:tr>
+        <w:trPr>
+          <w:cantSplit/>
+        </w:trPr>
+        <w:tc>
+          <w:tcPr>
+            <w:tcW w:type="dxa" w:w="2041"/>
+            <w:shd w:val="clear" w:color="auto" w:fill="F2F5FA"/>
+          </w:tcPr>
+          <w:p>
+            <w:pPr>
+              <w:spacing w:before="20" w:after="20" w:line="264" w:lineRule="auto"/>
+            </w:pPr>
+            <w:r>
+              <w:rPr>
+                <w:rFonts w:ascii="Arial" w:hAnsi="Arial" w:eastAsia="Arial"/>
+                <w:b/>
+                <w:i w:val="0"/>
+                <w:color w:val="0A2F5C"/>
+                <w:sz w:val="17"/>
+              </w:rPr>
+              <w:t>Temas</w:t>
+            </w:r>
+          </w:p>
+        </w:tc>
+        <w:tc>
+          <w:tcPr>
+            <w:tcW w:type="dxa" w:w="7370"/>
+          </w:tcPr>
+          <w:p>
+            <w:pPr>
+              <w:spacing w:before="20" w:after="20" w:line="264" w:lineRule="auto"/>
+            </w:pPr>
+            <w:r>
+              <w:rPr>
+                <w:rFonts w:ascii="Arial" w:hAnsi="Arial" w:eastAsia="Arial"/>
+                <w:b w:val="0"/>
+                <w:i w:val="0"/>
+                <w:sz w:val="18"/>
+              </w:rPr>
+              <w:t>Inversiones</w:t>
+            </w:r>
+          </w:p>
+        </w:tc>
+      </w:tr>
+      <w:tr>
+        <w:trPr>
+          <w:cantSplit/>
+        </w:trPr>
+        <w:tc>
+          <w:tcPr>
+            <w:tcW w:type="dxa" w:w="2041"/>
+            <w:shd w:val="clear" w:color="auto" w:fill="F2F5FA"/>
+          </w:tcPr>
+          <w:p>
+            <w:pPr>
+              <w:spacing w:before="20" w:after="20" w:line="264" w:lineRule="auto"/>
+            </w:pPr>
+            <w:r>
+              <w:rPr>
+                <w:rFonts w:ascii="Arial" w:hAnsi="Arial" w:eastAsia="Arial"/>
+                <w:b/>
+                <w:i w:val="0"/>
+                <w:color w:val="0A2F5C"/>
+                <w:sz w:val="17"/>
+              </w:rPr>
+              <w:t>Sumilla</w:t>
+            </w:r>
+          </w:p>
+        </w:tc>
+        <w:tc>
+          <w:tcPr>
+            <w:tcW w:type="dxa" w:w="7370"/>
+          </w:tcPr>
+          <w:p>
+            <w:pPr>
+              <w:spacing w:before="20" w:after="20" w:line="264" w:lineRule="auto"/>
+            </w:pPr>
+            <w:r>
+              <w:rPr>
+                <w:rFonts w:ascii="Arial" w:hAnsi="Arial" w:eastAsia="Arial"/>
+                <w:b w:val="0"/>
+                <w:i w:val="0"/>
+                <w:sz w:val="18"/>
+              </w:rPr>
+              <w:t>Modifican el Instructivo Técnico para el cumplimiento de las Normas Complementarias para la Implementación del Registro Nacional de Equipos Terminales Móviles para la Seguridad aprobado por Resolución de Gerencia General N° 00070-2020-GG/OSIPTEL</w:t>
+            </w:r>
+          </w:p>
+        </w:tc>
+      </w:tr>
+      <w:tr>
+        <w:trPr>
+          <w:cantSplit/>
+        </w:trPr>
+        <w:tc>
+          <w:tcPr>
+            <w:tcW w:type="dxa" w:w="2041"/>
+            <w:shd w:val="clear" w:color="auto" w:fill="F2F5FA"/>
+          </w:tcPr>
+          <w:p>
+            <w:pPr>
+              <w:spacing w:before="20" w:after="20" w:line="264" w:lineRule="auto"/>
+            </w:pPr>
+            <w:r>
+              <w:rPr>
+                <w:rFonts w:ascii="Arial" w:hAnsi="Arial" w:eastAsia="Arial"/>
+                <w:b/>
+                <w:i w:val="0"/>
+                <w:color w:val="0A2F5C"/>
+                <w:sz w:val="17"/>
+              </w:rPr>
+              <w:t>Disposición principal</w:t>
+            </w:r>
+          </w:p>
+        </w:tc>
+        <w:tc>
+          <w:tcPr>
+            <w:tcW w:type="dxa" w:w="7370"/>
+          </w:tcPr>
+          <w:p>
+            <w:pPr>
+              <w:spacing w:before="20" w:after="20" w:line="264" w:lineRule="auto"/>
+            </w:pPr>
+            <w:r>
+              <w:rPr>
+                <w:rFonts w:ascii="Arial" w:hAnsi="Arial" w:eastAsia="Arial"/>
+                <w:b w:val="0"/>
+                <w:i w:val="0"/>
+                <w:sz w:val="18"/>
+              </w:rPr>
+              <w:t>Artículo 1.- Modificar el Instructivo Técnico para el cumplimiento de las Normas Complementarias para la Implementación del Registro Nacional de Equipos Terminales Móviles para la Seguridad, aprobado por Resolución de Gerencia General Nº 00070-2020-GG/OSIPTEL; que comprende la modificación del “Formato Nº 16: Registro en línea de la información de la fecha y hora efectiva del bloqueo o desbloqueo del equipo terminal móvil, y de la suspensión, baja o reactivación del servicio”; e incorporación del “Formato Nº 28: Entrega de la información para la baja o reactivación de los servicios públicos móviles de telecomunicaciones y/o el bloqueo o desbloqueo de equipos terminales móviles utilizados o…</w:t>
+            </w:r>
+          </w:p>
+        </w:tc>
+      </w:tr>
+      <w:tr>
+        <w:trPr>
+          <w:cantSplit/>
+        </w:trPr>
+        <w:tc>
+          <w:tcPr>
+            <w:tcW w:type="dxa" w:w="2041"/>
+            <w:shd w:val="clear" w:color="auto" w:fill="F2F5FA"/>
+          </w:tcPr>
+          <w:p>
+            <w:pPr>
+              <w:spacing w:before="20" w:after="20" w:line="264" w:lineRule="auto"/>
+            </w:pPr>
+            <w:r>
+              <w:rPr>
+                <w:rFonts w:ascii="Arial" w:hAnsi="Arial" w:eastAsia="Arial"/>
+                <w:b/>
+                <w:i w:val="0"/>
+                <w:color w:val="0A2F5C"/>
+                <w:sz w:val="17"/>
+              </w:rPr>
+              <w:t>Enlaces</w:t>
+            </w:r>
+          </w:p>
+        </w:tc>
+        <w:tc>
+          <w:tcPr>
+            <w:tcW w:type="dxa" w:w="7370"/>
+          </w:tcPr>
+          <w:p>
+            <w:pPr>
+              <w:spacing w:before="20" w:after="20" w:line="264" w:lineRule="auto"/>
+            </w:pPr>
+            <w:hyperlink r:id="rId19">
+              <w:r>
+                <w:rPr>
+                  <w:rFonts w:ascii="Arial" w:hAnsi="Arial" w:eastAsia="Arial" w:cs="Arial"/>
+                  <w:color w:val="0B5CAD"/>
+                  <w:sz w:val="17"/>
+                  <w:u w:val="single"/>
+                </w:rPr>
+                <w:t xml:space="preserve">Texto completo</w:t>
+              </w:r>
+            </w:hyperlink>
+            <w:r>
+              <w:rPr>
+                <w:rFonts w:ascii="Arial" w:hAnsi="Arial" w:eastAsia="Arial"/>
+                <w:b w:val="0"/>
+                <w:i w:val="0"/>
+                <w:color w:val="5B6880"/>
+                <w:sz w:val="17"/>
+              </w:rPr>
+              <w:t xml:space="preserve">   ·   </w:t>
+            </w:r>
+            <w:hyperlink r:id="rId37">
+              <w:r>
+                <w:rPr>
+                  <w:rFonts w:ascii="Arial" w:hAnsi="Arial" w:eastAsia="Arial" w:cs="Arial"/>
+                  <w:color w:val="0B5CAD"/>
+                  <w:sz w:val="17"/>
+                  <w:u w:val="single"/>
+                </w:rPr>
+                <w:t xml:space="preserve">El Peruano</w:t>
+              </w:r>
+            </w:hyperlink>
+            <w:r>
+              <w:rPr>
+                <w:rFonts w:ascii="Arial" w:hAnsi="Arial" w:eastAsia="Arial"/>
+                <w:b w:val="0"/>
+                <w:i w:val="0"/>
+                <w:color w:val="5B6880"/>
+                <w:sz w:val="17"/>
+              </w:rPr>
+              <w:t xml:space="preserve">   ·   </w:t>
+            </w:r>
+            <w:hyperlink r:id="rId38">
+              <w:r>
+                <w:rPr>
+                  <w:rFonts w:ascii="Arial" w:hAnsi="Arial" w:eastAsia="Arial" w:cs="Arial"/>
+                  <w:color w:val="0B5CAD"/>
+                  <w:sz w:val="17"/>
+                  <w:u w:val="single"/>
+                </w:rPr>
+                <w:t xml:space="preserve">PDF</w:t>
+              </w:r>
+            </w:hyperlink>
+          </w:p>
+        </w:tc>
+      </w:tr>
+    </w:tbl>
+    <w:p>
+      <w:pPr>
+        <w:spacing w:before="0" w:after="120" w:line="276" w:lineRule="auto"/>
+      </w:pPr>
+    </w:p>
+    <w:tbl>
+      <w:tblPr>
+        <w:tblW w:type="auto" w:w="0"/>
+        <w:tblLook w:firstColumn="1" w:firstRow="1" w:lastColumn="0" w:lastRow="0" w:noHBand="0" w:noVBand="1" w:val="04A0"/>
+        <w:tblBorders>
+          <w:top w:val="single" w:sz="4" w:space="0" w:color="C9D2DF"/>
+          <w:left w:val="single" w:sz="4" w:space="0" w:color="C9D2DF"/>
+          <w:bottom w:val="single" w:sz="4" w:space="0" w:color="C9D2DF"/>
+          <w:right w:val="single" w:sz="4" w:space="0" w:color="C9D2DF"/>
+          <w:insideH w:val="single" w:sz="4" w:space="0" w:color="C9D2DF"/>
+          <w:insideV w:val="single" w:sz="4" w:space="0" w:color="C9D2DF"/>
+        </w:tblBorders>
+        <w:tblLayout w:type="fixed"/>
+        <w:tblCellMar>
+          <w:top w:w="50" w:type="dxa"/>
+          <w:bottom w:w="50" w:type="dxa"/>
+          <w:left w:w="100" w:type="dxa"/>
+          <w:right w:w="100" w:type="dxa"/>
+        </w:tblCellMar>
+      </w:tblPr>
+      <w:tblGrid>
+        <w:gridCol w:w="4706"/>
+        <w:gridCol w:w="4706"/>
+      </w:tblGrid>
+      <w:tr>
+        <w:trPr>
+          <w:cantSplit/>
+        </w:trPr>
+        <w:tc>
+          <w:tcPr>
+            <w:tcW w:type="dxa" w:w="7370"/>
+            <w:gridSpan w:val="2"/>
+            <w:shd w:val="clear" w:color="auto" w:fill="E8F0FA"/>
+            <w:tcBorders>
+              <w:left w:val="single" w:sz="30" w:space="0" w:color="1BAF7A"/>
+            </w:tcBorders>
+          </w:tcPr>
+          <w:p>
+            <w:pPr>
+              <w:spacing w:before="20" w:after="20" w:line="264" w:lineRule="auto"/>
+            </w:pPr>
+            <w:r>
+              <w:rPr>
+                <w:rFonts w:ascii="Arial" w:hAnsi="Arial" w:eastAsia="Arial"/>
+                <w:b/>
+                <w:i w:val="0"/>
+                <w:color w:val="0A2F5C"/>
+                <w:sz w:val="19"/>
+              </w:rPr>
+              <w:t>10.  RESOLUCIÓN  N° 000140 2026-CD/OSIPTEL</w:t>
+            </w:r>
+          </w:p>
+        </w:tc>
+      </w:tr>
+      <w:tr>
+        <w:trPr>
+          <w:cantSplit/>
+        </w:trPr>
+        <w:tc>
+          <w:tcPr>
+            <w:tcW w:type="dxa" w:w="2041"/>
+            <w:shd w:val="clear" w:color="auto" w:fill="F2F5FA"/>
+          </w:tcPr>
+          <w:p>
+            <w:pPr>
+              <w:spacing w:before="20" w:after="20" w:line="264" w:lineRule="auto"/>
+            </w:pPr>
+            <w:r>
+              <w:rPr>
+                <w:rFonts w:ascii="Arial" w:hAnsi="Arial" w:eastAsia="Arial"/>
+                <w:b/>
+                <w:i w:val="0"/>
+                <w:color w:val="0A2F5C"/>
+                <w:sz w:val="17"/>
+              </w:rPr>
+              <w:t>Entidad emisora</w:t>
+            </w:r>
+          </w:p>
+        </w:tc>
+        <w:tc>
+          <w:tcPr>
+            <w:tcW w:type="dxa" w:w="7370"/>
+          </w:tcPr>
+          <w:p>
+            <w:pPr>
+              <w:spacing w:before="20" w:after="20" w:line="264" w:lineRule="auto"/>
+            </w:pPr>
+            <w:r>
+              <w:rPr>
+                <w:rFonts w:ascii="Arial" w:hAnsi="Arial" w:eastAsia="Arial"/>
+                <w:b w:val="0"/>
+                <w:i w:val="0"/>
+                <w:sz w:val="18"/>
+              </w:rPr>
+              <w:t>ORGANISMO SUPERVISOR DE INVERSIÓN PRIVADA EN TELECOMUNICACIONES</w:t>
+            </w:r>
+          </w:p>
+        </w:tc>
+      </w:tr>
+      <w:tr>
+        <w:trPr>
+          <w:cantSplit/>
+        </w:trPr>
+        <w:tc>
+          <w:tcPr>
+            <w:tcW w:type="dxa" w:w="2041"/>
+            <w:shd w:val="clear" w:color="auto" w:fill="F2F5FA"/>
+          </w:tcPr>
+          <w:p>
+            <w:pPr>
+              <w:spacing w:before="20" w:after="20" w:line="264" w:lineRule="auto"/>
+            </w:pPr>
+            <w:r>
+              <w:rPr>
+                <w:rFonts w:ascii="Arial" w:hAnsi="Arial" w:eastAsia="Arial"/>
+                <w:b/>
+                <w:i w:val="0"/>
+                <w:color w:val="0A2F5C"/>
+                <w:sz w:val="17"/>
+              </w:rPr>
+              <w:t>Publicación</w:t>
+            </w:r>
+          </w:p>
+        </w:tc>
+        <w:tc>
+          <w:tcPr>
+            <w:tcW w:type="dxa" w:w="7370"/>
+          </w:tcPr>
+          <w:p>
+            <w:pPr>
+              <w:spacing w:before="20" w:after="20" w:line="264" w:lineRule="auto"/>
+            </w:pPr>
+            <w:r>
+              <w:rPr>
+                <w:rFonts w:ascii="Arial" w:hAnsi="Arial" w:eastAsia="Arial"/>
+                <w:b w:val="0"/>
+                <w:i w:val="0"/>
+                <w:sz w:val="18"/>
+              </w:rPr>
+              <w:t>31/10/2026 · Edición ordinaria</w:t>
+            </w:r>
+          </w:p>
+        </w:tc>
+      </w:tr>
+      <w:tr>
+        <w:trPr>
+          <w:cantSplit/>
+        </w:trPr>
+        <w:tc>
+          <w:tcPr>
+            <w:tcW w:type="dxa" w:w="2041"/>
+            <w:shd w:val="clear" w:color="auto" w:fill="F2F5FA"/>
+          </w:tcPr>
+          <w:p>
+            <w:pPr>
+              <w:spacing w:before="20" w:after="20" w:line="264" w:lineRule="auto"/>
+            </w:pPr>
+            <w:r>
+              <w:rPr>
+                <w:rFonts w:ascii="Arial" w:hAnsi="Arial" w:eastAsia="Arial"/>
+                <w:b/>
+                <w:i w:val="0"/>
+                <w:color w:val="0A2F5C"/>
+                <w:sz w:val="17"/>
+              </w:rPr>
+              <w:t>Temas</w:t>
+            </w:r>
+          </w:p>
+        </w:tc>
+        <w:tc>
+          <w:tcPr>
+            <w:tcW w:type="dxa" w:w="7370"/>
+          </w:tcPr>
+          <w:p>
+            <w:pPr>
+              <w:spacing w:before="20" w:after="20" w:line="264" w:lineRule="auto"/>
+            </w:pPr>
+            <w:r>
+              <w:rPr>
+                <w:rFonts w:ascii="Arial" w:hAnsi="Arial" w:eastAsia="Arial"/>
+                <w:b w:val="0"/>
+                <w:i w:val="0"/>
+                <w:sz w:val="18"/>
+              </w:rPr>
+              <w:t>Inversiones</w:t>
+            </w:r>
+          </w:p>
+        </w:tc>
+      </w:tr>
+      <w:tr>
+        <w:trPr>
+          <w:cantSplit/>
+        </w:trPr>
+        <w:tc>
+          <w:tcPr>
+            <w:tcW w:type="dxa" w:w="2041"/>
+            <w:shd w:val="clear" w:color="auto" w:fill="F2F5FA"/>
+          </w:tcPr>
+          <w:p>
+            <w:pPr>
+              <w:spacing w:before="20" w:after="20" w:line="264" w:lineRule="auto"/>
+            </w:pPr>
+            <w:r>
+              <w:rPr>
+                <w:rFonts w:ascii="Arial" w:hAnsi="Arial" w:eastAsia="Arial"/>
+                <w:b/>
+                <w:i w:val="0"/>
+                <w:color w:val="0A2F5C"/>
+                <w:sz w:val="17"/>
+              </w:rPr>
+              <w:t>Sumilla</w:t>
+            </w:r>
+          </w:p>
+        </w:tc>
+        <w:tc>
+          <w:tcPr>
+            <w:tcW w:type="dxa" w:w="7370"/>
+          </w:tcPr>
+          <w:p>
+            <w:pPr>
+              <w:spacing w:before="20" w:after="20" w:line="264" w:lineRule="auto"/>
+            </w:pPr>
+            <w:r>
+              <w:rPr>
+                <w:rFonts w:ascii="Arial" w:hAnsi="Arial" w:eastAsia="Arial"/>
+                <w:b w:val="0"/>
+                <w:i w:val="0"/>
+                <w:sz w:val="18"/>
+              </w:rPr>
+              <w:t>Aprueban Mandato de Interconexión entre las empresas FIBERMAX TELECOM S.A.C. e INTEGRATEL PERÚ S.A.A.</w:t>
+            </w:r>
+          </w:p>
+        </w:tc>
+      </w:tr>
+      <w:tr>
+        <w:trPr>
+          <w:cantSplit/>
+        </w:trPr>
+        <w:tc>
+          <w:tcPr>
+            <w:tcW w:type="dxa" w:w="2041"/>
+            <w:shd w:val="clear" w:color="auto" w:fill="F2F5FA"/>
+          </w:tcPr>
+          <w:p>
+            <w:pPr>
+              <w:spacing w:before="20" w:after="20" w:line="264" w:lineRule="auto"/>
+            </w:pPr>
+            <w:r>
+              <w:rPr>
+                <w:rFonts w:ascii="Arial" w:hAnsi="Arial" w:eastAsia="Arial"/>
+                <w:b/>
+                <w:i w:val="0"/>
+                <w:color w:val="0A2F5C"/>
+                <w:sz w:val="17"/>
+              </w:rPr>
+              <w:t>Disposición principal</w:t>
+            </w:r>
+          </w:p>
+        </w:tc>
+        <w:tc>
+          <w:tcPr>
+            <w:tcW w:type="dxa" w:w="7370"/>
+          </w:tcPr>
+          <w:p>
+            <w:pPr>
+              <w:spacing w:before="20" w:after="20" w:line="264" w:lineRule="auto"/>
+            </w:pPr>
+            <w:r>
+              <w:rPr>
+                <w:rFonts w:ascii="Arial" w:hAnsi="Arial" w:eastAsia="Arial"/>
+                <w:b w:val="0"/>
+                <w:i w:val="0"/>
+                <w:sz w:val="18"/>
+              </w:rPr>
+              <w:t>Artículo 1.- Aprobar el Mandato de Interconexión, correspondiente al procedimiento tramitado con el Expediente N° 00001-2026-CD-DPRC/MI entre las empresas FIBERMAX TELECOM S.A.C. e INTEGRATEL PERÚ S.A.A., a efectos de incorporar el intercambio de SMS, al contrato de Interconexión, aprobado mediante la Resolución N° 00389-2023-GG/OSIPTEL y modificatorias, conforme al anexo del Informe N° 000207-2026-DPRC/OSIPTEL. Artículo 2.- El mandato de Interconexión que se aprueba en el artículo 1 de la presente resolución, entra en vigencia al día siguiente de la publicación de la presente resolución en el D iario O ficial El Peruano. Artículo 3.- Encargar a la Oficina de Administración y Finanzas…</w:t>
+            </w:r>
+          </w:p>
+        </w:tc>
+      </w:tr>
+      <w:tr>
+        <w:trPr>
+          <w:cantSplit/>
+        </w:trPr>
+        <w:tc>
+          <w:tcPr>
+            <w:tcW w:type="dxa" w:w="2041"/>
+            <w:shd w:val="clear" w:color="auto" w:fill="F2F5FA"/>
+          </w:tcPr>
+          <w:p>
+            <w:pPr>
+              <w:spacing w:before="20" w:after="20" w:line="264" w:lineRule="auto"/>
+            </w:pPr>
+            <w:r>
+              <w:rPr>
+                <w:rFonts w:ascii="Arial" w:hAnsi="Arial" w:eastAsia="Arial"/>
+                <w:b/>
+                <w:i w:val="0"/>
+                <w:color w:val="0A2F5C"/>
+                <w:sz w:val="17"/>
+              </w:rPr>
+              <w:t>Enlaces</w:t>
+            </w:r>
+          </w:p>
+        </w:tc>
+        <w:tc>
+          <w:tcPr>
+            <w:tcW w:type="dxa" w:w="7370"/>
+          </w:tcPr>
+          <w:p>
+            <w:pPr>
+              <w:spacing w:before="20" w:after="20" w:line="264" w:lineRule="auto"/>
+            </w:pPr>
+            <w:hyperlink r:id="rId20">
+              <w:r>
+                <w:rPr>
+                  <w:rFonts w:ascii="Arial" w:hAnsi="Arial" w:eastAsia="Arial" w:cs="Arial"/>
+                  <w:color w:val="0B5CAD"/>
+                  <w:sz w:val="17"/>
+                  <w:u w:val="single"/>
+                </w:rPr>
+                <w:t xml:space="preserve">Texto completo</w:t>
+              </w:r>
+            </w:hyperlink>
+            <w:r>
+              <w:rPr>
+                <w:rFonts w:ascii="Arial" w:hAnsi="Arial" w:eastAsia="Arial"/>
+                <w:b w:val="0"/>
+                <w:i w:val="0"/>
+                <w:color w:val="5B6880"/>
+                <w:sz w:val="17"/>
+              </w:rPr>
+              <w:t xml:space="preserve">   ·   </w:t>
+            </w:r>
+            <w:hyperlink r:id="rId39">
+              <w:r>
+                <w:rPr>
+                  <w:rFonts w:ascii="Arial" w:hAnsi="Arial" w:eastAsia="Arial" w:cs="Arial"/>
+                  <w:color w:val="0B5CAD"/>
+                  <w:sz w:val="17"/>
+                  <w:u w:val="single"/>
+                </w:rPr>
+                <w:t xml:space="preserve">El Peruano</w:t>
+              </w:r>
+            </w:hyperlink>
+            <w:r>
+              <w:rPr>
+                <w:rFonts w:ascii="Arial" w:hAnsi="Arial" w:eastAsia="Arial"/>
+                <w:b w:val="0"/>
+                <w:i w:val="0"/>
+                <w:color w:val="5B6880"/>
+                <w:sz w:val="17"/>
+              </w:rPr>
+              <w:t xml:space="preserve">   ·   </w:t>
+            </w:r>
+            <w:hyperlink r:id="rId40">
               <w:r>
                 <w:rPr>
                   <w:rFonts w:ascii="Arial" w:hAnsi="Arial" w:eastAsia="Arial" w:cs="Arial"/>
@@ -4055,7 +5529,7 @@
         </w:rPr>
         <w:t xml:space="preserve">se revisan todas las normas publicadas en el Diario Oficial El Peruano en el periodo. Una norma se selecciona cuando su entidad, título o sumilla contiene alguno de los términos definidos para cada tema, o cuando su texto completo menciona a la ATU. Los criterios pueden consultarse y editarse en el panel: </w:t>
       </w:r>
-      <w:hyperlink r:id="rId32">
+      <w:hyperlink r:id="rId41">
         <w:r>
           <w:rPr>
             <w:rFonts w:ascii="Arial" w:hAnsi="Arial" w:eastAsia="Arial" w:cs="Arial"/>

</xml_diff>